<commit_message>
docs(y2/sem1/life-safety/lab): finalize emergency preparedness report
</commit_message>
<xml_diff>
--- a/year-2/semester-1/life-safety/labworks/emergencies/emergencies-labwork-505013.docx
+++ b/year-2/semester-1/life-safety/labworks/emergencies/emergencies-labwork-505013.docx
@@ -1,6 +1,6 @@
 
 <file path=word/document.xml><?xml version="1.0" encoding="utf-8"?>
-<w:document xmlns:wpc="http://schemas.microsoft.com/office/word/2010/wordprocessingCanvas" xmlns:cx="http://schemas.microsoft.com/office/drawing/2014/chartex" xmlns:cx1="http://schemas.microsoft.com/office/drawing/2015/9/8/chartex" xmlns:cx2="http://schemas.microsoft.com/office/drawing/2015/10/21/chartex" xmlns:cx3="http://schemas.microsoft.com/office/drawing/2016/5/9/chartex" xmlns:cx4="http://schemas.microsoft.com/office/drawing/2016/5/10/chartex" xmlns:cx5="http://schemas.microsoft.com/office/drawing/2016/5/11/chartex" xmlns:cx6="http://schemas.microsoft.com/office/drawing/2016/5/12/chartex" xmlns:cx7="http://schemas.microsoft.com/office/drawing/2016/5/13/chartex" xmlns:cx8="http://schemas.microsoft.com/office/drawing/2016/5/14/chartex" xmlns:mc="http://schemas.openxmlformats.org/markup-compatibility/2006" xmlns:aink="http://schemas.microsoft.com/office/drawing/2016/ink" xmlns:am3d="http://schemas.microsoft.com/office/drawing/2017/model3d" xmlns:o="urn:schemas-microsoft-com:office:office" xmlns:oel="http://schemas.microsoft.com/office/2019/extlst" xmlns:r="http://schemas.openxmlformats.org/officeDocument/2006/relationships" xmlns:m="http://schemas.openxmlformats.org/officeDocument/2006/math" xmlns:v="urn:schemas-microsoft-com:vml" xmlns:wp14="http://schemas.microsoft.com/office/word/2010/wordprocessingDrawing" xmlns:wp="http://schemas.openxmlformats.org/drawingml/2006/wordprocessingDrawing" xmlns:w10="urn:schemas-microsoft-com:office:word" xmlns:w="http://schemas.openxmlformats.org/wordprocessingml/2006/main" xmlns:w14="http://schemas.microsoft.com/office/word/2010/wordml" xmlns:w15="http://schemas.microsoft.com/office/word/2012/wordml" xmlns:w16cex="http://schemas.microsoft.com/office/word/2018/wordml/cex" xmlns:w16cid="http://schemas.microsoft.com/office/word/2016/wordml/cid" xmlns:w16="http://schemas.microsoft.com/office/word/2018/wordml" xmlns:w16du="http://schemas.microsoft.com/office/word/2023/wordml/word16du" xmlns:w16sdtdh="http://schemas.microsoft.com/office/word/2020/wordml/sdtdatahash" xmlns:w16sdtfl="http://schemas.microsoft.com/office/word/2024/wordml/sdtformatlock" xmlns:w16se="http://schemas.microsoft.com/office/word/2015/wordml/symex" xmlns:wpg="http://schemas.microsoft.com/office/word/2010/wordprocessingGroup" xmlns:wpi="http://schemas.microsoft.com/office/word/2010/wordprocessingInk" xmlns:wne="http://schemas.microsoft.com/office/word/2006/wordml" xmlns:wps="http://schemas.microsoft.com/office/word/2010/wordprocessingShape" mc:Ignorable="w14 w15 w16se w16cid w16 w16cex w16sdtdh w16sdtfl w16du wp14">
+<w:document xmlns:wpc="http://schemas.microsoft.com/office/word/2010/wordprocessingCanvas" xmlns:mc="http://schemas.openxmlformats.org/markup-compatibility/2006" xmlns:o="urn:schemas-microsoft-com:office:office" xmlns:r="http://schemas.openxmlformats.org/officeDocument/2006/relationships" xmlns:m="http://schemas.openxmlformats.org/officeDocument/2006/math" xmlns:v="urn:schemas-microsoft-com:vml" xmlns:wp14="http://schemas.microsoft.com/office/word/2010/wordprocessingDrawing" xmlns:wp="http://schemas.openxmlformats.org/drawingml/2006/wordprocessingDrawing" xmlns:w10="urn:schemas-microsoft-com:office:word" xmlns:w="http://schemas.openxmlformats.org/wordprocessingml/2006/main" xmlns:w14="http://schemas.microsoft.com/office/word/2010/wordml" xmlns:w15="http://schemas.microsoft.com/office/word/2012/wordml" xmlns:wpg="http://schemas.microsoft.com/office/word/2010/wordprocessingGroup" xmlns:wpi="http://schemas.microsoft.com/office/word/2010/wordprocessingInk" xmlns:wne="http://schemas.microsoft.com/office/word/2006/wordml" xmlns:wps="http://schemas.microsoft.com/office/word/2010/wordprocessingShape" mc:Ignorable="w14 w15 wp14">
   <w:body>
     <w:p>
       <w:pPr>
@@ -16,6 +16,7 @@
           <w:b/>
           <w:noProof/>
           <w:szCs w:val="24"/>
+          <w:lang w:eastAsia="ru-RU"/>
         </w:rPr>
         <w:drawing>
           <wp:anchor distT="0" distB="0" distL="0" distR="0" simplePos="0" relativeHeight="2" behindDoc="1" locked="0" layoutInCell="1" allowOverlap="1" wp14:anchorId="15CC02DD" wp14:editId="4E969713">
@@ -70,6 +71,7 @@
           <w:b/>
           <w:noProof/>
           <w:szCs w:val="24"/>
+          <w:lang w:eastAsia="ru-RU"/>
         </w:rPr>
         <mc:AlternateContent>
           <mc:Choice Requires="wps">
@@ -262,7 +264,7 @@
           </mc:Choice>
           <mc:Fallback>
             <w:pict>
-              <v:rect w14:anchorId="441794D3" id="Надпись 4" o:spid="_x0000_s1026" style="position:absolute;margin-left:149.55pt;margin-top:479.1pt;width:359.35pt;height:90.1pt;z-index:-503316477;visibility:visible;mso-wrap-style:square;mso-wrap-distance-left:0;mso-wrap-distance-top:0;mso-wrap-distance-right:0;mso-wrap-distance-bottom:0;mso-position-horizontal:absolute;mso-position-horizontal-relative:text;mso-position-vertical:absolute;mso-position-vertical-relative:text;v-text-anchor:top" o:gfxdata="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" filled="f" stroked="f" strokeweight=".5pt">
+              <v:rect w14:anchorId="441794D3" id="Надпись 4" o:spid="_x0000_s1026" style="position:absolute;margin-left:149.55pt;margin-top:479.1pt;width:359.35pt;height:90.1pt;z-index:-503316477;visibility:visible;mso-wrap-style:square;mso-wrap-distance-left:0;mso-wrap-distance-top:0;mso-wrap-distance-right:0;mso-wrap-distance-bottom:0;mso-position-horizontal:absolute;mso-position-horizontal-relative:text;mso-position-vertical:absolute;mso-position-vertical-relative:text;v-text-anchor:top" o:gfxdata="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" filled="f" stroked="f" strokeweight=".5pt">
                 <v:textbox>
                   <w:txbxContent>
                     <w:p>
@@ -443,7 +445,13 @@
         <w:rPr>
           <w:szCs w:val="24"/>
         </w:rPr>
-        <w:t>чрезвычайных происшествий локального и масштабного характера.</w:t>
+        <w:t>чрезвычайных происшествий локального и масштабного хара</w:t>
+      </w:r>
+      <w:r>
+        <w:rPr>
+          <w:szCs w:val="24"/>
+        </w:rPr>
+        <w:t>ктера.</w:t>
       </w:r>
     </w:p>
     <w:p>
@@ -572,7 +580,15 @@
           <w:b/>
           <w:szCs w:val="24"/>
         </w:rPr>
-        <w:t>для защиты</w:t>
+        <w:t>для з</w:t>
+      </w:r>
+      <w:r>
+        <w:rPr>
+          <w:rFonts w:eastAsia="Times New Roman" w:cs="Times New Roman"/>
+          <w:b/>
+          <w:szCs w:val="24"/>
+        </w:rPr>
+        <w:t>ащиты</w:t>
       </w:r>
       <w:r>
         <w:rPr>
@@ -664,20 +680,21 @@
       <w:pPr>
         <w:spacing w:line="276" w:lineRule="auto"/>
         <w:jc w:val="both"/>
-        <w:rPr>
-          <w:rFonts w:eastAsia="Times New Roman" w:cs="Times New Roman"/>
-          <w:szCs w:val="24"/>
-        </w:rPr>
       </w:pPr>
       <w:r>
-        <w:t xml:space="preserve">Провести анализ вероятных опасностей вашей жизни, здоровью, имуществу </w:t>
-      </w:r>
-      <w:r>
-        <w:rPr>
-          <w:rFonts w:eastAsia="Times New Roman" w:cs="Times New Roman"/>
-          <w:szCs w:val="24"/>
-        </w:rPr>
-        <w:t>безопасности в пределах своего места проживания и своей семьи и реализовать конкретные шаги для минимизации рисков и возможных последствий чрезвычайных ситуаций.</w:t>
+        <w:t>Анализ вероятных опасностей по месту п</w:t>
+      </w:r>
+      <w:r>
+        <w:t>роживания</w:t>
+      </w:r>
+    </w:p>
+    <w:p>
+      <w:pPr>
+        <w:spacing w:line="276" w:lineRule="auto"/>
+        <w:jc w:val="both"/>
+      </w:pPr>
+      <w:r>
+        <w:t>В данном разделе рассмотрены наиболее вероятные риски для жизни, здоровья и имущества по месту проживания. Определены масштабные и локальные чрезвычайные ситуации, а также меры по снижению их возможных последствий.</w:t>
       </w:r>
     </w:p>
     <w:p>
@@ -735,9 +752,15 @@
               <w:rPr>
                 <w:rFonts w:eastAsia="Times New Roman" w:cs="Times New Roman"/>
                 <w:szCs w:val="24"/>
-                <w:lang w:eastAsia="ru-RU"/>
-              </w:rPr>
-              <w:t>Таблица 1 – Анализ наиболее вероятных в моем месте проживания чрезвычайных ситуаций (масштабных и локальных)</w:t>
+              </w:rPr>
+              <w:t xml:space="preserve">Таблица 1 – Анализ наиболее вероятных в моем месте проживания чрезвычайных </w:t>
+            </w:r>
+            <w:r>
+              <w:rPr>
+                <w:rFonts w:eastAsia="Times New Roman" w:cs="Times New Roman"/>
+                <w:szCs w:val="24"/>
+              </w:rPr>
+              <w:t>ситуаций (масштабных и локальных)</w:t>
             </w:r>
           </w:p>
         </w:tc>
@@ -766,7 +789,6 @@
                 <w:rFonts w:eastAsia="Times New Roman" w:cs="Times New Roman"/>
                 <w:color w:val="000000"/>
                 <w:szCs w:val="24"/>
-                <w:lang w:eastAsia="ru-RU"/>
               </w:rPr>
               <w:t>Мой адрес:</w:t>
             </w:r>
@@ -796,7 +818,6 @@
                 <w:rFonts w:eastAsia="Times New Roman" w:cs="Times New Roman"/>
                 <w:i/>
                 <w:szCs w:val="24"/>
-                <w:lang w:eastAsia="ru-RU"/>
               </w:rPr>
               <w:t>Ленинградская область, Всеволожский район, г. Кудрово, ул. Австрийская, д. 4, корп. 1</w:t>
             </w:r>
@@ -827,7 +848,6 @@
                 <w:rFonts w:eastAsia="Times New Roman" w:cs="Times New Roman"/>
                 <w:color w:val="000000"/>
                 <w:szCs w:val="24"/>
-                <w:lang w:eastAsia="ru-RU"/>
               </w:rPr>
               <w:t>Масштабные ЧС:</w:t>
             </w:r>
@@ -857,9 +877,16 @@
                 <w:rFonts w:eastAsia="Times New Roman" w:cs="Times New Roman"/>
                 <w:i/>
                 <w:szCs w:val="24"/>
-                <w:lang w:eastAsia="ru-RU"/>
-              </w:rPr>
-              <w:t>сильный ветер, снегопады, гололёд и связанные с ними перебои транспорта, крупные ДТП на КАД, Мурманском шоссе и улицах Кудрово, аварии на сетях электроснабжения, отопления и водоснабжения</w:t>
+              </w:rPr>
+              <w:t xml:space="preserve">сильный ветер, снегопады, гололёд и связанные с ними перебои транспорта, крупные ДТП на КАД, Мурманском </w:t>
+            </w:r>
+            <w:r>
+              <w:rPr>
+                <w:rFonts w:eastAsia="Times New Roman" w:cs="Times New Roman"/>
+                <w:i/>
+                <w:szCs w:val="24"/>
+              </w:rPr>
+              <w:t>шоссе и улицах Кудрово, аварии на сетях электроснабжения, отопления и водоснабжения</w:t>
             </w:r>
           </w:p>
         </w:tc>
@@ -888,7 +915,6 @@
                 <w:rFonts w:eastAsia="Times New Roman" w:cs="Times New Roman"/>
                 <w:color w:val="000000"/>
                 <w:szCs w:val="24"/>
-                <w:lang w:eastAsia="ru-RU"/>
               </w:rPr>
               <w:t>Локальные ЧС:</w:t>
             </w:r>
@@ -917,7 +943,6 @@
                 <w:rFonts w:eastAsia="Times New Roman" w:cs="Times New Roman"/>
                 <w:i/>
                 <w:szCs w:val="24"/>
-                <w:lang w:eastAsia="ru-RU"/>
               </w:rPr>
               <w:t>пожар или задымление в квартире и подъезде, залив квартиры при прорыве внутридомовых труб, отключение воды, отопления или электричества, авария лифта</w:t>
             </w:r>
@@ -961,7 +986,14 @@
           <w:szCs w:val="26"/>
         </w:rPr>
         <w:lastRenderedPageBreak/>
-        <w:t>Описание принятых мер для снижения рисков чрезвычайных ситуаций.</w:t>
+        <w:t>Оп</w:t>
+      </w:r>
+      <w:r>
+        <w:rPr>
+          <w:sz w:val="26"/>
+          <w:szCs w:val="26"/>
+        </w:rPr>
+        <w:t>исание принятых мер для снижения рисков чрезвычайных ситуаций.</w:t>
       </w:r>
     </w:p>
     <w:tbl>
@@ -1000,7 +1032,6 @@
               <w:rPr>
                 <w:rFonts w:eastAsia="Times New Roman" w:cs="Times New Roman"/>
                 <w:szCs w:val="24"/>
-                <w:lang w:eastAsia="ru-RU"/>
               </w:rPr>
               <w:t>Меры по минимизации рисков и последствий масштабных ЧС:</w:t>
             </w:r>
@@ -1032,27 +1063,23 @@
                 <w:rFonts w:eastAsia="Times New Roman" w:cs="Times New Roman"/>
                 <w:i/>
                 <w:szCs w:val="24"/>
-                <w:lang w:eastAsia="ru-RU"/>
               </w:rPr>
               <w:t xml:space="preserve">подписка на официальные сообщения МЧС и администрации, сохранённые номера 112, 101, 102 и 103, запас питьевой воды, лекарств и заряженный </w:t>
             </w:r>
-            <w:proofErr w:type="spellStart"/>
-            <w:r>
-              <w:rPr>
-                <w:rFonts w:eastAsia="Times New Roman" w:cs="Times New Roman"/>
-                <w:i/>
-                <w:szCs w:val="24"/>
-                <w:lang w:val="en-US" w:eastAsia="ru-RU"/>
+            <w:r>
+              <w:rPr>
+                <w:rFonts w:eastAsia="Times New Roman" w:cs="Times New Roman"/>
+                <w:i/>
+                <w:szCs w:val="24"/>
+                <w:lang w:val="en-US"/>
               </w:rPr>
               <w:t>powerbank</w:t>
             </w:r>
-            <w:proofErr w:type="spellEnd"/>
-            <w:r>
-              <w:rPr>
-                <w:rFonts w:eastAsia="Times New Roman" w:cs="Times New Roman"/>
-                <w:i/>
-                <w:szCs w:val="24"/>
-                <w:lang w:eastAsia="ru-RU"/>
+            <w:r>
+              <w:rPr>
+                <w:rFonts w:eastAsia="Times New Roman" w:cs="Times New Roman"/>
+                <w:i/>
+                <w:szCs w:val="24"/>
               </w:rPr>
               <w:t>. Из дома известны два пути выхода. При пожаре или задымлении лифтом не ни в коем случае не пользоваться</w:t>
             </w:r>
@@ -1102,9 +1129,15 @@
               <w:rPr>
                 <w:rFonts w:eastAsia="Times New Roman" w:cs="Times New Roman"/>
                 <w:szCs w:val="24"/>
-                <w:lang w:eastAsia="ru-RU"/>
-              </w:rPr>
-              <w:t>Меры по минимизации рисков и последствий локальных ЧС в моем доме:</w:t>
+              </w:rPr>
+              <w:t>Ме</w:t>
+            </w:r>
+            <w:r>
+              <w:rPr>
+                <w:rFonts w:eastAsia="Times New Roman" w:cs="Times New Roman"/>
+                <w:szCs w:val="24"/>
+              </w:rPr>
+              <w:t>ры по минимизации рисков и последствий локальных ЧС в моем доме:</w:t>
             </w:r>
           </w:p>
         </w:tc>
@@ -1134,9 +1167,16 @@
                 <w:rFonts w:eastAsia="Times New Roman" w:cs="Times New Roman"/>
                 <w:i/>
                 <w:szCs w:val="24"/>
-                <w:lang w:eastAsia="ru-RU"/>
-              </w:rPr>
-              <w:t>не загромождать выход из квартиры, знать, где перекрыть воду и отключить электричество, не оставлять без присмотра плиту и нагревательные приборы, не перегружать удлинители. В квартире установлен автономный пожарный извещатель</w:t>
+              </w:rPr>
+              <w:t>не загромождать выход из квартиры, знать, где перекрыть воду и отключить электричество, не оставлять без присмотра плиту и нагревательные приборы, не перегружать удлинители. В квартире устан</w:t>
+            </w:r>
+            <w:r>
+              <w:rPr>
+                <w:rFonts w:eastAsia="Times New Roman" w:cs="Times New Roman"/>
+                <w:i/>
+                <w:szCs w:val="24"/>
+              </w:rPr>
+              <w:t>овлен автономный пожарный извещатель</w:t>
             </w:r>
           </w:p>
         </w:tc>
@@ -1204,7 +1244,6 @@
               <w:rPr>
                 <w:rFonts w:eastAsia="Times New Roman" w:cs="Times New Roman"/>
                 <w:szCs w:val="24"/>
-                <w:lang w:eastAsia="ru-RU"/>
               </w:rPr>
               <w:t>Таблица 2 – Критические показатели загрязненности окружающей среды в моем месте проживания</w:t>
             </w:r>
@@ -1235,7 +1274,6 @@
                 <w:rFonts w:eastAsia="Times New Roman" w:cs="Times New Roman"/>
                 <w:color w:val="000000"/>
                 <w:szCs w:val="24"/>
-                <w:lang w:eastAsia="ru-RU"/>
               </w:rPr>
               <w:t>Мой адрес:</w:t>
             </w:r>
@@ -1265,7 +1303,6 @@
                 <w:rFonts w:eastAsia="Times New Roman" w:cs="Times New Roman"/>
                 <w:i/>
                 <w:szCs w:val="24"/>
-                <w:lang w:eastAsia="ru-RU"/>
               </w:rPr>
               <w:t>г. Кудрово, ул. Австрийская, д. 4, корп. 1.</w:t>
             </w:r>
@@ -1296,7 +1333,6 @@
                 <w:rFonts w:eastAsia="Times New Roman" w:cs="Times New Roman"/>
                 <w:color w:val="000000"/>
                 <w:szCs w:val="24"/>
-                <w:lang w:eastAsia="ru-RU"/>
               </w:rPr>
               <w:t>Вещество № 1, класс опасности:</w:t>
             </w:r>
@@ -1382,7 +1418,6 @@
                 <w:rFonts w:eastAsia="Times New Roman" w:cs="Times New Roman"/>
                 <w:color w:val="000000"/>
                 <w:szCs w:val="24"/>
-                <w:lang w:eastAsia="ru-RU"/>
               </w:rPr>
               <w:t>Вещество № 2, класс опасности:</w:t>
             </w:r>
@@ -1405,15 +1440,13 @@
                 <w:rFonts w:eastAsia="Times New Roman" w:cs="Times New Roman"/>
                 <w:i/>
                 <w:szCs w:val="24"/>
-                <w:lang w:eastAsia="ru-RU"/>
-              </w:rPr>
-            </w:pPr>
-            <w:r>
-              <w:rPr>
-                <w:rFonts w:eastAsia="Times New Roman" w:cs="Times New Roman"/>
-                <w:i/>
-                <w:szCs w:val="24"/>
-                <w:lang w:eastAsia="ru-RU"/>
+              </w:rPr>
+            </w:pPr>
+            <w:r>
+              <w:rPr>
+                <w:rFonts w:eastAsia="Times New Roman" w:cs="Times New Roman"/>
+                <w:i/>
+                <w:szCs w:val="24"/>
               </w:rPr>
               <w:t>Д</w:t>
             </w:r>
@@ -1422,7 +1455,6 @@
                 <w:rFonts w:eastAsia="Times New Roman" w:cs="Times New Roman"/>
                 <w:i/>
                 <w:szCs w:val="24"/>
-                <w:lang w:eastAsia="ru-RU"/>
               </w:rPr>
               <w:t>иоксид азота (NO</w:t>
             </w:r>
@@ -1431,7 +1463,6 @@
                 <w:rFonts w:eastAsia="Times New Roman" w:cs="Times New Roman"/>
                 <w:i/>
                 <w:szCs w:val="24"/>
-                <w:lang w:eastAsia="ru-RU"/>
               </w:rPr>
               <w:t>2</w:t>
             </w:r>
@@ -1440,7 +1471,6 @@
                 <w:rFonts w:eastAsia="Times New Roman" w:cs="Times New Roman"/>
                 <w:i/>
                 <w:szCs w:val="24"/>
-                <w:lang w:eastAsia="ru-RU"/>
               </w:rPr>
               <w:t xml:space="preserve">), 3 класс опасности. </w:t>
             </w:r>
@@ -1459,7 +1489,6 @@
                 <w:rFonts w:eastAsia="Times New Roman" w:cs="Times New Roman"/>
                 <w:i/>
                 <w:szCs w:val="24"/>
-                <w:lang w:eastAsia="ru-RU"/>
               </w:rPr>
               <w:t>Средняя концентрация по данным сервиса: 0,035 мг/м³. Среднегодовая ПДК: 0,04 мг/м³. Концентрация составляет 0,88 ПДК, превышения нет.</w:t>
             </w:r>
@@ -1490,7 +1519,6 @@
                 <w:rFonts w:eastAsia="Times New Roman" w:cs="Times New Roman"/>
                 <w:color w:val="000000"/>
                 <w:szCs w:val="24"/>
-                <w:lang w:eastAsia="ru-RU"/>
               </w:rPr>
               <w:t>Вещество № 3, класс опасности:</w:t>
             </w:r>
@@ -1513,15 +1541,13 @@
                 <w:rFonts w:eastAsia="Times New Roman" w:cs="Times New Roman"/>
                 <w:i/>
                 <w:szCs w:val="24"/>
-                <w:lang w:eastAsia="ru-RU"/>
-              </w:rPr>
-            </w:pPr>
-            <w:r>
-              <w:rPr>
-                <w:rFonts w:eastAsia="Times New Roman" w:cs="Times New Roman"/>
-                <w:i/>
-                <w:szCs w:val="24"/>
-                <w:lang w:eastAsia="ru-RU"/>
+              </w:rPr>
+            </w:pPr>
+            <w:r>
+              <w:rPr>
+                <w:rFonts w:eastAsia="Times New Roman" w:cs="Times New Roman"/>
+                <w:i/>
+                <w:szCs w:val="24"/>
               </w:rPr>
               <w:t>О</w:t>
             </w:r>
@@ -1530,7 +1556,6 @@
                 <w:rFonts w:eastAsia="Times New Roman" w:cs="Times New Roman"/>
                 <w:i/>
                 <w:szCs w:val="24"/>
-                <w:lang w:eastAsia="ru-RU"/>
               </w:rPr>
               <w:t xml:space="preserve">ксид углерода (CO), 4 класс опасности. </w:t>
             </w:r>
@@ -1549,7 +1574,6 @@
                 <w:rFonts w:eastAsia="Times New Roman" w:cs="Times New Roman"/>
                 <w:i/>
                 <w:szCs w:val="24"/>
-                <w:lang w:eastAsia="ru-RU"/>
               </w:rPr>
               <w:t>Средняя концентрация по данным сервиса: 0,781 мг/м³. Среднесуточная ПДК: 3 мг/м³. Концентрация составляет 0,26 ПДК, превышения нет.</w:t>
             </w:r>
@@ -1563,7 +1587,10 @@
         <w:jc w:val="both"/>
       </w:pPr>
       <w:r>
-        <w:t xml:space="preserve">Источник данных: Региональная геоинформационная система Ленинградской области, интерактивная карта и поиск объектов: </w:t>
+        <w:t>Источник данных: Региональная геоинформационная система Ленинградской области, интера</w:t>
+      </w:r>
+      <w:r>
+        <w:t xml:space="preserve">ктивная карта и поиск объектов: </w:t>
       </w:r>
       <w:hyperlink r:id="rId9">
         <w:r>
@@ -1598,14 +1625,12 @@
         <w:spacing w:before="240" w:line="276" w:lineRule="auto"/>
         <w:jc w:val="both"/>
         <w:rPr>
-          <w:sz w:val="26"/>
-          <w:szCs w:val="26"/>
+          <w:szCs w:val="24"/>
         </w:rPr>
       </w:pPr>
       <w:r>
         <w:rPr>
-          <w:sz w:val="26"/>
-          <w:szCs w:val="26"/>
+          <w:szCs w:val="24"/>
         </w:rPr>
         <w:lastRenderedPageBreak/>
         <w:t>Описание мер по снижению влияния загрязняющих веществ.</w:t>
@@ -1647,9 +1672,15 @@
               <w:rPr>
                 <w:rFonts w:eastAsia="Times New Roman" w:cs="Times New Roman"/>
                 <w:szCs w:val="24"/>
-                <w:lang w:eastAsia="ru-RU"/>
-              </w:rPr>
-              <w:t>Меры по минимизации влияния токсичных веществ, загрязняющих окружающую среду в моем микрорайоне:</w:t>
+              </w:rPr>
+              <w:t>Меры по минимиза</w:t>
+            </w:r>
+            <w:r>
+              <w:rPr>
+                <w:rFonts w:eastAsia="Times New Roman" w:cs="Times New Roman"/>
+                <w:szCs w:val="24"/>
+              </w:rPr>
+              <w:t>ции влияния токсичных веществ, загрязняющих окружающую среду в моем микрорайоне:</w:t>
             </w:r>
           </w:p>
         </w:tc>
@@ -1680,7 +1711,6 @@
                 <w:b/>
                 <w:i/>
                 <w:szCs w:val="24"/>
-                <w:lang w:eastAsia="ru-RU"/>
               </w:rPr>
               <w:t>Со стороны жильца:</w:t>
             </w:r>
@@ -1689,7 +1719,6 @@
                 <w:rFonts w:eastAsia="Times New Roman" w:cs="Times New Roman"/>
                 <w:i/>
                 <w:szCs w:val="24"/>
-                <w:lang w:eastAsia="ru-RU"/>
               </w:rPr>
               <w:t xml:space="preserve"> регулярно проводить влажную уборку, проветривать квартиру с учётом запаха гари и задымления. При сильном запахе гари закрывать окна со стороны источника, ограничивать прогулки и сообщать о проблеме по номеру 112</w:t>
             </w:r>
@@ -1709,7 +1738,6 @@
                 <w:b/>
                 <w:i/>
                 <w:szCs w:val="24"/>
-                <w:lang w:eastAsia="ru-RU"/>
               </w:rPr>
               <w:t>Со стороны муниципальных органов:</w:t>
             </w:r>
@@ -1718,7 +1746,6 @@
                 <w:rFonts w:eastAsia="Times New Roman" w:cs="Times New Roman"/>
                 <w:i/>
                 <w:szCs w:val="24"/>
-                <w:lang w:eastAsia="ru-RU"/>
               </w:rPr>
               <w:t xml:space="preserve"> поддерживать работу постов экологического мониторинга, публиковать результаты наблюдений, контролировать пыление на стройплощадках и уборку дорог, развивать озеленение и принимать обращения жителей о загрязнении воздуха</w:t>
             </w:r>
@@ -1785,9 +1812,15 @@
               <w:rPr>
                 <w:rFonts w:eastAsia="Times New Roman" w:cs="Times New Roman"/>
                 <w:szCs w:val="24"/>
-                <w:lang w:eastAsia="ru-RU"/>
-              </w:rPr>
-              <w:t>Таблица 3 – Потенциальные угрозы здоровью со стороны организации моего учебного или рабочего места</w:t>
+              </w:rPr>
+              <w:t>Таблица 3 – Потенциаль</w:t>
+            </w:r>
+            <w:r>
+              <w:rPr>
+                <w:rFonts w:eastAsia="Times New Roman" w:cs="Times New Roman"/>
+                <w:szCs w:val="24"/>
+              </w:rPr>
+              <w:t>ные угрозы здоровью со стороны организации моего учебного или рабочего места</w:t>
             </w:r>
           </w:p>
         </w:tc>
@@ -1816,7 +1849,6 @@
                 <w:rFonts w:eastAsia="Times New Roman" w:cs="Times New Roman"/>
                 <w:color w:val="000000"/>
                 <w:szCs w:val="24"/>
-                <w:lang w:eastAsia="ru-RU"/>
               </w:rPr>
               <w:t>Мое учебное или рабочее место:</w:t>
             </w:r>
@@ -1846,7 +1878,6 @@
                 <w:rFonts w:eastAsia="Times New Roman" w:cs="Times New Roman"/>
                 <w:i/>
                 <w:szCs w:val="24"/>
-                <w:lang w:eastAsia="ru-RU"/>
               </w:rPr>
               <w:t>домашний письменный стол, ноутбук, монитор</w:t>
             </w:r>
@@ -1877,7 +1908,6 @@
                 <w:rFonts w:eastAsia="Times New Roman" w:cs="Times New Roman"/>
                 <w:color w:val="000000"/>
                 <w:szCs w:val="24"/>
-                <w:lang w:eastAsia="ru-RU"/>
               </w:rPr>
               <w:t>Постоянно воздействующие вредные факторы:</w:t>
             </w:r>
@@ -1907,9 +1937,16 @@
                 <w:rFonts w:eastAsia="Times New Roman" w:cs="Times New Roman"/>
                 <w:i/>
                 <w:szCs w:val="24"/>
-                <w:lang w:eastAsia="ru-RU"/>
-              </w:rPr>
-              <w:t>длительная работа сидя, нагрузка на глаза при работе с экраном, нагрузка на кисти при работе с клавиатурой и мышью, недостаточная освещённость</w:t>
+              </w:rPr>
+              <w:t xml:space="preserve">длительная работа сидя, нагрузка на глаза при работе с </w:t>
+            </w:r>
+            <w:r>
+              <w:rPr>
+                <w:rFonts w:eastAsia="Times New Roman" w:cs="Times New Roman"/>
+                <w:i/>
+                <w:szCs w:val="24"/>
+              </w:rPr>
+              <w:t>экраном, нагрузка на кисти при работе с клавиатурой и мышью, недостаточная освещённость</w:t>
             </w:r>
           </w:p>
         </w:tc>
@@ -1938,7 +1975,6 @@
                 <w:rFonts w:eastAsia="Times New Roman" w:cs="Times New Roman"/>
                 <w:color w:val="000000"/>
                 <w:szCs w:val="24"/>
-                <w:lang w:eastAsia="ru-RU"/>
               </w:rPr>
               <w:t>Потенциальные факторы риска:</w:t>
             </w:r>
@@ -1967,7 +2003,6 @@
                 <w:rFonts w:eastAsia="Times New Roman" w:cs="Times New Roman"/>
                 <w:i/>
                 <w:szCs w:val="24"/>
-                <w:lang w:eastAsia="ru-RU"/>
               </w:rPr>
               <w:t>провода в проходе, перегрузка сетевого фильтра, вещи на неустойчивых полках, скользкий пол после влажной уборки</w:t>
             </w:r>
@@ -2034,9 +2069,15 @@
               <w:rPr>
                 <w:rFonts w:eastAsia="Times New Roman" w:cs="Times New Roman"/>
                 <w:szCs w:val="24"/>
-                <w:lang w:eastAsia="ru-RU"/>
-              </w:rPr>
-              <w:t>Таблица 4 – Список шагов для защиты моей жизни, здоровья, имущества</w:t>
+              </w:rPr>
+              <w:t>Таблица 4 – С</w:t>
+            </w:r>
+            <w:r>
+              <w:rPr>
+                <w:rFonts w:eastAsia="Times New Roman" w:cs="Times New Roman"/>
+                <w:szCs w:val="24"/>
+              </w:rPr>
+              <w:t>писок шагов для защиты моей жизни, здоровья, имущества</w:t>
             </w:r>
           </w:p>
         </w:tc>
@@ -2065,7 +2106,6 @@
                 <w:rFonts w:eastAsia="Times New Roman" w:cs="Times New Roman"/>
                 <w:color w:val="000000"/>
                 <w:szCs w:val="24"/>
-                <w:lang w:eastAsia="ru-RU"/>
               </w:rPr>
               <w:t>Предпринятые меры и шаги:</w:t>
             </w:r>
@@ -2096,9 +2136,16 @@
                 <w:rFonts w:eastAsia="Times New Roman" w:cs="Times New Roman"/>
                 <w:i/>
                 <w:szCs w:val="24"/>
-                <w:lang w:eastAsia="ru-RU"/>
-              </w:rPr>
-              <w:t>Регулярно проверяю состояние инженерных систем здания и сообщаю о неисправностях в службу эксплуатации. Слежу, чтобы электроприборы были подключены безопасно, а провода не лежали под ногами. Поддерживаю порядок в помещении и проветриваю его. При необходимости использую средства индивидуальной защиты.</w:t>
+              </w:rPr>
+              <w:t>Регулярно проверяю состояние инженерных систем здания и сообщаю о неисправностях в службу эксплуатации. Слежу, чтобы электроприборы были подключены безопасно, а провода не ле</w:t>
+            </w:r>
+            <w:r>
+              <w:rPr>
+                <w:rFonts w:eastAsia="Times New Roman" w:cs="Times New Roman"/>
+                <w:i/>
+                <w:szCs w:val="24"/>
+              </w:rPr>
+              <w:t>жали под ногами. Поддерживаю порядок в помещении и проветриваю его. При необходимости использую средства индивидуальной защиты.</w:t>
             </w:r>
           </w:p>
           <w:p>
@@ -2109,27 +2156,23 @@
                 <w:rFonts w:eastAsia="Times New Roman" w:cs="Times New Roman"/>
                 <w:i/>
                 <w:szCs w:val="24"/>
-                <w:lang w:eastAsia="ru-RU"/>
-              </w:rPr>
-            </w:pPr>
-            <w:r>
-              <w:rPr>
-                <w:rFonts w:eastAsia="Times New Roman" w:cs="Times New Roman"/>
-                <w:i/>
-                <w:szCs w:val="24"/>
-                <w:lang w:eastAsia="ru-RU"/>
-              </w:rPr>
-              <w:t xml:space="preserve">Работая с вредными веществами, соблюдаю правила, проверяю фильтры и защищаю глаза и органы дыхания. Учитываю особенности жизни в мегаполисе, в том числе поддерживаю водный режим. Берегу технику и документы </w:t>
-            </w:r>
-            <w:r>
-              <w:rPr>
-                <w:rFonts w:eastAsia="Times New Roman" w:cs="Times New Roman"/>
-                <w:i/>
-                <w:szCs w:val="24"/>
-                <w:lang w:eastAsia="ru-RU"/>
-              </w:rPr>
-              <w:lastRenderedPageBreak/>
-              <w:t>от протечек и затопления. Соблюдаю пожарную и электробезопасность, заранее продумываю риски, связанные со стихией и действиями злоумышленников</w:t>
+              </w:rPr>
+            </w:pPr>
+            <w:r>
+              <w:rPr>
+                <w:rFonts w:eastAsia="Times New Roman" w:cs="Times New Roman"/>
+                <w:i/>
+                <w:szCs w:val="24"/>
+              </w:rPr>
+              <w:t>Работая с вредными веществами, соблюдаю правила, проверяю фильтры и защищаю глаза и органы дыхания. Учитываю особенности жизни в мегаполисе, в том числе поддерживаю водный режим. Берегу технику и документы от протечек и затопления. Соблюдаю пожарную и элек</w:t>
+            </w:r>
+            <w:r>
+              <w:rPr>
+                <w:rFonts w:eastAsia="Times New Roman" w:cs="Times New Roman"/>
+                <w:i/>
+                <w:szCs w:val="24"/>
+              </w:rPr>
+              <w:t>тробезопасность, заранее продумываю риски, связанные со стихией и действиями злоумышленников</w:t>
             </w:r>
           </w:p>
         </w:tc>
@@ -2158,7 +2201,6 @@
                 <w:rFonts w:eastAsia="Times New Roman" w:cs="Times New Roman"/>
                 <w:color w:val="000000"/>
                 <w:szCs w:val="24"/>
-                <w:lang w:eastAsia="ru-RU"/>
               </w:rPr>
               <w:lastRenderedPageBreak/>
               <w:t>Планируемые в ближайший месяц шаги:</w:t>
@@ -2189,18 +2231,8 @@
                 <w:rFonts w:eastAsia="Times New Roman" w:cs="Times New Roman"/>
                 <w:i/>
                 <w:szCs w:val="24"/>
-                <w:lang w:eastAsia="ru-RU"/>
-              </w:rPr>
-              <w:t>П</w:t>
-            </w:r>
-            <w:r>
-              <w:rPr>
-                <w:rFonts w:eastAsia="Times New Roman" w:cs="Times New Roman"/>
-                <w:i/>
-                <w:szCs w:val="24"/>
-                <w:lang w:eastAsia="ru-RU"/>
-              </w:rPr>
-              <w:t>роверить срок годности лекарств в аптечке и работу пожарного извещателя, приобрести огнетушитель в квартиру, освободить путь к выходу, обсудить с сожителями действия при пожаре и место встречи после эвакуации</w:t>
+              </w:rPr>
+              <w:t>Проверить срок годности лекарств в аптечке и работу пожарного извещателя, приобрести огнетушитель в квартиру, освободить путь к выходу, обсудить с сожителями действия при пожаре и место встречи после эвакуации</w:t>
             </w:r>
           </w:p>
         </w:tc>
@@ -2280,7 +2312,6 @@
               <w:rPr>
                 <w:rFonts w:eastAsia="Times New Roman" w:cs="Times New Roman"/>
                 <w:szCs w:val="24"/>
-                <w:lang w:eastAsia="ru-RU"/>
               </w:rPr>
               <w:t>Таблица 5 – Список контактов экстренных служб (телефоны и адреса)</w:t>
             </w:r>
@@ -2310,7 +2341,6 @@
               <w:rPr>
                 <w:rFonts w:eastAsia="Times New Roman" w:cs="Times New Roman"/>
                 <w:szCs w:val="24"/>
-                <w:lang w:eastAsia="ru-RU"/>
               </w:rPr>
               <w:t>Районная поликлиника</w:t>
             </w:r>
@@ -2340,9 +2370,16 @@
                 <w:rFonts w:eastAsia="Times New Roman" w:cs="Times New Roman"/>
                 <w:i/>
                 <w:szCs w:val="24"/>
-                <w:lang w:eastAsia="ru-RU"/>
-              </w:rPr>
-              <w:t xml:space="preserve">ГБУЗ ЛО «Всеволожская КМБ», поликлиника г. Кудрово,        ул. Ленинградская, д. 8, телефон +7 (812) 331-63-80. Вызов врача на дом и запись: 122. </w:t>
+              </w:rPr>
+              <w:t xml:space="preserve">ГБУЗ ЛО «Всеволожская КМБ», </w:t>
+            </w:r>
+            <w:r>
+              <w:rPr>
+                <w:rFonts w:eastAsia="Times New Roman" w:cs="Times New Roman"/>
+                <w:i/>
+                <w:szCs w:val="24"/>
+              </w:rPr>
+              <w:t xml:space="preserve">поликлиника г. Кудрово,        ул. Ленинградская, д. 8, телефон +7 (812) 331-63-80. Вызов врача на дом и запись: 122. </w:t>
             </w:r>
           </w:p>
           <w:p>
@@ -2360,7 +2397,6 @@
                 <w:rFonts w:eastAsia="Times New Roman" w:cs="Times New Roman"/>
                 <w:i/>
                 <w:szCs w:val="24"/>
-                <w:lang w:eastAsia="ru-RU"/>
               </w:rPr>
               <w:t xml:space="preserve">Ближайшая коммерческая клиника с лабораторией: </w:t>
             </w:r>
@@ -2370,7 +2406,6 @@
                 <w:rFonts w:eastAsia="Times New Roman" w:cs="Times New Roman"/>
                 <w:i/>
                 <w:szCs w:val="24"/>
-                <w:lang w:eastAsia="ru-RU"/>
               </w:rPr>
               <w:t>MedPraxis</w:t>
             </w:r>
@@ -2380,7 +2415,6 @@
                 <w:rFonts w:eastAsia="Times New Roman" w:cs="Times New Roman"/>
                 <w:i/>
                 <w:szCs w:val="24"/>
-                <w:lang w:eastAsia="ru-RU"/>
               </w:rPr>
               <w:t xml:space="preserve"> </w:t>
             </w:r>
@@ -2390,7 +2424,6 @@
                 <w:rFonts w:eastAsia="Times New Roman" w:cs="Times New Roman"/>
                 <w:i/>
                 <w:szCs w:val="24"/>
-                <w:lang w:eastAsia="ru-RU"/>
               </w:rPr>
               <w:t>Clinic</w:t>
             </w:r>
@@ -2400,7 +2433,6 @@
                 <w:rFonts w:eastAsia="Times New Roman" w:cs="Times New Roman"/>
                 <w:i/>
                 <w:szCs w:val="24"/>
-                <w:lang w:eastAsia="ru-RU"/>
               </w:rPr>
               <w:t>, г. Кудрово, ул. Австрийская, д. 4, корп. 1, телефон +7 (812) 317-20-33</w:t>
             </w:r>
@@ -2430,7 +2462,6 @@
               <w:rPr>
                 <w:rFonts w:eastAsia="Times New Roman" w:cs="Times New Roman"/>
                 <w:szCs w:val="24"/>
-                <w:lang w:eastAsia="ru-RU"/>
               </w:rPr>
               <w:t>Травмпункт</w:t>
             </w:r>
@@ -2460,7 +2491,6 @@
                 <w:rFonts w:eastAsia="Times New Roman" w:cs="Times New Roman"/>
                 <w:i/>
                 <w:szCs w:val="24"/>
-                <w:lang w:eastAsia="ru-RU"/>
               </w:rPr>
               <w:t>ГБУЗ ЛО «Всеволожская КМБ», поликлиника г. Кудрово,        ул. Ленинградская, д. 8. Телефон 122 или +7 (812) 331-63-80.</w:t>
             </w:r>
@@ -2479,29 +2509,32 @@
                 <w:rFonts w:eastAsia="Times New Roman" w:cs="Times New Roman"/>
                 <w:i/>
                 <w:szCs w:val="24"/>
-                <w:lang w:eastAsia="ru-RU"/>
-              </w:rPr>
-              <w:t xml:space="preserve">Коммерческий круглосуточный травмпункт: «СМ-Клиника», Санкт-Петербург, пр. Ударников, д. 19, корп. 1, </w:t>
-            </w:r>
-            <w:proofErr w:type="gramStart"/>
-            <w:r>
-              <w:rPr>
-                <w:rFonts w:eastAsia="Times New Roman" w:cs="Times New Roman"/>
-                <w:i/>
-                <w:szCs w:val="24"/>
-                <w:lang w:eastAsia="ru-RU"/>
-              </w:rPr>
-              <w:t>телефон  +</w:t>
-            </w:r>
-            <w:proofErr w:type="gramEnd"/>
-            <w:r>
-              <w:rPr>
-                <w:rFonts w:eastAsia="Times New Roman" w:cs="Times New Roman"/>
-                <w:i/>
-                <w:szCs w:val="24"/>
-                <w:lang w:eastAsia="ru-RU"/>
-              </w:rPr>
-              <w:t>7 (812) 435-55-55.</w:t>
+              </w:rPr>
+              <w:t>Коммерческий круглосуточный травмпункт: «СМ-Клиника», Санкт-Петербург, пр. Удар</w:t>
+            </w:r>
+            <w:r>
+              <w:rPr>
+                <w:rFonts w:eastAsia="Times New Roman" w:cs="Times New Roman"/>
+                <w:i/>
+                <w:szCs w:val="24"/>
+              </w:rPr>
+              <w:t xml:space="preserve">ников, д. 19, корп. 1, телефон </w:t>
+            </w:r>
+            <w:r>
+              <w:rPr>
+                <w:rFonts w:eastAsia="Times New Roman" w:cs="Times New Roman"/>
+                <w:i/>
+                <w:szCs w:val="24"/>
+              </w:rPr>
+              <w:t xml:space="preserve">+7 (812) </w:t>
+            </w:r>
+            <w:r>
+              <w:rPr>
+                <w:rFonts w:eastAsia="Times New Roman" w:cs="Times New Roman"/>
+                <w:i/>
+                <w:szCs w:val="24"/>
+              </w:rPr>
+              <w:t>435-55-55.</w:t>
             </w:r>
           </w:p>
         </w:tc>
@@ -2529,7 +2562,6 @@
               <w:rPr>
                 <w:rFonts w:eastAsia="Times New Roman" w:cs="Times New Roman"/>
                 <w:szCs w:val="24"/>
-                <w:lang w:eastAsia="ru-RU"/>
               </w:rPr>
               <w:t>Больница</w:t>
             </w:r>
@@ -2559,9 +2591,24 @@
                 <w:rFonts w:eastAsia="Times New Roman" w:cs="Times New Roman"/>
                 <w:i/>
                 <w:szCs w:val="24"/>
-                <w:lang w:eastAsia="ru-RU"/>
-              </w:rPr>
-              <w:t xml:space="preserve">Районная больница: ГБУЗ ЛО «Всеволожская КМБ», г. Всеволожск, Колтушское ш., д. 20, контакт-центр                 +7 (813) 704-31-49. </w:t>
+              </w:rPr>
+              <w:t>Районная больница: ГБУЗ ЛО «Всеволожская КМБ», г. Всеволожск, Колтушское ш., д. 20</w:t>
+            </w:r>
+            <w:r>
+              <w:rPr>
+                <w:rFonts w:eastAsia="Times New Roman" w:cs="Times New Roman"/>
+                <w:i/>
+                <w:szCs w:val="24"/>
+              </w:rPr>
+              <w:t xml:space="preserve">, контакт-центр </w:t>
+            </w:r>
+            <w:r>
+              <w:rPr>
+                <w:rFonts w:eastAsia="Times New Roman" w:cs="Times New Roman"/>
+                <w:i/>
+                <w:szCs w:val="24"/>
+              </w:rPr>
+              <w:t xml:space="preserve">+7 (813) 704-31-49. </w:t>
             </w:r>
           </w:p>
           <w:p>
@@ -2578,9 +2625,16 @@
                 <w:rFonts w:eastAsia="Times New Roman" w:cs="Times New Roman"/>
                 <w:i/>
                 <w:szCs w:val="24"/>
-                <w:lang w:eastAsia="ru-RU"/>
-              </w:rPr>
-              <w:t xml:space="preserve">Инфекционная больница: СПб ГБУЗ «Клиническая инфекционная больница им. С. П. Боткина», Санкт-Петербург, Пискарёвский пр., д. 49 и Миргородская ул., д. 3, телефон +7 (812) 670-78-78. </w:t>
+              </w:rPr>
+              <w:t>Инфекционная больница: СПб ГБУЗ «Клиническая инфекционная больница им. С. П. Боткина», Санкт-Петербу</w:t>
+            </w:r>
+            <w:r>
+              <w:rPr>
+                <w:rFonts w:eastAsia="Times New Roman" w:cs="Times New Roman"/>
+                <w:i/>
+                <w:szCs w:val="24"/>
+              </w:rPr>
+              <w:t xml:space="preserve">рг, Пискарёвский пр., д. 49 и Миргородская ул., д. 3, телефон +7 (812) 670-78-78. </w:t>
             </w:r>
           </w:p>
           <w:p>
@@ -2598,7 +2652,6 @@
                 <w:rFonts w:eastAsia="Times New Roman" w:cs="Times New Roman"/>
                 <w:i/>
                 <w:szCs w:val="24"/>
-                <w:lang w:eastAsia="ru-RU"/>
               </w:rPr>
               <w:t>Коммерческий госпиталь: «</w:t>
             </w:r>
@@ -2608,7 +2661,6 @@
                 <w:rFonts w:eastAsia="Times New Roman" w:cs="Times New Roman"/>
                 <w:i/>
                 <w:szCs w:val="24"/>
-                <w:lang w:eastAsia="ru-RU"/>
               </w:rPr>
               <w:t>Евромед</w:t>
             </w:r>
@@ -2618,7 +2670,6 @@
                 <w:rFonts w:eastAsia="Times New Roman" w:cs="Times New Roman"/>
                 <w:i/>
                 <w:szCs w:val="24"/>
-                <w:lang w:eastAsia="ru-RU"/>
               </w:rPr>
               <w:t xml:space="preserve"> Клиник», Санкт-Петербург, Суворовский пр., д. 60, телефон +7 (812) 327-03-01, круглосуточно.</w:t>
             </w:r>
@@ -2648,7 +2699,6 @@
               <w:rPr>
                 <w:rFonts w:eastAsia="Times New Roman" w:cs="Times New Roman"/>
                 <w:szCs w:val="24"/>
-                <w:lang w:eastAsia="ru-RU"/>
               </w:rPr>
               <w:t>Отделение полиции</w:t>
             </w:r>
@@ -2679,19 +2729,16 @@
                 <w:rFonts w:eastAsia="Times New Roman" w:cs="Times New Roman"/>
                 <w:i/>
                 <w:szCs w:val="24"/>
-                <w:lang w:eastAsia="ru-RU"/>
-              </w:rPr>
-              <w:t>При угрозе жизни или преступлении: 112 или 102. 97 отдел полиции УМВД России по Всеволожскому району: г. Кудрово, Европейский пр., д. 24, круглосуточно, телефон +7 (81370) 4-</w:t>
-            </w:r>
-            <w:r>
-              <w:rPr>
-                <w:rFonts w:eastAsia="Times New Roman" w:cs="Times New Roman"/>
-                <w:i/>
-                <w:szCs w:val="24"/>
-                <w:lang w:eastAsia="ru-RU"/>
-              </w:rPr>
-              <w:lastRenderedPageBreak/>
-              <w:t>29-43. Участковый пункт полиции № 7: г. Кудрово, ул. Центральная, д. 54, корп. 1, телефон +7 (999) 045-47-21.</w:t>
+              </w:rPr>
+              <w:t>При угрозе жизни или преступ</w:t>
+            </w:r>
+            <w:r>
+              <w:rPr>
+                <w:rFonts w:eastAsia="Times New Roman" w:cs="Times New Roman"/>
+                <w:i/>
+                <w:szCs w:val="24"/>
+              </w:rPr>
+              <w:t>лении: 112 или 102. 97 отдел полиции УМВД России по Всеволожскому району: г. Кудрово, Европейский пр., д. 24, круглосуточно, телефон +7 (81370) 4-29-43. Участковый пункт полиции № 7: г. Кудрово, ул. Центральная, д. 54, корп. 1, телефон +7 (999) 045-47-21.</w:t>
             </w:r>
           </w:p>
         </w:tc>
@@ -2719,9 +2766,7 @@
               <w:rPr>
                 <w:rFonts w:eastAsia="Times New Roman" w:cs="Times New Roman"/>
                 <w:szCs w:val="24"/>
-                <w:lang w:eastAsia="ru-RU"/>
-              </w:rPr>
-              <w:lastRenderedPageBreak/>
+              </w:rPr>
               <w:t>Пожарный надзор</w:t>
             </w:r>
           </w:p>
@@ -2751,7 +2796,6 @@
                 <w:rFonts w:eastAsia="Times New Roman" w:cs="Times New Roman"/>
                 <w:i/>
                 <w:szCs w:val="24"/>
-                <w:lang w:eastAsia="ru-RU"/>
               </w:rPr>
               <w:t>Главное управление МЧС России по Ленинградской области, 188662, Ленинградская область, Всеволожский район, г. Мурино, ул. Оборонная, д. 51, телефон +7 (812) 640-05-90. При пожаре: 101 или 112.</w:t>
             </w:r>
@@ -2781,7 +2825,6 @@
               <w:rPr>
                 <w:rFonts w:eastAsia="Times New Roman" w:cs="Times New Roman"/>
                 <w:szCs w:val="24"/>
-                <w:lang w:eastAsia="ru-RU"/>
               </w:rPr>
               <w:t>Глазной центр</w:t>
             </w:r>
@@ -2812,9 +2855,16 @@
                 <w:rFonts w:eastAsia="Times New Roman" w:cs="Times New Roman"/>
                 <w:i/>
                 <w:szCs w:val="24"/>
-                <w:lang w:eastAsia="ru-RU"/>
-              </w:rPr>
-              <w:t>ГБУЗ ЛО «Всеволожская КМБ», Центр медицинский офтальмологический, г. Всеволожск, Колтушское ш., д. 20. Контакт-центр: +7 (813) 704-31-49. При травме позвонить 112 или в контакт-центр.</w:t>
+              </w:rPr>
+              <w:t>ГБУЗ ЛО «Всеволожская КМБ», Цен</w:t>
+            </w:r>
+            <w:r>
+              <w:rPr>
+                <w:rFonts w:eastAsia="Times New Roman" w:cs="Times New Roman"/>
+                <w:i/>
+                <w:szCs w:val="24"/>
+              </w:rPr>
+              <w:t>тр медицинский офтальмологический, г. Всеволожск, Колтушское ш., д. 20. Контакт-центр: +7 (813) 704-31-49. При травме позвонить 112 или в контакт-центр.</w:t>
             </w:r>
           </w:p>
         </w:tc>
@@ -2842,8 +2892,8 @@
               <w:rPr>
                 <w:rFonts w:eastAsia="Times New Roman" w:cs="Times New Roman"/>
                 <w:szCs w:val="24"/>
-                <w:lang w:eastAsia="ru-RU"/>
-              </w:rPr>
+              </w:rPr>
+              <w:lastRenderedPageBreak/>
               <w:t>Коммерческая скорая помощь</w:t>
             </w:r>
           </w:p>
@@ -2872,7 +2922,6 @@
                 <w:rFonts w:eastAsia="Times New Roman" w:cs="Times New Roman"/>
                 <w:i/>
                 <w:szCs w:val="24"/>
-                <w:lang w:eastAsia="ru-RU"/>
               </w:rPr>
               <w:t xml:space="preserve">«Приоритет» - экстренная помощь и госпитализация в стационары Санкт-Петербурга, телефон +7 (812) 313-21-21. </w:t>
             </w:r>
@@ -2891,7 +2940,6 @@
                 <w:rFonts w:eastAsia="Times New Roman" w:cs="Times New Roman"/>
                 <w:i/>
                 <w:szCs w:val="24"/>
-                <w:lang w:eastAsia="ru-RU"/>
               </w:rPr>
               <w:t xml:space="preserve">«Скорая 24» - круглосуточный выезд врача на дом в Кудрово. телефон +7 (925) 550-40-03. </w:t>
             </w:r>
@@ -2911,9 +2959,16 @@
                 <w:rFonts w:eastAsia="Times New Roman" w:cs="Times New Roman"/>
                 <w:i/>
                 <w:szCs w:val="24"/>
-                <w:lang w:eastAsia="ru-RU"/>
-              </w:rPr>
-              <w:t>При угрозе жизни сначала лучше вызывать государственную скорую помощь по номеру 103 или 112.</w:t>
+              </w:rPr>
+              <w:t>При угрозе жизни сначала лучше вызывать государственную ско</w:t>
+            </w:r>
+            <w:r>
+              <w:rPr>
+                <w:rFonts w:eastAsia="Times New Roman" w:cs="Times New Roman"/>
+                <w:i/>
+                <w:szCs w:val="24"/>
+              </w:rPr>
+              <w:t>рую помощь по номеру 103 или 112.</w:t>
             </w:r>
           </w:p>
         </w:tc>
@@ -2941,7 +2996,6 @@
               <w:rPr>
                 <w:rFonts w:eastAsia="Times New Roman" w:cs="Times New Roman"/>
                 <w:szCs w:val="24"/>
-                <w:lang w:eastAsia="ru-RU"/>
               </w:rPr>
               <w:t>Роддом</w:t>
             </w:r>
@@ -2971,7 +3025,6 @@
                 <w:rFonts w:eastAsia="Times New Roman" w:cs="Times New Roman"/>
                 <w:i/>
                 <w:szCs w:val="24"/>
-                <w:lang w:eastAsia="ru-RU"/>
               </w:rPr>
               <w:t xml:space="preserve">Городской перинатальный центр № 1, Санкт-Петербург, пр. Солидарности, д. 6, телефон +7 (812) 245-38-00. </w:t>
             </w:r>
@@ -2990,7 +3043,6 @@
                 <w:rFonts w:eastAsia="Times New Roman" w:cs="Times New Roman"/>
                 <w:i/>
                 <w:szCs w:val="24"/>
-                <w:lang w:eastAsia="ru-RU"/>
               </w:rPr>
               <w:t xml:space="preserve">Родильный дом ГБУЗ ЛО «Всеволожская КМБ», г. Всеволожск, Колтушское ш., д. 20, телефон +7 (81370) 4-31-49. </w:t>
             </w:r>
@@ -3010,9 +3062,16 @@
                 <w:rFonts w:eastAsia="Times New Roman" w:cs="Times New Roman"/>
                 <w:i/>
                 <w:szCs w:val="24"/>
-                <w:lang w:eastAsia="ru-RU"/>
-              </w:rPr>
-              <w:t>Коммерческая клиника: «</w:t>
+              </w:rPr>
+              <w:t>К</w:t>
+            </w:r>
+            <w:r>
+              <w:rPr>
+                <w:rFonts w:eastAsia="Times New Roman" w:cs="Times New Roman"/>
+                <w:i/>
+                <w:szCs w:val="24"/>
+              </w:rPr>
+              <w:t>оммерческая клиника: «</w:t>
             </w:r>
             <w:proofErr w:type="spellStart"/>
             <w:r>
@@ -3020,7 +3079,6 @@
                 <w:rFonts w:eastAsia="Times New Roman" w:cs="Times New Roman"/>
                 <w:i/>
                 <w:szCs w:val="24"/>
-                <w:lang w:eastAsia="ru-RU"/>
               </w:rPr>
               <w:t>Евромед</w:t>
             </w:r>
@@ -3030,7 +3088,6 @@
                 <w:rFonts w:eastAsia="Times New Roman" w:cs="Times New Roman"/>
                 <w:i/>
                 <w:szCs w:val="24"/>
-                <w:lang w:eastAsia="ru-RU"/>
               </w:rPr>
               <w:t xml:space="preserve"> Клиник», СПБ, Суворовский пр., д. 60, телефон +7 (812) 327-03-01.</w:t>
             </w:r>
@@ -3100,7 +3157,6 @@
               <w:rPr>
                 <w:rFonts w:eastAsia="Times New Roman" w:cs="Times New Roman"/>
                 <w:szCs w:val="24"/>
-                <w:lang w:eastAsia="ru-RU"/>
               </w:rPr>
               <w:t>Таблица 6 – Список контактов ответственных и доверенных лиц</w:t>
             </w:r>
@@ -3130,7 +3186,6 @@
               <w:rPr>
                 <w:rFonts w:eastAsia="Times New Roman" w:cs="Times New Roman"/>
                 <w:szCs w:val="24"/>
-                <w:lang w:eastAsia="ru-RU"/>
               </w:rPr>
               <w:t>Адвокат</w:t>
             </w:r>
@@ -3161,7 +3216,6 @@
                 <w:rFonts w:eastAsia="Times New Roman" w:cs="Times New Roman"/>
                 <w:i/>
                 <w:szCs w:val="24"/>
-                <w:lang w:eastAsia="ru-RU"/>
               </w:rPr>
               <w:t>Данные скрыты</w:t>
             </w:r>
@@ -3191,7 +3245,6 @@
               <w:rPr>
                 <w:rFonts w:eastAsia="Times New Roman" w:cs="Times New Roman"/>
                 <w:szCs w:val="24"/>
-                <w:lang w:eastAsia="ru-RU"/>
               </w:rPr>
               <w:t>Страховая компания</w:t>
             </w:r>
@@ -3215,7 +3268,6 @@
                 <w:i/>
                 <w:color w:val="000000"/>
                 <w:szCs w:val="24"/>
-                <w:lang w:eastAsia="ru-RU"/>
               </w:rPr>
             </w:pPr>
             <w:r>
@@ -3224,9 +3276,8 @@
                 <w:i/>
                 <w:color w:val="000000"/>
                 <w:szCs w:val="24"/>
-                <w:lang w:eastAsia="ru-RU"/>
-              </w:rPr>
-              <w:t>Санкт-Петербургский филиал «Страховая компания «СОГАЗ-Мед»</w:t>
+              </w:rPr>
+              <w:t xml:space="preserve">Санкт-Петербургский филиал «Страховая </w:t>
             </w:r>
             <w:r>
               <w:rPr>
@@ -3234,9 +3285,27 @@
                 <w:i/>
                 <w:color w:val="000000"/>
                 <w:szCs w:val="24"/>
-                <w:lang w:eastAsia="ru-RU"/>
-              </w:rPr>
-              <w:br/>
+              </w:rPr>
+              <w:t>компания «СОГАЗ-Мед»</w:t>
+            </w:r>
+          </w:p>
+          <w:p>
+            <w:pPr>
+              <w:spacing w:before="120" w:after="0" w:line="276" w:lineRule="auto"/>
+              <w:rPr>
+                <w:rFonts w:eastAsia="Times New Roman" w:cs="Times New Roman"/>
+                <w:i/>
+                <w:color w:val="000000"/>
+                <w:szCs w:val="24"/>
+              </w:rPr>
+            </w:pPr>
+            <w:r>
+              <w:rPr>
+                <w:rFonts w:eastAsia="Times New Roman" w:cs="Times New Roman"/>
+                <w:i/>
+                <w:color w:val="000000"/>
+                <w:szCs w:val="24"/>
+              </w:rPr>
               <w:t>Телефон +7 (800) 100-07-02</w:t>
             </w:r>
           </w:p>
@@ -3250,7 +3319,6 @@
                 <w:i/>
                 <w:color w:val="000000"/>
                 <w:szCs w:val="24"/>
-                <w:lang w:eastAsia="ru-RU"/>
               </w:rPr>
               <w:t xml:space="preserve">Почта: </w:t>
             </w:r>
@@ -3283,7 +3351,6 @@
               <w:rPr>
                 <w:rFonts w:eastAsia="Times New Roman" w:cs="Times New Roman"/>
                 <w:szCs w:val="24"/>
-                <w:lang w:eastAsia="ru-RU"/>
               </w:rPr>
               <w:t>Участковый полицейский</w:t>
             </w:r>
@@ -3313,7 +3380,6 @@
                 <w:rFonts w:eastAsia="Times New Roman" w:cs="Times New Roman"/>
                 <w:i/>
                 <w:szCs w:val="24"/>
-                <w:lang w:eastAsia="ru-RU"/>
               </w:rPr>
               <w:t>Смирнов Юрий Николаевич</w:t>
             </w:r>
@@ -3332,7 +3398,6 @@
                 <w:rFonts w:eastAsia="Times New Roman" w:cs="Times New Roman"/>
                 <w:i/>
                 <w:szCs w:val="24"/>
-                <w:lang w:eastAsia="ru-RU"/>
               </w:rPr>
               <w:t>Телефон +7 (999) 045-12-81</w:t>
             </w:r>
@@ -3351,7 +3416,6 @@
                 <w:rFonts w:eastAsia="Times New Roman" w:cs="Times New Roman"/>
                 <w:i/>
                 <w:szCs w:val="24"/>
-                <w:lang w:eastAsia="ru-RU"/>
               </w:rPr>
               <w:t>Номер отдела полиции: 97</w:t>
             </w:r>
@@ -3371,9 +3435,7 @@
                 <w:rFonts w:eastAsia="Times New Roman" w:cs="Times New Roman"/>
                 <w:i/>
                 <w:szCs w:val="24"/>
-                <w:lang w:eastAsia="ru-RU"/>
-              </w:rPr>
-              <w:lastRenderedPageBreak/>
+              </w:rPr>
               <w:t>Почта: iusmirnov43@mvd.ru</w:t>
             </w:r>
           </w:p>
@@ -3402,9 +3464,7 @@
               <w:rPr>
                 <w:rFonts w:eastAsia="Times New Roman" w:cs="Times New Roman"/>
                 <w:szCs w:val="24"/>
-                <w:lang w:eastAsia="ru-RU"/>
-              </w:rPr>
-              <w:lastRenderedPageBreak/>
+              </w:rPr>
               <w:t>Участковый врач</w:t>
             </w:r>
           </w:p>
@@ -3423,18 +3483,140 @@
             <w:pPr>
               <w:spacing w:before="120" w:after="0" w:line="276" w:lineRule="auto"/>
               <w:rPr>
+                <w:rFonts w:eastAsia="Times New Roman" w:cs="Times New Roman"/>
+                <w:i/>
                 <w:color w:val="000000"/>
-              </w:rPr>
-            </w:pPr>
+                <w:szCs w:val="24"/>
+              </w:rPr>
+            </w:pPr>
+            <w:proofErr w:type="spellStart"/>
             <w:r>
               <w:rPr>
                 <w:rFonts w:eastAsia="Times New Roman" w:cs="Times New Roman"/>
                 <w:i/>
                 <w:color w:val="000000"/>
                 <w:szCs w:val="24"/>
-                <w:lang w:eastAsia="ru-RU"/>
-              </w:rPr>
-              <w:t>ФИО, телефон, номер поликлиники и вашего участка</w:t>
+              </w:rPr>
+              <w:t>Абдулжелилова</w:t>
+            </w:r>
+            <w:proofErr w:type="spellEnd"/>
+            <w:r>
+              <w:rPr>
+                <w:rFonts w:eastAsia="Times New Roman" w:cs="Times New Roman"/>
+                <w:i/>
+                <w:color w:val="000000"/>
+                <w:szCs w:val="24"/>
+              </w:rPr>
+              <w:t xml:space="preserve"> Юлия Ивановна</w:t>
+            </w:r>
+          </w:p>
+          <w:p>
+            <w:pPr>
+              <w:spacing w:before="120" w:after="0" w:line="276" w:lineRule="auto"/>
+              <w:rPr>
+                <w:rFonts w:eastAsia="Times New Roman" w:cs="Times New Roman"/>
+                <w:i/>
+                <w:color w:val="000000"/>
+                <w:szCs w:val="24"/>
+              </w:rPr>
+            </w:pPr>
+            <w:r>
+              <w:rPr>
+                <w:rFonts w:eastAsia="Times New Roman" w:cs="Times New Roman"/>
+                <w:i/>
+                <w:color w:val="000000"/>
+                <w:szCs w:val="24"/>
+              </w:rPr>
+              <w:t>Т</w:t>
+            </w:r>
+            <w:r>
+              <w:rPr>
+                <w:rFonts w:eastAsia="Times New Roman" w:cs="Times New Roman"/>
+                <w:i/>
+                <w:color w:val="000000"/>
+                <w:szCs w:val="24"/>
+              </w:rPr>
+              <w:t>елефон</w:t>
+            </w:r>
+            <w:r>
+              <w:rPr>
+                <w:rFonts w:eastAsia="Times New Roman" w:cs="Times New Roman"/>
+                <w:i/>
+                <w:color w:val="000000"/>
+                <w:szCs w:val="24"/>
+              </w:rPr>
+              <w:t xml:space="preserve"> </w:t>
+            </w:r>
+            <w:r>
+              <w:rPr>
+                <w:rFonts w:eastAsia="Times New Roman" w:cs="Times New Roman"/>
+                <w:i/>
+                <w:color w:val="000000"/>
+                <w:szCs w:val="24"/>
+              </w:rPr>
+              <w:t>+7</w:t>
+            </w:r>
+            <w:r>
+              <w:rPr>
+                <w:rFonts w:eastAsia="Times New Roman" w:cs="Times New Roman"/>
+                <w:i/>
+                <w:color w:val="000000"/>
+                <w:szCs w:val="24"/>
+              </w:rPr>
+              <w:t> (</w:t>
+            </w:r>
+            <w:r>
+              <w:rPr>
+                <w:rFonts w:eastAsia="Times New Roman" w:cs="Times New Roman"/>
+                <w:i/>
+                <w:color w:val="000000"/>
+                <w:szCs w:val="24"/>
+              </w:rPr>
+              <w:t>812</w:t>
+            </w:r>
+            <w:r>
+              <w:rPr>
+                <w:rFonts w:eastAsia="Times New Roman" w:cs="Times New Roman"/>
+                <w:i/>
+                <w:color w:val="000000"/>
+                <w:szCs w:val="24"/>
+              </w:rPr>
+              <w:t>)</w:t>
+            </w:r>
+            <w:r>
+              <w:rPr>
+                <w:rFonts w:eastAsia="Times New Roman" w:cs="Times New Roman"/>
+                <w:i/>
+                <w:color w:val="000000"/>
+                <w:szCs w:val="24"/>
+              </w:rPr>
+              <w:t xml:space="preserve"> 214-37-62</w:t>
+            </w:r>
+          </w:p>
+          <w:p>
+            <w:pPr>
+              <w:spacing w:before="120" w:after="0" w:line="276" w:lineRule="auto"/>
+              <w:rPr>
+                <w:color w:val="000000"/>
+              </w:rPr>
+            </w:pPr>
+            <w:r>
+              <w:rPr>
+                <w:rFonts w:eastAsia="Times New Roman" w:cs="Times New Roman"/>
+                <w:i/>
+                <w:color w:val="000000"/>
+                <w:szCs w:val="24"/>
+              </w:rPr>
+              <w:t>ГБУЗ ЛО «Вс</w:t>
+            </w:r>
+            <w:r>
+              <w:rPr>
+                <w:rFonts w:eastAsia="Times New Roman" w:cs="Times New Roman"/>
+                <w:i/>
+                <w:color w:val="000000"/>
+                <w:szCs w:val="24"/>
+              </w:rPr>
+              <w:t>еволожская КМБ» (Код МО: 470014)</w:t>
             </w:r>
           </w:p>
         </w:tc>
@@ -3462,7 +3644,6 @@
               <w:rPr>
                 <w:rFonts w:eastAsia="Times New Roman" w:cs="Times New Roman"/>
                 <w:szCs w:val="24"/>
-                <w:lang w:eastAsia="ru-RU"/>
               </w:rPr>
               <w:t>Управляющая компания</w:t>
             </w:r>
@@ -3486,7 +3667,6 @@
                 <w:i/>
                 <w:color w:val="000000"/>
                 <w:szCs w:val="24"/>
-                <w:lang w:eastAsia="ru-RU"/>
               </w:rPr>
             </w:pPr>
             <w:r>
@@ -3495,7 +3675,6 @@
                 <w:i/>
                 <w:color w:val="000000"/>
                 <w:szCs w:val="24"/>
-                <w:lang w:eastAsia="ru-RU"/>
               </w:rPr>
               <w:t>ООО «УК Технология комфорта»</w:t>
             </w:r>
@@ -3508,7 +3687,6 @@
                 <w:i/>
                 <w:color w:val="000000"/>
                 <w:szCs w:val="24"/>
-                <w:lang w:eastAsia="ru-RU"/>
               </w:rPr>
             </w:pPr>
             <w:r>
@@ -3517,9 +3695,26 @@
                 <w:i/>
                 <w:color w:val="000000"/>
                 <w:szCs w:val="24"/>
-                <w:lang w:eastAsia="ru-RU"/>
-              </w:rPr>
-              <w:t>Телефоны: +7 (812) 339-39-27</w:t>
+              </w:rPr>
+              <w:t>Телефон</w:t>
+            </w:r>
+            <w:r>
+              <w:rPr>
+                <w:rFonts w:eastAsia="Times New Roman" w:cs="Times New Roman"/>
+                <w:i/>
+                <w:color w:val="000000"/>
+                <w:szCs w:val="24"/>
+              </w:rPr>
+              <w:t xml:space="preserve"> +7 (812) 339-39-27</w:t>
+            </w:r>
+            <w:r>
+              <w:rPr>
+                <w:rFonts w:eastAsia="Times New Roman" w:cs="Times New Roman"/>
+                <w:i/>
+                <w:color w:val="000000"/>
+                <w:szCs w:val="24"/>
+              </w:rPr>
+              <w:t>в</w:t>
             </w:r>
           </w:p>
           <w:p>
@@ -3530,7 +3725,6 @@
                 <w:i/>
                 <w:color w:val="000000"/>
                 <w:szCs w:val="24"/>
-                <w:lang w:eastAsia="ru-RU"/>
               </w:rPr>
             </w:pPr>
             <w:r>
@@ -3539,7 +3733,6 @@
                 <w:i/>
                 <w:color w:val="000000"/>
                 <w:szCs w:val="24"/>
-                <w:lang w:eastAsia="ru-RU"/>
               </w:rPr>
               <w:t>Электронная почта: uk.technokom@gmail.com</w:t>
             </w:r>
@@ -3569,7 +3762,6 @@
               <w:rPr>
                 <w:rFonts w:eastAsia="Times New Roman" w:cs="Times New Roman"/>
                 <w:szCs w:val="24"/>
-                <w:lang w:eastAsia="ru-RU"/>
               </w:rPr>
               <w:t>Охранный комплекс</w:t>
             </w:r>
@@ -3598,7 +3790,6 @@
                 <w:i/>
                 <w:color w:val="000000"/>
                 <w:szCs w:val="24"/>
-                <w:lang w:eastAsia="ru-RU"/>
               </w:rPr>
               <w:t>+7 (495) 292-76-79</w:t>
             </w:r>
@@ -3628,7 +3819,6 @@
               <w:rPr>
                 <w:rFonts w:eastAsia="Times New Roman" w:cs="Times New Roman"/>
                 <w:szCs w:val="24"/>
-                <w:lang w:eastAsia="ru-RU"/>
               </w:rPr>
               <w:t>Лифтовой сервис</w:t>
             </w:r>
@@ -3650,8 +3840,6 @@
               <w:rPr>
                 <w:rFonts w:ascii="Calibri" w:eastAsia="Calibri" w:hAnsi="Calibri" w:cs="Calibri"/>
                 <w:color w:val="000000"/>
-                <w:sz w:val="22"/>
-                <w:lang w:eastAsia="ru-RU"/>
               </w:rPr>
             </w:pPr>
             <w:r>
@@ -3660,7 +3848,6 @@
                 <w:i/>
                 <w:color w:val="000000"/>
                 <w:szCs w:val="24"/>
-                <w:lang w:eastAsia="ru-RU"/>
               </w:rPr>
               <w:t>+7 (812) 409-62-71</w:t>
             </w:r>
@@ -3690,7 +3877,6 @@
               <w:rPr>
                 <w:rFonts w:eastAsia="Times New Roman" w:cs="Times New Roman"/>
                 <w:szCs w:val="24"/>
-                <w:lang w:eastAsia="ru-RU"/>
               </w:rPr>
               <w:t>Сантехник</w:t>
             </w:r>
@@ -3712,8 +3898,6 @@
               <w:rPr>
                 <w:rFonts w:ascii="Calibri" w:eastAsia="Calibri" w:hAnsi="Calibri" w:cs="Calibri"/>
                 <w:color w:val="000000"/>
-                <w:sz w:val="22"/>
-                <w:lang w:eastAsia="ru-RU"/>
               </w:rPr>
             </w:pPr>
             <w:r>
@@ -3722,7 +3906,6 @@
                 <w:i/>
                 <w:color w:val="000000"/>
                 <w:szCs w:val="24"/>
-                <w:lang w:eastAsia="ru-RU"/>
               </w:rPr>
               <w:t>+7 (812) 561-30-83</w:t>
             </w:r>
@@ -3752,7 +3935,6 @@
               <w:rPr>
                 <w:rFonts w:eastAsia="Times New Roman" w:cs="Times New Roman"/>
                 <w:szCs w:val="24"/>
-                <w:lang w:eastAsia="ru-RU"/>
               </w:rPr>
               <w:t>Электрик</w:t>
             </w:r>
@@ -3774,8 +3956,6 @@
               <w:rPr>
                 <w:rFonts w:ascii="Calibri" w:eastAsia="Calibri" w:hAnsi="Calibri" w:cs="Calibri"/>
                 <w:color w:val="000000"/>
-                <w:sz w:val="22"/>
-                <w:lang w:eastAsia="ru-RU"/>
               </w:rPr>
             </w:pPr>
             <w:r>
@@ -3784,9 +3964,17 @@
                 <w:i/>
                 <w:color w:val="000000"/>
                 <w:szCs w:val="24"/>
-                <w:lang w:eastAsia="ru-RU"/>
-              </w:rPr>
-              <w:t>+7 (800) 444-02-43</w:t>
+              </w:rPr>
+              <w:t xml:space="preserve">+7 </w:t>
+            </w:r>
+            <w:r>
+              <w:rPr>
+                <w:rFonts w:eastAsia="Times New Roman" w:cs="Times New Roman"/>
+                <w:i/>
+                <w:color w:val="000000"/>
+                <w:szCs w:val="24"/>
+              </w:rPr>
+              <w:t>(800) 444-02-43</w:t>
             </w:r>
           </w:p>
         </w:tc>
@@ -3814,8 +4002,8 @@
               <w:rPr>
                 <w:rFonts w:eastAsia="Times New Roman" w:cs="Times New Roman"/>
                 <w:szCs w:val="24"/>
-                <w:lang w:eastAsia="ru-RU"/>
-              </w:rPr>
+              </w:rPr>
+              <w:lastRenderedPageBreak/>
               <w:t>Оконный мастер</w:t>
             </w:r>
           </w:p>
@@ -3871,7 +4059,6 @@
               <w:rPr>
                 <w:rFonts w:eastAsia="Times New Roman" w:cs="Times New Roman"/>
                 <w:szCs w:val="24"/>
-                <w:lang w:eastAsia="ru-RU"/>
               </w:rPr>
               <w:t>Ремонт дверей и замков</w:t>
             </w:r>
@@ -3928,7 +4115,6 @@
               <w:rPr>
                 <w:rFonts w:eastAsia="Times New Roman" w:cs="Times New Roman"/>
                 <w:szCs w:val="24"/>
-                <w:lang w:eastAsia="ru-RU"/>
               </w:rPr>
               <w:t>Родственники</w:t>
             </w:r>
@@ -3958,7 +4144,6 @@
                 <w:rFonts w:eastAsia="Times New Roman" w:cs="Times New Roman"/>
                 <w:i/>
                 <w:szCs w:val="24"/>
-                <w:lang w:eastAsia="ru-RU"/>
               </w:rPr>
               <w:t>Данные скрыты</w:t>
             </w:r>
@@ -3988,7 +4173,6 @@
               <w:rPr>
                 <w:rFonts w:eastAsia="Times New Roman" w:cs="Times New Roman"/>
                 <w:szCs w:val="24"/>
-                <w:lang w:eastAsia="ru-RU"/>
               </w:rPr>
               <w:t>Няня / уборщица</w:t>
             </w:r>
@@ -4018,7 +4202,6 @@
                 <w:rFonts w:eastAsia="Times New Roman" w:cs="Times New Roman"/>
                 <w:i/>
                 <w:szCs w:val="24"/>
-                <w:lang w:eastAsia="ru-RU"/>
               </w:rPr>
               <w:t>Данные скрыты</w:t>
             </w:r>
@@ -4057,15 +4240,6 @@
           <w:b/>
         </w:rPr>
         <w:t>Задание 3: Пожарная безопасность</w:t>
-      </w:r>
-    </w:p>
-    <w:p>
-      <w:pPr>
-        <w:spacing w:before="240" w:line="276" w:lineRule="auto"/>
-        <w:jc w:val="both"/>
-      </w:pPr>
-      <w:r>
-        <w:t>Ознакомиться с доступными мерами предупреждения и борьбы с пожарами в вашем месте проживания, составить фотоотчет.</w:t>
       </w:r>
     </w:p>
     <w:p>
@@ -4121,7 +4295,6 @@
               <w:rPr>
                 <w:rFonts w:eastAsia="Times New Roman" w:cs="Times New Roman"/>
                 <w:szCs w:val="24"/>
-                <w:lang w:eastAsia="ru-RU"/>
               </w:rPr>
               <w:t>Таблица 7 – Высокая пожарная нагрузка в месте моего проживания</w:t>
             </w:r>
@@ -4151,7 +4324,6 @@
               <w:rPr>
                 <w:rFonts w:eastAsia="Times New Roman" w:cs="Times New Roman"/>
                 <w:szCs w:val="24"/>
-                <w:lang w:eastAsia="ru-RU"/>
               </w:rPr>
               <w:t>Пожароопасный объект № 1</w:t>
             </w:r>
@@ -4173,30 +4345,16 @@
               <w:rPr>
                 <w:rFonts w:eastAsia="Times New Roman" w:cs="Times New Roman"/>
                 <w:i/>
-                <w:color w:val="808080" w:themeColor="background1" w:themeShade="80"/>
-                <w:szCs w:val="24"/>
-                <w:lang w:val="en-US"/>
-              </w:rPr>
-            </w:pPr>
-            <w:r>
-              <w:rPr>
-                <w:rFonts w:eastAsia="Times New Roman" w:cs="Times New Roman"/>
-                <w:i/>
-                <w:color w:val="808080" w:themeColor="background1" w:themeShade="80"/>
-                <w:szCs w:val="24"/>
-                <w:lang w:eastAsia="ru-RU"/>
-              </w:rPr>
-              <w:t>У</w:t>
-            </w:r>
-            <w:r>
-              <w:rPr>
-                <w:rFonts w:eastAsia="Times New Roman" w:cs="Times New Roman"/>
-                <w:i/>
-                <w:color w:val="808080" w:themeColor="background1" w:themeShade="80"/>
-                <w:szCs w:val="24"/>
-                <w:lang w:eastAsia="ru-RU"/>
-              </w:rPr>
-              <w:t>тюг. Содержит пластмассовый корпус, нагревательный элемент и электрический шнур. Риск возникает при перегреве, повреждении шнура или если оставить утюг включённым.</w:t>
+                <w:szCs w:val="24"/>
+              </w:rPr>
+            </w:pPr>
+            <w:r>
+              <w:rPr>
+                <w:rFonts w:eastAsia="Times New Roman" w:cs="Times New Roman"/>
+                <w:i/>
+                <w:szCs w:val="24"/>
+              </w:rPr>
+              <w:t>Утюг. Содержит пластмассовый корпус, нагревательный элемент и электрический шнур. Риск возникает при перегреве, повреждении шнура или если оставить утюг включённым.</w:t>
             </w:r>
           </w:p>
         </w:tc>
@@ -4224,7 +4382,6 @@
               <w:rPr>
                 <w:rFonts w:eastAsia="Times New Roman" w:cs="Times New Roman"/>
                 <w:szCs w:val="24"/>
-                <w:lang w:eastAsia="ru-RU"/>
               </w:rPr>
               <w:t>Пожароопасный объект № 2</w:t>
             </w:r>
@@ -4246,19 +4403,32 @@
               <w:rPr>
                 <w:rFonts w:eastAsia="Times New Roman" w:cs="Times New Roman"/>
                 <w:i/>
-                <w:color w:val="808080" w:themeColor="background1" w:themeShade="80"/>
-                <w:szCs w:val="24"/>
-              </w:rPr>
-            </w:pPr>
-            <w:r>
-              <w:rPr>
-                <w:rFonts w:eastAsia="Times New Roman" w:cs="Times New Roman"/>
-                <w:i/>
-                <w:color w:val="808080" w:themeColor="background1" w:themeShade="80"/>
-                <w:szCs w:val="24"/>
-                <w:lang w:eastAsia="ru-RU"/>
-              </w:rPr>
-              <w:t>Укажите состав и количество веществ и материалов.</w:t>
+                <w:szCs w:val="24"/>
+              </w:rPr>
+            </w:pPr>
+            <w:r>
+              <w:rPr>
+                <w:rFonts w:eastAsia="Times New Roman" w:cs="Times New Roman"/>
+                <w:i/>
+                <w:szCs w:val="24"/>
+              </w:rPr>
+              <w:t>Деревянный письменный стол. Он сделан из древесин</w:t>
+            </w:r>
+            <w:r>
+              <w:rPr>
+                <w:rFonts w:eastAsia="Times New Roman" w:cs="Times New Roman"/>
+                <w:i/>
+                <w:szCs w:val="24"/>
+              </w:rPr>
+              <w:t xml:space="preserve">. Если рядом появится открытый огонь, стол может </w:t>
+            </w:r>
+            <w:r>
+              <w:rPr>
+                <w:rFonts w:eastAsia="Times New Roman" w:cs="Times New Roman"/>
+                <w:i/>
+                <w:szCs w:val="24"/>
+              </w:rPr>
+              <w:t>загореться и поддерживать пламя.</w:t>
             </w:r>
           </w:p>
         </w:tc>
@@ -4286,9 +4456,7 @@
               <w:rPr>
                 <w:rFonts w:eastAsia="Times New Roman" w:cs="Times New Roman"/>
                 <w:szCs w:val="24"/>
-                <w:lang w:eastAsia="ru-RU"/>
-              </w:rPr>
-              <w:lastRenderedPageBreak/>
+              </w:rPr>
               <w:t>Пожароопасный объект № 3</w:t>
             </w:r>
           </w:p>
@@ -4309,19 +4477,40 @@
               <w:rPr>
                 <w:rFonts w:eastAsia="Times New Roman" w:cs="Times New Roman"/>
                 <w:i/>
-                <w:color w:val="808080" w:themeColor="background1" w:themeShade="80"/>
-                <w:szCs w:val="24"/>
-              </w:rPr>
-            </w:pPr>
-            <w:r>
-              <w:rPr>
-                <w:rFonts w:eastAsia="Times New Roman" w:cs="Times New Roman"/>
-                <w:i/>
-                <w:color w:val="808080" w:themeColor="background1" w:themeShade="80"/>
-                <w:szCs w:val="24"/>
-                <w:lang w:eastAsia="ru-RU"/>
-              </w:rPr>
-              <w:t>Укажите состав и количество веществ и материалов.</w:t>
+                <w:szCs w:val="24"/>
+              </w:rPr>
+            </w:pPr>
+            <w:r>
+              <w:rPr>
+                <w:rFonts w:eastAsia="Times New Roman" w:cs="Times New Roman"/>
+                <w:i/>
+                <w:szCs w:val="24"/>
+              </w:rPr>
+              <w:t xml:space="preserve">Сетевой разветвитель. </w:t>
+            </w:r>
+            <w:r>
+              <w:rPr>
+                <w:rFonts w:eastAsia="Times New Roman" w:cs="Times New Roman"/>
+                <w:i/>
+                <w:szCs w:val="24"/>
+              </w:rPr>
+              <w:t>Имеет</w:t>
+            </w:r>
+            <w:r>
+              <w:rPr>
+                <w:rFonts w:eastAsia="Times New Roman" w:cs="Times New Roman"/>
+                <w:i/>
+                <w:szCs w:val="24"/>
+              </w:rPr>
+              <w:t xml:space="preserve"> пластмассовый корпус, электрический кабель с полимерной изоляцией и металлические контакты. Риск возникает, если фильтр перегрузить, допустить его перегрев или пользоваться повреждённым кабелем.</w:t>
+            </w:r>
+            <w:r>
+              <w:rPr>
+                <w:rFonts w:eastAsia="Times New Roman" w:cs="Times New Roman"/>
+                <w:i/>
+                <w:szCs w:val="24"/>
+              </w:rPr>
+              <w:t xml:space="preserve"> </w:t>
             </w:r>
           </w:p>
         </w:tc>
@@ -4331,9 +4520,15 @@
       <w:pPr>
         <w:spacing w:before="240" w:line="276" w:lineRule="auto"/>
         <w:jc w:val="both"/>
+        <w:rPr>
+          <w:szCs w:val="24"/>
+        </w:rPr>
       </w:pPr>
       <w:r>
-        <w:t>Опишите ниже, какие меры предприняты с вашей стороны для минимизации пожарной опасности перечисленных выше объектов.</w:t>
+        <w:rPr>
+          <w:szCs w:val="24"/>
+        </w:rPr>
+        <w:t>Описание мер по снижению пожарной опасности.</w:t>
       </w:r>
     </w:p>
     <w:tbl>
@@ -4372,9 +4567,15 @@
               <w:rPr>
                 <w:rFonts w:eastAsia="Times New Roman" w:cs="Times New Roman"/>
                 <w:szCs w:val="24"/>
-                <w:lang w:eastAsia="ru-RU"/>
-              </w:rPr>
-              <w:t>Меры по снижению пожарной опасности в месте моего проживания:</w:t>
+              </w:rPr>
+              <w:t>М</w:t>
+            </w:r>
+            <w:r>
+              <w:rPr>
+                <w:rFonts w:eastAsia="Times New Roman" w:cs="Times New Roman"/>
+                <w:szCs w:val="24"/>
+              </w:rPr>
+              <w:t>еры по снижению пожарной опасности в месте моего проживания:</w:t>
             </w:r>
           </w:p>
         </w:tc>
@@ -4405,9 +4606,16 @@
                 <w:rFonts w:eastAsia="Times New Roman" w:cs="Times New Roman"/>
                 <w:i/>
                 <w:szCs w:val="24"/>
-                <w:lang w:eastAsia="ru-RU"/>
-              </w:rPr>
-              <w:t>Не оставлять без присмотра работающие электроприборы, пользоваться исправными розетками и удлинителями с защитой от перегрузки, очищать кухонную вытяжку от жира, проверять работу пожарного извещателя.</w:t>
+              </w:rPr>
+              <w:t>Не оставлять без присмотра работающие электроприборы, пользоваться исправными розетками и удлинителями с защитой от перег</w:t>
+            </w:r>
+            <w:r>
+              <w:rPr>
+                <w:rFonts w:eastAsia="Times New Roman" w:cs="Times New Roman"/>
+                <w:i/>
+                <w:szCs w:val="24"/>
+              </w:rPr>
+              <w:t>рузки, очищать кухонную вытяжку от жира, проверять работу пожарного извещателя.</w:t>
             </w:r>
           </w:p>
         </w:tc>
@@ -4436,11 +4644,71 @@
         </w:rPr>
         <w:t>Пункт 3.2.</w:t>
       </w:r>
-      <w:r>
+    </w:p>
+    <w:p>
+      <w:pPr>
+        <w:tabs>
+          <w:tab w:val="left" w:pos="2146"/>
+        </w:tabs>
+        <w:spacing w:line="276" w:lineRule="auto"/>
+        <w:jc w:val="both"/>
+        <w:rPr>
+          <w:szCs w:val="24"/>
+        </w:rPr>
+      </w:pPr>
+      <w:r>
+        <w:rPr>
+          <w:szCs w:val="24"/>
+        </w:rPr>
+        <w:t>Фотоотчёт о расположении средств пожарной безопасности</w:t>
+      </w:r>
+      <w:r>
+        <w:rPr>
+          <w:szCs w:val="24"/>
+        </w:rPr>
+        <w:t>.</w:t>
+      </w:r>
+    </w:p>
+    <w:p>
+      <w:pPr>
+        <w:tabs>
+          <w:tab w:val="left" w:pos="2146"/>
+        </w:tabs>
+        <w:spacing w:line="276" w:lineRule="auto"/>
+        <w:jc w:val="both"/>
         <w:rPr>
           <w:b/>
         </w:rPr>
-        <w:tab/>
+      </w:pPr>
+      <w:r>
+        <w:rPr>
+          <w:szCs w:val="24"/>
+        </w:rPr>
+        <w:t>В разделе представлены фотографии доступных средств пожарной безопасности в доме: пожа</w:t>
+      </w:r>
+      <w:r>
+        <w:rPr>
+          <w:szCs w:val="24"/>
+        </w:rPr>
+        <w:t xml:space="preserve">рных шкафов, пожарных рукавов, </w:t>
+      </w:r>
+      <w:r>
+        <w:rPr>
+          <w:szCs w:val="24"/>
+        </w:rPr>
+        <w:t xml:space="preserve">пожарной сигнализации. Осмотр проведён на этаже и в общедоступных местах </w:t>
+      </w:r>
+      <w:r>
+        <w:rPr>
+          <w:szCs w:val="24"/>
+        </w:rPr>
+        <w:t>дома</w:t>
+      </w:r>
+      <w:r>
+        <w:rPr>
+          <w:szCs w:val="24"/>
+        </w:rPr>
+        <w:t>. Переносной огнетушитель при осмотре не обнаружен, информация о его размещении на сайте управляющей компании отсутствует.</w:t>
       </w:r>
     </w:p>
     <w:p>
@@ -4449,7 +4717,1655 @@
         <w:jc w:val="both"/>
       </w:pPr>
       <w:r>
-        <w:t>Сфотографируйте местонахождение ближайших к Вашему месту проживания пожарных шкафов, пожарных рукавов, сигнализации, огнетушителей (на Вашем этаже, в подъезде, доме). Приложите фотосъемку к отчету.</w:t>
+        <w:rPr>
+          <w:noProof/>
+        </w:rPr>
+        <w:lastRenderedPageBreak/>
+        <mc:AlternateContent>
+          <mc:Choice Requires="wps">
+            <w:drawing>
+              <wp:anchor distT="0" distB="0" distL="114300" distR="114300" simplePos="0" relativeHeight="251666432" behindDoc="0" locked="0" layoutInCell="1" allowOverlap="1" wp14:anchorId="3E45C862" wp14:editId="17582202">
+                <wp:simplePos x="0" y="0"/>
+                <wp:positionH relativeFrom="margin">
+                  <wp:posOffset>384048</wp:posOffset>
+                </wp:positionH>
+                <wp:positionV relativeFrom="paragraph">
+                  <wp:posOffset>6247257</wp:posOffset>
+                </wp:positionV>
+                <wp:extent cx="1426210" cy="635"/>
+                <wp:effectExtent l="0" t="0" r="2540" b="0"/>
+                <wp:wrapTopAndBottom/>
+                <wp:docPr id="9" name="Надпись 9"/>
+                <wp:cNvGraphicFramePr/>
+                <a:graphic xmlns:a="http://schemas.openxmlformats.org/drawingml/2006/main">
+                  <a:graphicData uri="http://schemas.microsoft.com/office/word/2010/wordprocessingShape">
+                    <wps:wsp>
+                      <wps:cNvSpPr txBox="1"/>
+                      <wps:spPr>
+                        <a:xfrm>
+                          <a:off x="0" y="0"/>
+                          <a:ext cx="1426210" cy="635"/>
+                        </a:xfrm>
+                        <a:prstGeom prst="rect">
+                          <a:avLst/>
+                        </a:prstGeom>
+                        <a:solidFill>
+                          <a:prstClr val="white"/>
+                        </a:solidFill>
+                        <a:ln>
+                          <a:noFill/>
+                        </a:ln>
+                        <a:effectLst/>
+                      </wps:spPr>
+                      <wps:txbx>
+                        <w:txbxContent>
+                          <w:p>
+                            <w:pPr>
+                              <w:pStyle w:val="ac"/>
+                              <w:rPr>
+                                <w:sz w:val="20"/>
+                                <w:szCs w:val="20"/>
+                              </w:rPr>
+                            </w:pPr>
+                            <w:r>
+                              <w:rPr>
+                                <w:sz w:val="20"/>
+                                <w:szCs w:val="20"/>
+                              </w:rPr>
+                              <w:t>Пожарная сигнализация</w:t>
+                            </w:r>
+                          </w:p>
+                        </w:txbxContent>
+                      </wps:txbx>
+                      <wps:bodyPr rot="0" spcFirstLastPara="0" vertOverflow="overflow" horzOverflow="overflow" vert="horz" wrap="square" lIns="0" tIns="0" rIns="0" bIns="0" numCol="1" spcCol="0" rtlCol="0" fromWordArt="0" anchor="t" anchorCtr="0" forceAA="0" compatLnSpc="1">
+                        <a:prstTxWarp prst="textNoShape">
+                          <a:avLst/>
+                        </a:prstTxWarp>
+                        <a:spAutoFit/>
+                      </wps:bodyPr>
+                    </wps:wsp>
+                  </a:graphicData>
+                </a:graphic>
+                <wp14:sizeRelH relativeFrom="margin">
+                  <wp14:pctWidth>0</wp14:pctWidth>
+                </wp14:sizeRelH>
+              </wp:anchor>
+            </w:drawing>
+          </mc:Choice>
+          <mc:Fallback>
+            <w:pict>
+              <v:shapetype w14:anchorId="3E45C862" id="_x0000_t202" coordsize="21600,21600" o:spt="202" path="m,l,21600r21600,l21600,xe">
+                <v:stroke joinstyle="miter"/>
+                <v:path gradientshapeok="t" o:connecttype="rect"/>
+              </v:shapetype>
+              <v:shape id="Надпись 9" o:spid="_x0000_s1027" type="#_x0000_t202" style="position:absolute;left:0;text-align:left;margin-left:30.25pt;margin-top:491.9pt;width:112.3pt;height:.05pt;z-index:251666432;visibility:visible;mso-wrap-style:square;mso-width-percent:0;mso-wrap-distance-left:9pt;mso-wrap-distance-top:0;mso-wrap-distance-right:9pt;mso-wrap-distance-bottom:0;mso-position-horizontal:absolute;mso-position-horizontal-relative:margin;mso-position-vertical:absolute;mso-position-vertical-relative:text;mso-width-percent:0;mso-width-relative:margin;v-text-anchor:top" o:gfxdata="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" stroked="f">
+                <v:textbox style="mso-fit-shape-to-text:t" inset="0,0,0,0">
+                  <w:txbxContent>
+                    <w:p>
+                      <w:pPr>
+                        <w:pStyle w:val="ac"/>
+                        <w:rPr>
+                          <w:sz w:val="20"/>
+                          <w:szCs w:val="20"/>
+                        </w:rPr>
+                      </w:pPr>
+                      <w:r>
+                        <w:rPr>
+                          <w:sz w:val="20"/>
+                          <w:szCs w:val="20"/>
+                        </w:rPr>
+                        <w:t>Пожарная сигнализация</w:t>
+                      </w:r>
+                    </w:p>
+                  </w:txbxContent>
+                </v:textbox>
+                <w10:wrap type="topAndBottom" anchorx="margin"/>
+              </v:shape>
+            </w:pict>
+          </mc:Fallback>
+        </mc:AlternateContent>
+      </w:r>
+      <w:r>
+        <w:rPr>
+          <w:noProof/>
+        </w:rPr>
+        <mc:AlternateContent>
+          <mc:Choice Requires="wps">
+            <w:drawing>
+              <wp:anchor distT="0" distB="0" distL="114300" distR="114300" simplePos="0" relativeHeight="251663360" behindDoc="0" locked="0" layoutInCell="1" allowOverlap="1" wp14:anchorId="29841277" wp14:editId="5D3FDA16">
+                <wp:simplePos x="0" y="0"/>
+                <wp:positionH relativeFrom="column">
+                  <wp:posOffset>3045460</wp:posOffset>
+                </wp:positionH>
+                <wp:positionV relativeFrom="paragraph">
+                  <wp:posOffset>2958465</wp:posOffset>
+                </wp:positionV>
+                <wp:extent cx="993140" cy="635"/>
+                <wp:effectExtent l="0" t="0" r="0" b="0"/>
+                <wp:wrapTopAndBottom/>
+                <wp:docPr id="7" name="Надпись 7"/>
+                <wp:cNvGraphicFramePr/>
+                <a:graphic xmlns:a="http://schemas.openxmlformats.org/drawingml/2006/main">
+                  <a:graphicData uri="http://schemas.microsoft.com/office/word/2010/wordprocessingShape">
+                    <wps:wsp>
+                      <wps:cNvSpPr txBox="1"/>
+                      <wps:spPr>
+                        <a:xfrm>
+                          <a:off x="0" y="0"/>
+                          <a:ext cx="993140" cy="635"/>
+                        </a:xfrm>
+                        <a:prstGeom prst="rect">
+                          <a:avLst/>
+                        </a:prstGeom>
+                        <a:solidFill>
+                          <a:prstClr val="white"/>
+                        </a:solidFill>
+                        <a:ln>
+                          <a:noFill/>
+                        </a:ln>
+                        <a:effectLst/>
+                      </wps:spPr>
+                      <wps:txbx>
+                        <w:txbxContent>
+                          <w:p>
+                            <w:pPr>
+                              <w:pStyle w:val="ac"/>
+                              <w:rPr>
+                                <w:sz w:val="20"/>
+                                <w:szCs w:val="20"/>
+                              </w:rPr>
+                            </w:pPr>
+                            <w:r>
+                              <w:rPr>
+                                <w:sz w:val="20"/>
+                                <w:szCs w:val="20"/>
+                              </w:rPr>
+                              <w:t>Пожарный рукав</w:t>
+                            </w:r>
+                          </w:p>
+                        </w:txbxContent>
+                      </wps:txbx>
+                      <wps:bodyPr rot="0" spcFirstLastPara="0" vertOverflow="overflow" horzOverflow="overflow" vert="horz" wrap="square" lIns="0" tIns="0" rIns="0" bIns="0" numCol="1" spcCol="0" rtlCol="0" fromWordArt="0" anchor="t" anchorCtr="0" forceAA="0" compatLnSpc="1">
+                        <a:prstTxWarp prst="textNoShape">
+                          <a:avLst/>
+                        </a:prstTxWarp>
+                        <a:spAutoFit/>
+                      </wps:bodyPr>
+                    </wps:wsp>
+                  </a:graphicData>
+                </a:graphic>
+                <wp14:sizeRelH relativeFrom="margin">
+                  <wp14:pctWidth>0</wp14:pctWidth>
+                </wp14:sizeRelH>
+              </wp:anchor>
+            </w:drawing>
+          </mc:Choice>
+          <mc:Fallback>
+            <w:pict>
+              <v:shape w14:anchorId="29841277" id="Надпись 7" o:spid="_x0000_s1028" type="#_x0000_t202" style="position:absolute;left:0;text-align:left;margin-left:239.8pt;margin-top:232.95pt;width:78.2pt;height:.05pt;z-index:251663360;visibility:visible;mso-wrap-style:square;mso-width-percent:0;mso-wrap-distance-left:9pt;mso-wrap-distance-top:0;mso-wrap-distance-right:9pt;mso-wrap-distance-bottom:0;mso-position-horizontal:absolute;mso-position-horizontal-relative:text;mso-position-vertical:absolute;mso-position-vertical-relative:text;mso-width-percent:0;mso-width-relative:margin;v-text-anchor:top" o:gfxdata="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" stroked="f">
+                <v:textbox style="mso-fit-shape-to-text:t" inset="0,0,0,0">
+                  <w:txbxContent>
+                    <w:p>
+                      <w:pPr>
+                        <w:pStyle w:val="ac"/>
+                        <w:rPr>
+                          <w:sz w:val="20"/>
+                          <w:szCs w:val="20"/>
+                        </w:rPr>
+                      </w:pPr>
+                      <w:r>
+                        <w:rPr>
+                          <w:sz w:val="20"/>
+                          <w:szCs w:val="20"/>
+                        </w:rPr>
+                        <w:t>Пожарный рукав</w:t>
+                      </w:r>
+                    </w:p>
+                  </w:txbxContent>
+                </v:textbox>
+                <w10:wrap type="topAndBottom"/>
+              </v:shape>
+            </w:pict>
+          </mc:Fallback>
+        </mc:AlternateContent>
+      </w:r>
+      <w:r>
+        <w:rPr>
+          <w:noProof/>
+          <w:lang w:eastAsia="ru-RU"/>
+        </w:rPr>
+        <w:drawing>
+          <wp:anchor distT="0" distB="0" distL="114300" distR="114300" simplePos="0" relativeHeight="251659264" behindDoc="1" locked="0" layoutInCell="1" allowOverlap="1" wp14:anchorId="17E0942C" wp14:editId="26890470">
+            <wp:simplePos x="0" y="0"/>
+            <wp:positionH relativeFrom="margin">
+              <wp:posOffset>2418969</wp:posOffset>
+            </wp:positionH>
+            <wp:positionV relativeFrom="paragraph">
+              <wp:posOffset>508</wp:posOffset>
+            </wp:positionV>
+            <wp:extent cx="2217420" cy="2956560"/>
+            <wp:effectExtent l="0" t="0" r="0" b="0"/>
+            <wp:wrapTopAndBottom/>
+            <wp:docPr id="4" name="Рисунок 4" descr="C:\Users\Andrey\Documents\university\year-2\semester-1\life-safety\labworks\emergencies\img\содержимое_пожарного_шкафа.jpg"/>
+            <wp:cNvGraphicFramePr>
+              <a:graphicFrameLocks xmlns:a="http://schemas.openxmlformats.org/drawingml/2006/main" noChangeAspect="1"/>
+            </wp:cNvGraphicFramePr>
+            <a:graphic xmlns:a="http://schemas.openxmlformats.org/drawingml/2006/main">
+              <a:graphicData uri="http://schemas.openxmlformats.org/drawingml/2006/picture">
+                <pic:pic xmlns:pic="http://schemas.openxmlformats.org/drawingml/2006/picture">
+                  <pic:nvPicPr>
+                    <pic:cNvPr id="0" name="Picture 2" descr="C:\Users\Andrey\Documents\university\year-2\semester-1\life-safety\labworks\emergencies\img\содержимое_пожарного_шкафа.jpg"/>
+                    <pic:cNvPicPr>
+                      <a:picLocks noChangeAspect="1" noChangeArrowheads="1"/>
+                    </pic:cNvPicPr>
+                  </pic:nvPicPr>
+                  <pic:blipFill>
+                    <a:blip r:embed="rId10" cstate="print">
+                      <a:extLst>
+                        <a:ext uri="{28A0092B-C50C-407E-A947-70E740481C1C}">
+                          <a14:useLocalDpi xmlns:a14="http://schemas.microsoft.com/office/drawing/2010/main" val="0"/>
+                        </a:ext>
+                      </a:extLst>
+                    </a:blip>
+                    <a:srcRect/>
+                    <a:stretch>
+                      <a:fillRect/>
+                    </a:stretch>
+                  </pic:blipFill>
+                  <pic:spPr bwMode="auto">
+                    <a:xfrm>
+                      <a:off x="0" y="0"/>
+                      <a:ext cx="2217420" cy="2956560"/>
+                    </a:xfrm>
+                    <a:prstGeom prst="rect">
+                      <a:avLst/>
+                    </a:prstGeom>
+                    <a:noFill/>
+                    <a:ln>
+                      <a:noFill/>
+                    </a:ln>
+                  </pic:spPr>
+                </pic:pic>
+              </a:graphicData>
+            </a:graphic>
+          </wp:anchor>
+        </w:drawing>
+      </w:r>
+      <w:r>
+        <w:rPr>
+          <w:noProof/>
+        </w:rPr>
+        <mc:AlternateContent>
+          <mc:Choice Requires="wps">
+            <w:drawing>
+              <wp:anchor distT="0" distB="0" distL="114300" distR="114300" simplePos="0" relativeHeight="251661312" behindDoc="0" locked="0" layoutInCell="1" allowOverlap="1" wp14:anchorId="6CE17C34" wp14:editId="53EFD433">
+                <wp:simplePos x="0" y="0"/>
+                <wp:positionH relativeFrom="column">
+                  <wp:posOffset>504825</wp:posOffset>
+                </wp:positionH>
+                <wp:positionV relativeFrom="paragraph">
+                  <wp:posOffset>2955290</wp:posOffset>
+                </wp:positionV>
+                <wp:extent cx="1023620" cy="635"/>
+                <wp:effectExtent l="0" t="0" r="5080" b="0"/>
+                <wp:wrapTopAndBottom/>
+                <wp:docPr id="6" name="Надпись 6"/>
+                <wp:cNvGraphicFramePr/>
+                <a:graphic xmlns:a="http://schemas.openxmlformats.org/drawingml/2006/main">
+                  <a:graphicData uri="http://schemas.microsoft.com/office/word/2010/wordprocessingShape">
+                    <wps:wsp>
+                      <wps:cNvSpPr txBox="1"/>
+                      <wps:spPr>
+                        <a:xfrm>
+                          <a:off x="0" y="0"/>
+                          <a:ext cx="1023620" cy="635"/>
+                        </a:xfrm>
+                        <a:prstGeom prst="rect">
+                          <a:avLst/>
+                        </a:prstGeom>
+                        <a:solidFill>
+                          <a:prstClr val="white"/>
+                        </a:solidFill>
+                        <a:ln>
+                          <a:noFill/>
+                        </a:ln>
+                        <a:effectLst/>
+                      </wps:spPr>
+                      <wps:txbx>
+                        <w:txbxContent>
+                          <w:p>
+                            <w:pPr>
+                              <w:pStyle w:val="ac"/>
+                              <w:rPr>
+                                <w:noProof/>
+                                <w:sz w:val="20"/>
+                                <w:szCs w:val="20"/>
+                              </w:rPr>
+                            </w:pPr>
+                            <w:r>
+                              <w:rPr>
+                                <w:sz w:val="20"/>
+                                <w:szCs w:val="20"/>
+                              </w:rPr>
+                              <w:t>Пожарный шкаф</w:t>
+                            </w:r>
+                          </w:p>
+                        </w:txbxContent>
+                      </wps:txbx>
+                      <wps:bodyPr rot="0" spcFirstLastPara="0" vertOverflow="overflow" horzOverflow="overflow" vert="horz" wrap="square" lIns="0" tIns="0" rIns="0" bIns="0" numCol="1" spcCol="0" rtlCol="0" fromWordArt="0" anchor="t" anchorCtr="0" forceAA="0" compatLnSpc="1">
+                        <a:prstTxWarp prst="textNoShape">
+                          <a:avLst/>
+                        </a:prstTxWarp>
+                        <a:spAutoFit/>
+                      </wps:bodyPr>
+                    </wps:wsp>
+                  </a:graphicData>
+                </a:graphic>
+                <wp14:sizeRelH relativeFrom="margin">
+                  <wp14:pctWidth>0</wp14:pctWidth>
+                </wp14:sizeRelH>
+              </wp:anchor>
+            </w:drawing>
+          </mc:Choice>
+          <mc:Fallback>
+            <w:pict>
+              <v:shape w14:anchorId="6CE17C34" id="Надпись 6" o:spid="_x0000_s1029" type="#_x0000_t202" style="position:absolute;left:0;text-align:left;margin-left:39.75pt;margin-top:232.7pt;width:80.6pt;height:.05pt;z-index:251661312;visibility:visible;mso-wrap-style:square;mso-width-percent:0;mso-wrap-distance-left:9pt;mso-wrap-distance-top:0;mso-wrap-distance-right:9pt;mso-wrap-distance-bottom:0;mso-position-horizontal:absolute;mso-position-horizontal-relative:text;mso-position-vertical:absolute;mso-position-vertical-relative:text;mso-width-percent:0;mso-width-relative:margin;v-text-anchor:top" o:gfxdata="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" stroked="f">
+                <v:textbox style="mso-fit-shape-to-text:t" inset="0,0,0,0">
+                  <w:txbxContent>
+                    <w:p>
+                      <w:pPr>
+                        <w:pStyle w:val="ac"/>
+                        <w:rPr>
+                          <w:noProof/>
+                          <w:sz w:val="20"/>
+                          <w:szCs w:val="20"/>
+                        </w:rPr>
+                      </w:pPr>
+                      <w:r>
+                        <w:rPr>
+                          <w:sz w:val="20"/>
+                          <w:szCs w:val="20"/>
+                        </w:rPr>
+                        <w:t>Пожарный шкаф</w:t>
+                      </w:r>
+                    </w:p>
+                  </w:txbxContent>
+                </v:textbox>
+                <w10:wrap type="topAndBottom"/>
+              </v:shape>
+            </w:pict>
+          </mc:Fallback>
+        </mc:AlternateContent>
+      </w:r>
+      <w:r>
+        <w:rPr>
+          <w:noProof/>
+          <w:lang w:eastAsia="ru-RU"/>
+        </w:rPr>
+        <w:drawing>
+          <wp:anchor distT="0" distB="0" distL="114300" distR="114300" simplePos="0" relativeHeight="251658240" behindDoc="1" locked="0" layoutInCell="1" allowOverlap="1" wp14:anchorId="6B46096D" wp14:editId="62B112FE">
+            <wp:simplePos x="0" y="0"/>
+            <wp:positionH relativeFrom="margin">
+              <wp:align>left</wp:align>
+            </wp:positionH>
+            <wp:positionV relativeFrom="paragraph">
+              <wp:posOffset>254</wp:posOffset>
+            </wp:positionV>
+            <wp:extent cx="2218690" cy="2958465"/>
+            <wp:effectExtent l="0" t="0" r="0" b="0"/>
+            <wp:wrapTopAndBottom/>
+            <wp:docPr id="3" name="Рисунок 3" descr="C:\Users\Andrey\Documents\university\year-2\semester-1\life-safety\labworks\emergencies\img\пожарный_шкаф.jpg"/>
+            <wp:cNvGraphicFramePr>
+              <a:graphicFrameLocks xmlns:a="http://schemas.openxmlformats.org/drawingml/2006/main" noChangeAspect="1"/>
+            </wp:cNvGraphicFramePr>
+            <a:graphic xmlns:a="http://schemas.openxmlformats.org/drawingml/2006/main">
+              <a:graphicData uri="http://schemas.openxmlformats.org/drawingml/2006/picture">
+                <pic:pic xmlns:pic="http://schemas.openxmlformats.org/drawingml/2006/picture">
+                  <pic:nvPicPr>
+                    <pic:cNvPr id="0" name="Picture 1" descr="C:\Users\Andrey\Documents\university\year-2\semester-1\life-safety\labworks\emergencies\img\пожарный_шкаф.jpg"/>
+                    <pic:cNvPicPr>
+                      <a:picLocks noChangeAspect="1" noChangeArrowheads="1"/>
+                    </pic:cNvPicPr>
+                  </pic:nvPicPr>
+                  <pic:blipFill>
+                    <a:blip r:embed="rId11" cstate="print">
+                      <a:extLst>
+                        <a:ext uri="{28A0092B-C50C-407E-A947-70E740481C1C}">
+                          <a14:useLocalDpi xmlns:a14="http://schemas.microsoft.com/office/drawing/2010/main" val="0"/>
+                        </a:ext>
+                      </a:extLst>
+                    </a:blip>
+                    <a:srcRect/>
+                    <a:stretch>
+                      <a:fillRect/>
+                    </a:stretch>
+                  </pic:blipFill>
+                  <pic:spPr bwMode="auto">
+                    <a:xfrm>
+                      <a:off x="0" y="0"/>
+                      <a:ext cx="2218690" cy="2958465"/>
+                    </a:xfrm>
+                    <a:prstGeom prst="rect">
+                      <a:avLst/>
+                    </a:prstGeom>
+                    <a:noFill/>
+                    <a:ln>
+                      <a:noFill/>
+                    </a:ln>
+                  </pic:spPr>
+                </pic:pic>
+              </a:graphicData>
+            </a:graphic>
+          </wp:anchor>
+        </w:drawing>
+      </w:r>
+      <w:r>
+        <w:rPr>
+          <w:rStyle w:val="a"/>
+          <w:rFonts w:ascii="Times New Roman" w:eastAsia="Times New Roman" w:hAnsi="Times New Roman" w:cs="Times New Roman"/>
+          <w:snapToGrid w:val="0"/>
+          <w:color w:val="000000"/>
+          <w:w w:val="0"/>
+          <w:sz w:val="0"/>
+          <w:szCs w:val="0"/>
+          <w:u w:color="000000"/>
+          <w:bdr w:val="none" w:sz="0" w:space="0" w:color="000000"/>
+          <w:shd w:val="clear" w:color="000000" w:fill="000000"/>
+          <w:lang w:val="x-none" w:eastAsia="x-none" w:bidi="x-none"/>
+        </w:rPr>
+        <w:t xml:space="preserve"> </w:t>
+      </w:r>
+      <w:r>
+        <w:rPr>
+          <w:noProof/>
+          <w:lang w:eastAsia="ru-RU"/>
+        </w:rPr>
+        <w:drawing>
+          <wp:anchor distT="0" distB="0" distL="114300" distR="114300" simplePos="0" relativeHeight="251664384" behindDoc="0" locked="0" layoutInCell="1" allowOverlap="1" wp14:anchorId="4A155292" wp14:editId="2BFC9A34">
+            <wp:simplePos x="0" y="0"/>
+            <wp:positionH relativeFrom="column">
+              <wp:posOffset>-1270</wp:posOffset>
+            </wp:positionH>
+            <wp:positionV relativeFrom="paragraph">
+              <wp:posOffset>3272790</wp:posOffset>
+            </wp:positionV>
+            <wp:extent cx="2224800" cy="2966568"/>
+            <wp:effectExtent l="0" t="0" r="4445" b="5715"/>
+            <wp:wrapTopAndBottom/>
+            <wp:docPr id="8" name="Рисунок 8" descr="C:\Users\Andrey\Documents\university\year-2\semester-1\life-safety\labworks\emergencies\img\пожарная_сигналка.jpg"/>
+            <wp:cNvGraphicFramePr>
+              <a:graphicFrameLocks xmlns:a="http://schemas.openxmlformats.org/drawingml/2006/main" noChangeAspect="1"/>
+            </wp:cNvGraphicFramePr>
+            <a:graphic xmlns:a="http://schemas.openxmlformats.org/drawingml/2006/main">
+              <a:graphicData uri="http://schemas.openxmlformats.org/drawingml/2006/picture">
+                <pic:pic xmlns:pic="http://schemas.openxmlformats.org/drawingml/2006/picture">
+                  <pic:nvPicPr>
+                    <pic:cNvPr id="0" name="Picture 3" descr="C:\Users\Andrey\Documents\university\year-2\semester-1\life-safety\labworks\emergencies\img\пожарная_сигналка.jpg"/>
+                    <pic:cNvPicPr>
+                      <a:picLocks noChangeAspect="1" noChangeArrowheads="1"/>
+                    </pic:cNvPicPr>
+                  </pic:nvPicPr>
+                  <pic:blipFill>
+                    <a:blip r:embed="rId12" cstate="print">
+                      <a:extLst>
+                        <a:ext uri="{28A0092B-C50C-407E-A947-70E740481C1C}">
+                          <a14:useLocalDpi xmlns:a14="http://schemas.microsoft.com/office/drawing/2010/main" val="0"/>
+                        </a:ext>
+                      </a:extLst>
+                    </a:blip>
+                    <a:srcRect/>
+                    <a:stretch>
+                      <a:fillRect/>
+                    </a:stretch>
+                  </pic:blipFill>
+                  <pic:spPr bwMode="auto">
+                    <a:xfrm>
+                      <a:off x="0" y="0"/>
+                      <a:ext cx="2224800" cy="2966568"/>
+                    </a:xfrm>
+                    <a:prstGeom prst="rect">
+                      <a:avLst/>
+                    </a:prstGeom>
+                    <a:noFill/>
+                    <a:ln>
+                      <a:noFill/>
+                    </a:ln>
+                  </pic:spPr>
+                </pic:pic>
+              </a:graphicData>
+            </a:graphic>
+            <wp14:sizeRelH relativeFrom="margin">
+              <wp14:pctWidth>0</wp14:pctWidth>
+            </wp14:sizeRelH>
+            <wp14:sizeRelV relativeFrom="margin">
+              <wp14:pctHeight>0</wp14:pctHeight>
+            </wp14:sizeRelV>
+          </wp:anchor>
+        </w:drawing>
+      </w:r>
+    </w:p>
+    <w:p>
+      <w:pPr>
+        <w:spacing w:line="276" w:lineRule="auto"/>
+        <w:jc w:val="both"/>
+        <w:rPr>
+          <w:b/>
+        </w:rPr>
+      </w:pPr>
+      <w:r>
+        <w:rPr>
+          <w:b/>
+        </w:rPr>
+        <w:t>Пункт 3.3.</w:t>
+      </w:r>
+    </w:p>
+    <w:p>
+      <w:r>
+        <w:t>Фотоотчёт о путях эвакуации и пожарной инфраструктуре</w:t>
+      </w:r>
+      <w:r>
+        <w:t>.</w:t>
+      </w:r>
+    </w:p>
+    <w:p>
+      <w:r>
+        <w:t>В данном разделе представлены фотографии пожарного выхода, чёрной лестницы, пожарного проезда к дому и ближайшего пожарного гидранта. На фрагменте карты отмечены дом и расположение указанных объектов.</w:t>
+      </w:r>
+    </w:p>
+    <w:p>
+      <w:pPr>
+        <w:keepNext/>
+      </w:pPr>
+      <w:r>
+        <w:rPr>
+          <w:noProof/>
+        </w:rPr>
+        <w:lastRenderedPageBreak/>
+        <mc:AlternateContent>
+          <mc:Choice Requires="wps">
+            <w:drawing>
+              <wp:anchor distT="0" distB="0" distL="114300" distR="114300" simplePos="0" relativeHeight="251683840" behindDoc="0" locked="0" layoutInCell="1" allowOverlap="1" wp14:anchorId="2A244833" wp14:editId="562940CE">
+                <wp:simplePos x="0" y="0"/>
+                <wp:positionH relativeFrom="margin">
+                  <wp:posOffset>456384</wp:posOffset>
+                </wp:positionH>
+                <wp:positionV relativeFrom="paragraph">
+                  <wp:posOffset>8508910</wp:posOffset>
+                </wp:positionV>
+                <wp:extent cx="1495425" cy="635"/>
+                <wp:effectExtent l="0" t="0" r="9525" b="0"/>
+                <wp:wrapTopAndBottom/>
+                <wp:docPr id="21" name="Надпись 21"/>
+                <wp:cNvGraphicFramePr/>
+                <a:graphic xmlns:a="http://schemas.openxmlformats.org/drawingml/2006/main">
+                  <a:graphicData uri="http://schemas.microsoft.com/office/word/2010/wordprocessingShape">
+                    <wps:wsp>
+                      <wps:cNvSpPr txBox="1"/>
+                      <wps:spPr>
+                        <a:xfrm>
+                          <a:off x="0" y="0"/>
+                          <a:ext cx="1495425" cy="635"/>
+                        </a:xfrm>
+                        <a:prstGeom prst="rect">
+                          <a:avLst/>
+                        </a:prstGeom>
+                        <a:solidFill>
+                          <a:prstClr val="white"/>
+                        </a:solidFill>
+                        <a:ln>
+                          <a:noFill/>
+                        </a:ln>
+                        <a:effectLst/>
+                      </wps:spPr>
+                      <wps:txbx>
+                        <w:txbxContent>
+                          <w:p>
+                            <w:pPr>
+                              <w:pStyle w:val="ac"/>
+                              <w:rPr>
+                                <w:noProof/>
+                                <w:sz w:val="20"/>
+                                <w:szCs w:val="20"/>
+                              </w:rPr>
+                            </w:pPr>
+                            <w:r>
+                              <w:rPr>
+                                <w:sz w:val="20"/>
+                                <w:szCs w:val="20"/>
+                              </w:rPr>
+                              <w:t>Пожарный гидрант (ПГ)</w:t>
+                            </w:r>
+                          </w:p>
+                        </w:txbxContent>
+                      </wps:txbx>
+                      <wps:bodyPr rot="0" spcFirstLastPara="0" vertOverflow="overflow" horzOverflow="overflow" vert="horz" wrap="square" lIns="0" tIns="0" rIns="0" bIns="0" numCol="1" spcCol="0" rtlCol="0" fromWordArt="0" anchor="t" anchorCtr="0" forceAA="0" compatLnSpc="1">
+                        <a:prstTxWarp prst="textNoShape">
+                          <a:avLst/>
+                        </a:prstTxWarp>
+                        <a:spAutoFit/>
+                      </wps:bodyPr>
+                    </wps:wsp>
+                  </a:graphicData>
+                </a:graphic>
+                <wp14:sizeRelH relativeFrom="margin">
+                  <wp14:pctWidth>0</wp14:pctWidth>
+                </wp14:sizeRelH>
+              </wp:anchor>
+            </w:drawing>
+          </mc:Choice>
+          <mc:Fallback>
+            <w:pict>
+              <v:shape w14:anchorId="2A244833" id="Надпись 21" o:spid="_x0000_s1030" type="#_x0000_t202" style="position:absolute;margin-left:35.95pt;margin-top:670pt;width:117.75pt;height:.05pt;z-index:251683840;visibility:visible;mso-wrap-style:square;mso-width-percent:0;mso-wrap-distance-left:9pt;mso-wrap-distance-top:0;mso-wrap-distance-right:9pt;mso-wrap-distance-bottom:0;mso-position-horizontal:absolute;mso-position-horizontal-relative:margin;mso-position-vertical:absolute;mso-position-vertical-relative:text;mso-width-percent:0;mso-width-relative:margin;v-text-anchor:top" o:gfxdata="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" stroked="f">
+                <v:textbox style="mso-fit-shape-to-text:t" inset="0,0,0,0">
+                  <w:txbxContent>
+                    <w:p>
+                      <w:pPr>
+                        <w:pStyle w:val="ac"/>
+                        <w:rPr>
+                          <w:noProof/>
+                          <w:sz w:val="20"/>
+                          <w:szCs w:val="20"/>
+                        </w:rPr>
+                      </w:pPr>
+                      <w:r>
+                        <w:rPr>
+                          <w:sz w:val="20"/>
+                          <w:szCs w:val="20"/>
+                        </w:rPr>
+                        <w:t>Пожарный гидрант (ПГ)</w:t>
+                      </w:r>
+                    </w:p>
+                  </w:txbxContent>
+                </v:textbox>
+                <w10:wrap type="topAndBottom" anchorx="margin"/>
+              </v:shape>
+            </w:pict>
+          </mc:Fallback>
+        </mc:AlternateContent>
+      </w:r>
+      <w:r>
+        <w:rPr>
+          <w:noProof/>
+        </w:rPr>
+        <mc:AlternateContent>
+          <mc:Choice Requires="wps">
+            <w:drawing>
+              <wp:anchor distT="0" distB="0" distL="114300" distR="114300" simplePos="0" relativeHeight="251685888" behindDoc="0" locked="0" layoutInCell="1" allowOverlap="1" wp14:anchorId="6EA9D320" wp14:editId="73F6D476">
+                <wp:simplePos x="0" y="0"/>
+                <wp:positionH relativeFrom="column">
+                  <wp:posOffset>4118519</wp:posOffset>
+                </wp:positionH>
+                <wp:positionV relativeFrom="paragraph">
+                  <wp:posOffset>8511994</wp:posOffset>
+                </wp:positionV>
+                <wp:extent cx="1090295" cy="635"/>
+                <wp:effectExtent l="0" t="0" r="0" b="0"/>
+                <wp:wrapTopAndBottom/>
+                <wp:docPr id="22" name="Надпись 22"/>
+                <wp:cNvGraphicFramePr/>
+                <a:graphic xmlns:a="http://schemas.openxmlformats.org/drawingml/2006/main">
+                  <a:graphicData uri="http://schemas.microsoft.com/office/word/2010/wordprocessingShape">
+                    <wps:wsp>
+                      <wps:cNvSpPr txBox="1"/>
+                      <wps:spPr>
+                        <a:xfrm>
+                          <a:off x="0" y="0"/>
+                          <a:ext cx="1090295" cy="635"/>
+                        </a:xfrm>
+                        <a:prstGeom prst="rect">
+                          <a:avLst/>
+                        </a:prstGeom>
+                        <a:solidFill>
+                          <a:prstClr val="white"/>
+                        </a:solidFill>
+                        <a:ln>
+                          <a:noFill/>
+                        </a:ln>
+                        <a:effectLst/>
+                      </wps:spPr>
+                      <wps:txbx>
+                        <w:txbxContent>
+                          <w:p>
+                            <w:pPr>
+                              <w:pStyle w:val="ac"/>
+                              <w:rPr>
+                                <w:noProof/>
+                                <w:sz w:val="20"/>
+                                <w:szCs w:val="20"/>
+                              </w:rPr>
+                            </w:pPr>
+                            <w:r>
+                              <w:rPr>
+                                <w:sz w:val="20"/>
+                                <w:szCs w:val="20"/>
+                              </w:rPr>
+                              <w:t>Пожарный проезд</w:t>
+                            </w:r>
+                          </w:p>
+                        </w:txbxContent>
+                      </wps:txbx>
+                      <wps:bodyPr rot="0" spcFirstLastPara="0" vertOverflow="overflow" horzOverflow="overflow" vert="horz" wrap="square" lIns="0" tIns="0" rIns="0" bIns="0" numCol="1" spcCol="0" rtlCol="0" fromWordArt="0" anchor="t" anchorCtr="0" forceAA="0" compatLnSpc="1">
+                        <a:prstTxWarp prst="textNoShape">
+                          <a:avLst/>
+                        </a:prstTxWarp>
+                        <a:spAutoFit/>
+                      </wps:bodyPr>
+                    </wps:wsp>
+                  </a:graphicData>
+                </a:graphic>
+                <wp14:sizeRelH relativeFrom="margin">
+                  <wp14:pctWidth>0</wp14:pctWidth>
+                </wp14:sizeRelH>
+              </wp:anchor>
+            </w:drawing>
+          </mc:Choice>
+          <mc:Fallback>
+            <w:pict>
+              <v:shape w14:anchorId="6EA9D320" id="Надпись 22" o:spid="_x0000_s1031" type="#_x0000_t202" style="position:absolute;margin-left:324.3pt;margin-top:670.25pt;width:85.85pt;height:.05pt;z-index:251685888;visibility:visible;mso-wrap-style:square;mso-width-percent:0;mso-wrap-distance-left:9pt;mso-wrap-distance-top:0;mso-wrap-distance-right:9pt;mso-wrap-distance-bottom:0;mso-position-horizontal:absolute;mso-position-horizontal-relative:text;mso-position-vertical:absolute;mso-position-vertical-relative:text;mso-width-percent:0;mso-width-relative:margin;v-text-anchor:top" o:gfxdata="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" stroked="f">
+                <v:textbox style="mso-fit-shape-to-text:t" inset="0,0,0,0">
+                  <w:txbxContent>
+                    <w:p>
+                      <w:pPr>
+                        <w:pStyle w:val="ac"/>
+                        <w:rPr>
+                          <w:noProof/>
+                          <w:sz w:val="20"/>
+                          <w:szCs w:val="20"/>
+                        </w:rPr>
+                      </w:pPr>
+                      <w:r>
+                        <w:rPr>
+                          <w:sz w:val="20"/>
+                          <w:szCs w:val="20"/>
+                        </w:rPr>
+                        <w:t>Пожарный проезд</w:t>
+                      </w:r>
+                    </w:p>
+                  </w:txbxContent>
+                </v:textbox>
+                <w10:wrap type="topAndBottom"/>
+              </v:shape>
+            </w:pict>
+          </mc:Fallback>
+        </mc:AlternateContent>
+      </w:r>
+      <w:r>
+        <w:rPr>
+          <w:noProof/>
+          <w:lang w:eastAsia="ru-RU"/>
+        </w:rPr>
+        <w:drawing>
+          <wp:anchor distT="0" distB="0" distL="114300" distR="114300" simplePos="0" relativeHeight="251681792" behindDoc="0" locked="0" layoutInCell="1" allowOverlap="1" wp14:anchorId="2FF54802" wp14:editId="03498751">
+            <wp:simplePos x="0" y="0"/>
+            <wp:positionH relativeFrom="margin">
+              <wp:posOffset>3462020</wp:posOffset>
+            </wp:positionH>
+            <wp:positionV relativeFrom="paragraph">
+              <wp:posOffset>5431336</wp:posOffset>
+            </wp:positionV>
+            <wp:extent cx="2303780" cy="3073400"/>
+            <wp:effectExtent l="0" t="0" r="1270" b="0"/>
+            <wp:wrapTopAndBottom/>
+            <wp:docPr id="20" name="Рисунок 20" descr="C:\Users\Andrey\Documents\university\year-2\semester-1\life-safety\labworks\emergencies\img\пожарный_въезд.jpg"/>
+            <wp:cNvGraphicFramePr>
+              <a:graphicFrameLocks xmlns:a="http://schemas.openxmlformats.org/drawingml/2006/main" noChangeAspect="1"/>
+            </wp:cNvGraphicFramePr>
+            <a:graphic xmlns:a="http://schemas.openxmlformats.org/drawingml/2006/main">
+              <a:graphicData uri="http://schemas.openxmlformats.org/drawingml/2006/picture">
+                <pic:pic xmlns:pic="http://schemas.openxmlformats.org/drawingml/2006/picture">
+                  <pic:nvPicPr>
+                    <pic:cNvPr id="0" name="Picture 9" descr="C:\Users\Andrey\Documents\university\year-2\semester-1\life-safety\labworks\emergencies\img\пожарный_въезд.jpg"/>
+                    <pic:cNvPicPr>
+                      <a:picLocks noChangeAspect="1" noChangeArrowheads="1"/>
+                    </pic:cNvPicPr>
+                  </pic:nvPicPr>
+                  <pic:blipFill>
+                    <a:blip r:embed="rId13" cstate="print">
+                      <a:extLst>
+                        <a:ext uri="{28A0092B-C50C-407E-A947-70E740481C1C}">
+                          <a14:useLocalDpi xmlns:a14="http://schemas.microsoft.com/office/drawing/2010/main" val="0"/>
+                        </a:ext>
+                      </a:extLst>
+                    </a:blip>
+                    <a:srcRect/>
+                    <a:stretch>
+                      <a:fillRect/>
+                    </a:stretch>
+                  </pic:blipFill>
+                  <pic:spPr bwMode="auto">
+                    <a:xfrm>
+                      <a:off x="0" y="0"/>
+                      <a:ext cx="2303780" cy="3073400"/>
+                    </a:xfrm>
+                    <a:prstGeom prst="rect">
+                      <a:avLst/>
+                    </a:prstGeom>
+                    <a:noFill/>
+                    <a:ln>
+                      <a:noFill/>
+                    </a:ln>
+                  </pic:spPr>
+                </pic:pic>
+              </a:graphicData>
+            </a:graphic>
+            <wp14:sizeRelH relativeFrom="margin">
+              <wp14:pctWidth>0</wp14:pctWidth>
+            </wp14:sizeRelH>
+            <wp14:sizeRelV relativeFrom="margin">
+              <wp14:pctHeight>0</wp14:pctHeight>
+            </wp14:sizeRelV>
+          </wp:anchor>
+        </w:drawing>
+      </w:r>
+      <w:r>
+        <w:rPr>
+          <w:noProof/>
+          <w:lang w:eastAsia="ru-RU"/>
+        </w:rPr>
+        <w:drawing>
+          <wp:anchor distT="0" distB="0" distL="114300" distR="114300" simplePos="0" relativeHeight="251680768" behindDoc="0" locked="0" layoutInCell="1" allowOverlap="1" wp14:anchorId="67C51FC5" wp14:editId="24F83D9E">
+            <wp:simplePos x="0" y="0"/>
+            <wp:positionH relativeFrom="margin">
+              <wp:posOffset>0</wp:posOffset>
+            </wp:positionH>
+            <wp:positionV relativeFrom="paragraph">
+              <wp:posOffset>5432606</wp:posOffset>
+            </wp:positionV>
+            <wp:extent cx="2304000" cy="3072220"/>
+            <wp:effectExtent l="0" t="0" r="1270" b="0"/>
+            <wp:wrapTopAndBottom/>
+            <wp:docPr id="19" name="Рисунок 19" descr="C:\Users\Andrey\Documents\university\year-2\semester-1\life-safety\labworks\emergencies\img\ПГ.jpg"/>
+            <wp:cNvGraphicFramePr>
+              <a:graphicFrameLocks xmlns:a="http://schemas.openxmlformats.org/drawingml/2006/main" noChangeAspect="1"/>
+            </wp:cNvGraphicFramePr>
+            <a:graphic xmlns:a="http://schemas.openxmlformats.org/drawingml/2006/main">
+              <a:graphicData uri="http://schemas.openxmlformats.org/drawingml/2006/picture">
+                <pic:pic xmlns:pic="http://schemas.openxmlformats.org/drawingml/2006/picture">
+                  <pic:nvPicPr>
+                    <pic:cNvPr id="0" name="Picture 8" descr="C:\Users\Andrey\Documents\university\year-2\semester-1\life-safety\labworks\emergencies\img\ПГ.jpg"/>
+                    <pic:cNvPicPr>
+                      <a:picLocks noChangeAspect="1" noChangeArrowheads="1"/>
+                    </pic:cNvPicPr>
+                  </pic:nvPicPr>
+                  <pic:blipFill>
+                    <a:blip r:embed="rId14" cstate="print">
+                      <a:extLst>
+                        <a:ext uri="{28A0092B-C50C-407E-A947-70E740481C1C}">
+                          <a14:useLocalDpi xmlns:a14="http://schemas.microsoft.com/office/drawing/2010/main" val="0"/>
+                        </a:ext>
+                      </a:extLst>
+                    </a:blip>
+                    <a:srcRect/>
+                    <a:stretch>
+                      <a:fillRect/>
+                    </a:stretch>
+                  </pic:blipFill>
+                  <pic:spPr bwMode="auto">
+                    <a:xfrm>
+                      <a:off x="0" y="0"/>
+                      <a:ext cx="2304000" cy="3072220"/>
+                    </a:xfrm>
+                    <a:prstGeom prst="rect">
+                      <a:avLst/>
+                    </a:prstGeom>
+                    <a:noFill/>
+                    <a:ln>
+                      <a:noFill/>
+                    </a:ln>
+                  </pic:spPr>
+                </pic:pic>
+              </a:graphicData>
+            </a:graphic>
+            <wp14:sizeRelH relativeFrom="margin">
+              <wp14:pctWidth>0</wp14:pctWidth>
+            </wp14:sizeRelH>
+            <wp14:sizeRelV relativeFrom="margin">
+              <wp14:pctHeight>0</wp14:pctHeight>
+            </wp14:sizeRelV>
+          </wp:anchor>
+        </w:drawing>
+      </w:r>
+      <w:r>
+        <w:rPr>
+          <w:noProof/>
+        </w:rPr>
+        <mc:AlternateContent>
+          <mc:Choice Requires="wps">
+            <w:drawing>
+              <wp:anchor distT="0" distB="0" distL="114300" distR="114300" simplePos="0" relativeHeight="251679744" behindDoc="0" locked="0" layoutInCell="1" allowOverlap="1" wp14:anchorId="6A3E1CD7" wp14:editId="4E88E30F">
+                <wp:simplePos x="0" y="0"/>
+                <wp:positionH relativeFrom="column">
+                  <wp:posOffset>3517991</wp:posOffset>
+                </wp:positionH>
+                <wp:positionV relativeFrom="paragraph">
+                  <wp:posOffset>4759325</wp:posOffset>
+                </wp:positionV>
+                <wp:extent cx="2553335" cy="635"/>
+                <wp:effectExtent l="0" t="0" r="0" b="0"/>
+                <wp:wrapTopAndBottom/>
+                <wp:docPr id="18" name="Надпись 18"/>
+                <wp:cNvGraphicFramePr/>
+                <a:graphic xmlns:a="http://schemas.openxmlformats.org/drawingml/2006/main">
+                  <a:graphicData uri="http://schemas.microsoft.com/office/word/2010/wordprocessingShape">
+                    <wps:wsp>
+                      <wps:cNvSpPr txBox="1"/>
+                      <wps:spPr>
+                        <a:xfrm>
+                          <a:off x="0" y="0"/>
+                          <a:ext cx="2553335" cy="635"/>
+                        </a:xfrm>
+                        <a:prstGeom prst="rect">
+                          <a:avLst/>
+                        </a:prstGeom>
+                        <a:solidFill>
+                          <a:prstClr val="white"/>
+                        </a:solidFill>
+                        <a:ln>
+                          <a:noFill/>
+                        </a:ln>
+                        <a:effectLst/>
+                      </wps:spPr>
+                      <wps:txbx>
+                        <w:txbxContent>
+                          <w:p>
+                            <w:pPr>
+                              <w:pStyle w:val="ac"/>
+                              <w:rPr>
+                                <w:noProof/>
+                                <w:sz w:val="20"/>
+                                <w:szCs w:val="20"/>
+                              </w:rPr>
+                            </w:pPr>
+                            <w:r>
+                              <w:rPr>
+                                <w:sz w:val="20"/>
+                                <w:szCs w:val="20"/>
+                              </w:rPr>
+                              <w:t>Карта с пожарными выходом и лестницей</w:t>
+                            </w:r>
+                          </w:p>
+                        </w:txbxContent>
+                      </wps:txbx>
+                      <wps:bodyPr rot="0" spcFirstLastPara="0" vertOverflow="overflow" horzOverflow="overflow" vert="horz" wrap="square" lIns="0" tIns="0" rIns="0" bIns="0" numCol="1" spcCol="0" rtlCol="0" fromWordArt="0" anchor="t" anchorCtr="0" forceAA="0" compatLnSpc="1">
+                        <a:prstTxWarp prst="textNoShape">
+                          <a:avLst/>
+                        </a:prstTxWarp>
+                        <a:spAutoFit/>
+                      </wps:bodyPr>
+                    </wps:wsp>
+                  </a:graphicData>
+                </a:graphic>
+                <wp14:sizeRelH relativeFrom="margin">
+                  <wp14:pctWidth>0</wp14:pctWidth>
+                </wp14:sizeRelH>
+              </wp:anchor>
+            </w:drawing>
+          </mc:Choice>
+          <mc:Fallback>
+            <w:pict>
+              <v:shape w14:anchorId="6A3E1CD7" id="Надпись 18" o:spid="_x0000_s1032" type="#_x0000_t202" style="position:absolute;margin-left:277pt;margin-top:374.75pt;width:201.05pt;height:.05pt;z-index:251679744;visibility:visible;mso-wrap-style:square;mso-width-percent:0;mso-wrap-distance-left:9pt;mso-wrap-distance-top:0;mso-wrap-distance-right:9pt;mso-wrap-distance-bottom:0;mso-position-horizontal:absolute;mso-position-horizontal-relative:text;mso-position-vertical:absolute;mso-position-vertical-relative:text;mso-width-percent:0;mso-width-relative:margin;v-text-anchor:top" o:gfxdata="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" stroked="f">
+                <v:textbox style="mso-fit-shape-to-text:t" inset="0,0,0,0">
+                  <w:txbxContent>
+                    <w:p>
+                      <w:pPr>
+                        <w:pStyle w:val="ac"/>
+                        <w:rPr>
+                          <w:noProof/>
+                          <w:sz w:val="20"/>
+                          <w:szCs w:val="20"/>
+                        </w:rPr>
+                      </w:pPr>
+                      <w:r>
+                        <w:rPr>
+                          <w:sz w:val="20"/>
+                          <w:szCs w:val="20"/>
+                        </w:rPr>
+                        <w:t>Карта с пожарными выходом и лестницей</w:t>
+                      </w:r>
+                    </w:p>
+                  </w:txbxContent>
+                </v:textbox>
+                <w10:wrap type="topAndBottom"/>
+              </v:shape>
+            </w:pict>
+          </mc:Fallback>
+        </mc:AlternateContent>
+      </w:r>
+      <w:r>
+        <w:rPr>
+          <w:noProof/>
+          <w:lang w:eastAsia="ru-RU"/>
+        </w:rPr>
+        <w:drawing>
+          <wp:anchor distT="0" distB="0" distL="114300" distR="114300" simplePos="0" relativeHeight="251677696" behindDoc="0" locked="0" layoutInCell="1" allowOverlap="1" wp14:anchorId="41AF5B3D" wp14:editId="01056CAD">
+            <wp:simplePos x="0" y="0"/>
+            <wp:positionH relativeFrom="margin">
+              <wp:posOffset>3397250</wp:posOffset>
+            </wp:positionH>
+            <wp:positionV relativeFrom="paragraph">
+              <wp:posOffset>0</wp:posOffset>
+            </wp:positionV>
+            <wp:extent cx="2683510" cy="4747895"/>
+            <wp:effectExtent l="0" t="0" r="2540" b="0"/>
+            <wp:wrapTopAndBottom/>
+            <wp:docPr id="17" name="Рисунок 17" descr="C:\Users\Andrey\Documents\university\year-2\semester-1\life-safety\labworks\emergencies\img\карта_с_входом.png"/>
+            <wp:cNvGraphicFramePr>
+              <a:graphicFrameLocks xmlns:a="http://schemas.openxmlformats.org/drawingml/2006/main" noChangeAspect="1"/>
+            </wp:cNvGraphicFramePr>
+            <a:graphic xmlns:a="http://schemas.openxmlformats.org/drawingml/2006/main">
+              <a:graphicData uri="http://schemas.openxmlformats.org/drawingml/2006/picture">
+                <pic:pic xmlns:pic="http://schemas.openxmlformats.org/drawingml/2006/picture">
+                  <pic:nvPicPr>
+                    <pic:cNvPr id="0" name="Picture 7" descr="C:\Users\Andrey\Documents\university\year-2\semester-1\life-safety\labworks\emergencies\img\карта_с_входом.png"/>
+                    <pic:cNvPicPr>
+                      <a:picLocks noChangeAspect="1" noChangeArrowheads="1"/>
+                    </pic:cNvPicPr>
+                  </pic:nvPicPr>
+                  <pic:blipFill>
+                    <a:blip r:embed="rId15" cstate="print">
+                      <a:extLst>
+                        <a:ext uri="{28A0092B-C50C-407E-A947-70E740481C1C}">
+                          <a14:useLocalDpi xmlns:a14="http://schemas.microsoft.com/office/drawing/2010/main" val="0"/>
+                        </a:ext>
+                      </a:extLst>
+                    </a:blip>
+                    <a:srcRect/>
+                    <a:stretch>
+                      <a:fillRect/>
+                    </a:stretch>
+                  </pic:blipFill>
+                  <pic:spPr bwMode="auto">
+                    <a:xfrm>
+                      <a:off x="0" y="0"/>
+                      <a:ext cx="2683510" cy="4747895"/>
+                    </a:xfrm>
+                    <a:prstGeom prst="rect">
+                      <a:avLst/>
+                    </a:prstGeom>
+                    <a:noFill/>
+                    <a:ln>
+                      <a:noFill/>
+                    </a:ln>
+                  </pic:spPr>
+                </pic:pic>
+              </a:graphicData>
+            </a:graphic>
+            <wp14:sizeRelH relativeFrom="margin">
+              <wp14:pctWidth>0</wp14:pctWidth>
+            </wp14:sizeRelH>
+            <wp14:sizeRelV relativeFrom="margin">
+              <wp14:pctHeight>0</wp14:pctHeight>
+            </wp14:sizeRelV>
+          </wp:anchor>
+        </w:drawing>
+      </w:r>
+      <w:r>
+        <w:rPr>
+          <w:noProof/>
+        </w:rPr>
+        <mc:AlternateContent>
+          <mc:Choice Requires="wps">
+            <w:drawing>
+              <wp:anchor distT="0" distB="0" distL="114300" distR="114300" simplePos="0" relativeHeight="251676672" behindDoc="0" locked="0" layoutInCell="1" allowOverlap="1" wp14:anchorId="2C9765E2" wp14:editId="7FEFA48C">
+                <wp:simplePos x="0" y="0"/>
+                <wp:positionH relativeFrom="column">
+                  <wp:posOffset>1042580</wp:posOffset>
+                </wp:positionH>
+                <wp:positionV relativeFrom="paragraph">
+                  <wp:posOffset>4746625</wp:posOffset>
+                </wp:positionV>
+                <wp:extent cx="1070610" cy="635"/>
+                <wp:effectExtent l="0" t="0" r="0" b="0"/>
+                <wp:wrapTopAndBottom/>
+                <wp:docPr id="16" name="Надпись 16"/>
+                <wp:cNvGraphicFramePr/>
+                <a:graphic xmlns:a="http://schemas.openxmlformats.org/drawingml/2006/main">
+                  <a:graphicData uri="http://schemas.microsoft.com/office/word/2010/wordprocessingShape">
+                    <wps:wsp>
+                      <wps:cNvSpPr txBox="1"/>
+                      <wps:spPr>
+                        <a:xfrm>
+                          <a:off x="0" y="0"/>
+                          <a:ext cx="1070610" cy="635"/>
+                        </a:xfrm>
+                        <a:prstGeom prst="rect">
+                          <a:avLst/>
+                        </a:prstGeom>
+                        <a:solidFill>
+                          <a:prstClr val="white"/>
+                        </a:solidFill>
+                        <a:ln>
+                          <a:noFill/>
+                        </a:ln>
+                        <a:effectLst/>
+                      </wps:spPr>
+                      <wps:txbx>
+                        <w:txbxContent>
+                          <w:p>
+                            <w:pPr>
+                              <w:pStyle w:val="ac"/>
+                              <w:rPr>
+                                <w:noProof/>
+                                <w:sz w:val="20"/>
+                                <w:szCs w:val="20"/>
+                              </w:rPr>
+                            </w:pPr>
+                            <w:r>
+                              <w:rPr>
+                                <w:sz w:val="20"/>
+                                <w:szCs w:val="20"/>
+                              </w:rPr>
+                              <w:t>Пожарный выход</w:t>
+                            </w:r>
+                          </w:p>
+                        </w:txbxContent>
+                      </wps:txbx>
+                      <wps:bodyPr rot="0" spcFirstLastPara="0" vertOverflow="overflow" horzOverflow="overflow" vert="horz" wrap="square" lIns="0" tIns="0" rIns="0" bIns="0" numCol="1" spcCol="0" rtlCol="0" fromWordArt="0" anchor="t" anchorCtr="0" forceAA="0" compatLnSpc="1">
+                        <a:prstTxWarp prst="textNoShape">
+                          <a:avLst/>
+                        </a:prstTxWarp>
+                        <a:spAutoFit/>
+                      </wps:bodyPr>
+                    </wps:wsp>
+                  </a:graphicData>
+                </a:graphic>
+                <wp14:sizeRelH relativeFrom="margin">
+                  <wp14:pctWidth>0</wp14:pctWidth>
+                </wp14:sizeRelH>
+              </wp:anchor>
+            </w:drawing>
+          </mc:Choice>
+          <mc:Fallback>
+            <w:pict>
+              <v:shape w14:anchorId="2C9765E2" id="Надпись 16" o:spid="_x0000_s1033" type="#_x0000_t202" style="position:absolute;margin-left:82.1pt;margin-top:373.75pt;width:84.3pt;height:.05pt;z-index:251676672;visibility:visible;mso-wrap-style:square;mso-width-percent:0;mso-wrap-distance-left:9pt;mso-wrap-distance-top:0;mso-wrap-distance-right:9pt;mso-wrap-distance-bottom:0;mso-position-horizontal:absolute;mso-position-horizontal-relative:text;mso-position-vertical:absolute;mso-position-vertical-relative:text;mso-width-percent:0;mso-width-relative:margin;v-text-anchor:top" o:gfxdata="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" stroked="f">
+                <v:textbox style="mso-fit-shape-to-text:t" inset="0,0,0,0">
+                  <w:txbxContent>
+                    <w:p>
+                      <w:pPr>
+                        <w:pStyle w:val="ac"/>
+                        <w:rPr>
+                          <w:noProof/>
+                          <w:sz w:val="20"/>
+                          <w:szCs w:val="20"/>
+                        </w:rPr>
+                      </w:pPr>
+                      <w:r>
+                        <w:rPr>
+                          <w:sz w:val="20"/>
+                          <w:szCs w:val="20"/>
+                        </w:rPr>
+                        <w:t>Пожарный выход</w:t>
+                      </w:r>
+                    </w:p>
+                  </w:txbxContent>
+                </v:textbox>
+                <w10:wrap type="topAndBottom"/>
+              </v:shape>
+            </w:pict>
+          </mc:Fallback>
+        </mc:AlternateContent>
+      </w:r>
+      <w:r>
+        <w:rPr>
+          <w:noProof/>
+        </w:rPr>
+        <mc:AlternateContent>
+          <mc:Choice Requires="wps">
+            <w:drawing>
+              <wp:anchor distT="0" distB="0" distL="114300" distR="114300" simplePos="0" relativeHeight="251674624" behindDoc="0" locked="0" layoutInCell="1" allowOverlap="1" wp14:anchorId="1153E74F" wp14:editId="298D4D32">
+                <wp:simplePos x="0" y="0"/>
+                <wp:positionH relativeFrom="column">
+                  <wp:posOffset>1969770</wp:posOffset>
+                </wp:positionH>
+                <wp:positionV relativeFrom="paragraph">
+                  <wp:posOffset>2074908</wp:posOffset>
+                </wp:positionV>
+                <wp:extent cx="1024890" cy="635"/>
+                <wp:effectExtent l="0" t="0" r="3810" b="0"/>
+                <wp:wrapTopAndBottom/>
+                <wp:docPr id="15" name="Надпись 15"/>
+                <wp:cNvGraphicFramePr/>
+                <a:graphic xmlns:a="http://schemas.openxmlformats.org/drawingml/2006/main">
+                  <a:graphicData uri="http://schemas.microsoft.com/office/word/2010/wordprocessingShape">
+                    <wps:wsp>
+                      <wps:cNvSpPr txBox="1"/>
+                      <wps:spPr>
+                        <a:xfrm>
+                          <a:off x="0" y="0"/>
+                          <a:ext cx="1024890" cy="635"/>
+                        </a:xfrm>
+                        <a:prstGeom prst="rect">
+                          <a:avLst/>
+                        </a:prstGeom>
+                        <a:solidFill>
+                          <a:prstClr val="white"/>
+                        </a:solidFill>
+                        <a:ln>
+                          <a:noFill/>
+                        </a:ln>
+                        <a:effectLst/>
+                      </wps:spPr>
+                      <wps:txbx>
+                        <w:txbxContent>
+                          <w:p>
+                            <w:pPr>
+                              <w:pStyle w:val="ac"/>
+                              <w:rPr>
+                                <w:noProof/>
+                                <w:sz w:val="20"/>
+                                <w:szCs w:val="20"/>
+                              </w:rPr>
+                            </w:pPr>
+                            <w:r>
+                              <w:rPr>
+                                <w:sz w:val="20"/>
+                                <w:szCs w:val="20"/>
+                              </w:rPr>
+                              <w:t>Чёрная лестница</w:t>
+                            </w:r>
+                          </w:p>
+                        </w:txbxContent>
+                      </wps:txbx>
+                      <wps:bodyPr rot="0" spcFirstLastPara="0" vertOverflow="overflow" horzOverflow="overflow" vert="horz" wrap="square" lIns="0" tIns="0" rIns="0" bIns="0" numCol="1" spcCol="0" rtlCol="0" fromWordArt="0" anchor="t" anchorCtr="0" forceAA="0" compatLnSpc="1">
+                        <a:prstTxWarp prst="textNoShape">
+                          <a:avLst/>
+                        </a:prstTxWarp>
+                        <a:spAutoFit/>
+                      </wps:bodyPr>
+                    </wps:wsp>
+                  </a:graphicData>
+                </a:graphic>
+                <wp14:sizeRelH relativeFrom="margin">
+                  <wp14:pctWidth>0</wp14:pctWidth>
+                </wp14:sizeRelH>
+              </wp:anchor>
+            </w:drawing>
+          </mc:Choice>
+          <mc:Fallback>
+            <w:pict>
+              <v:shape w14:anchorId="1153E74F" id="Надпись 15" o:spid="_x0000_s1034" type="#_x0000_t202" style="position:absolute;margin-left:155.1pt;margin-top:163.4pt;width:80.7pt;height:.05pt;z-index:251674624;visibility:visible;mso-wrap-style:square;mso-width-percent:0;mso-wrap-distance-left:9pt;mso-wrap-distance-top:0;mso-wrap-distance-right:9pt;mso-wrap-distance-bottom:0;mso-position-horizontal:absolute;mso-position-horizontal-relative:text;mso-position-vertical:absolute;mso-position-vertical-relative:text;mso-width-percent:0;mso-width-relative:margin;v-text-anchor:top" o:gfxdata="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" stroked="f">
+                <v:textbox style="mso-fit-shape-to-text:t" inset="0,0,0,0">
+                  <w:txbxContent>
+                    <w:p>
+                      <w:pPr>
+                        <w:pStyle w:val="ac"/>
+                        <w:rPr>
+                          <w:noProof/>
+                          <w:sz w:val="20"/>
+                          <w:szCs w:val="20"/>
+                        </w:rPr>
+                      </w:pPr>
+                      <w:r>
+                        <w:rPr>
+                          <w:sz w:val="20"/>
+                          <w:szCs w:val="20"/>
+                        </w:rPr>
+                        <w:t>Чёрная лестница</w:t>
+                      </w:r>
+                    </w:p>
+                  </w:txbxContent>
+                </v:textbox>
+                <w10:wrap type="topAndBottom"/>
+              </v:shape>
+            </w:pict>
+          </mc:Fallback>
+        </mc:AlternateContent>
+      </w:r>
+      <w:r>
+        <w:rPr>
+          <w:noProof/>
+        </w:rPr>
+        <mc:AlternateContent>
+          <mc:Choice Requires="wps">
+            <w:drawing>
+              <wp:anchor distT="0" distB="0" distL="114300" distR="114300" simplePos="0" relativeHeight="251672576" behindDoc="0" locked="0" layoutInCell="1" allowOverlap="1" wp14:anchorId="7E5C9252" wp14:editId="17DB9F66">
+                <wp:simplePos x="0" y="0"/>
+                <wp:positionH relativeFrom="margin">
+                  <wp:posOffset>25582</wp:posOffset>
+                </wp:positionH>
+                <wp:positionV relativeFrom="paragraph">
+                  <wp:posOffset>2068013</wp:posOffset>
+                </wp:positionV>
+                <wp:extent cx="1463040" cy="635"/>
+                <wp:effectExtent l="0" t="0" r="3810" b="0"/>
+                <wp:wrapTopAndBottom/>
+                <wp:docPr id="14" name="Надпись 14"/>
+                <wp:cNvGraphicFramePr/>
+                <a:graphic xmlns:a="http://schemas.openxmlformats.org/drawingml/2006/main">
+                  <a:graphicData uri="http://schemas.microsoft.com/office/word/2010/wordprocessingShape">
+                    <wps:wsp>
+                      <wps:cNvSpPr txBox="1"/>
+                      <wps:spPr>
+                        <a:xfrm>
+                          <a:off x="0" y="0"/>
+                          <a:ext cx="1463040" cy="635"/>
+                        </a:xfrm>
+                        <a:prstGeom prst="rect">
+                          <a:avLst/>
+                        </a:prstGeom>
+                        <a:solidFill>
+                          <a:prstClr val="white"/>
+                        </a:solidFill>
+                        <a:ln>
+                          <a:noFill/>
+                        </a:ln>
+                        <a:effectLst/>
+                      </wps:spPr>
+                      <wps:txbx>
+                        <w:txbxContent>
+                          <w:p>
+                            <w:pPr>
+                              <w:pStyle w:val="ac"/>
+                              <w:rPr>
+                                <w:noProof/>
+                                <w:sz w:val="20"/>
+                                <w:szCs w:val="20"/>
+                              </w:rPr>
+                            </w:pPr>
+                            <w:r>
+                              <w:rPr>
+                                <w:sz w:val="20"/>
+                                <w:szCs w:val="20"/>
+                              </w:rPr>
+                              <w:t>Вход на черную лестницу</w:t>
+                            </w:r>
+                          </w:p>
+                        </w:txbxContent>
+                      </wps:txbx>
+                      <wps:bodyPr rot="0" spcFirstLastPara="0" vertOverflow="overflow" horzOverflow="overflow" vert="horz" wrap="square" lIns="0" tIns="0" rIns="0" bIns="0" numCol="1" spcCol="0" rtlCol="0" fromWordArt="0" anchor="t" anchorCtr="0" forceAA="0" compatLnSpc="1">
+                        <a:prstTxWarp prst="textNoShape">
+                          <a:avLst/>
+                        </a:prstTxWarp>
+                        <a:spAutoFit/>
+                      </wps:bodyPr>
+                    </wps:wsp>
+                  </a:graphicData>
+                </a:graphic>
+                <wp14:sizeRelH relativeFrom="margin">
+                  <wp14:pctWidth>0</wp14:pctWidth>
+                </wp14:sizeRelH>
+              </wp:anchor>
+            </w:drawing>
+          </mc:Choice>
+          <mc:Fallback>
+            <w:pict>
+              <v:shape w14:anchorId="7E5C9252" id="Надпись 14" o:spid="_x0000_s1035" type="#_x0000_t202" style="position:absolute;margin-left:2pt;margin-top:162.85pt;width:115.2pt;height:.05pt;z-index:251672576;visibility:visible;mso-wrap-style:square;mso-width-percent:0;mso-wrap-distance-left:9pt;mso-wrap-distance-top:0;mso-wrap-distance-right:9pt;mso-wrap-distance-bottom:0;mso-position-horizontal:absolute;mso-position-horizontal-relative:margin;mso-position-vertical:absolute;mso-position-vertical-relative:text;mso-width-percent:0;mso-width-relative:margin;v-text-anchor:top" o:gfxdata="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" stroked="f">
+                <v:textbox style="mso-fit-shape-to-text:t" inset="0,0,0,0">
+                  <w:txbxContent>
+                    <w:p>
+                      <w:pPr>
+                        <w:pStyle w:val="ac"/>
+                        <w:rPr>
+                          <w:noProof/>
+                          <w:sz w:val="20"/>
+                          <w:szCs w:val="20"/>
+                        </w:rPr>
+                      </w:pPr>
+                      <w:r>
+                        <w:rPr>
+                          <w:sz w:val="20"/>
+                          <w:szCs w:val="20"/>
+                        </w:rPr>
+                        <w:t>Вход на черную лестницу</w:t>
+                      </w:r>
+                    </w:p>
+                  </w:txbxContent>
+                </v:textbox>
+                <w10:wrap type="topAndBottom" anchorx="margin"/>
+              </v:shape>
+            </w:pict>
+          </mc:Fallback>
+        </mc:AlternateContent>
+      </w:r>
+      <w:r>
+        <w:rPr>
+          <w:noProof/>
+          <w:lang w:eastAsia="ru-RU"/>
+        </w:rPr>
+        <w:drawing>
+          <wp:anchor distT="0" distB="0" distL="114300" distR="114300" simplePos="0" relativeHeight="251668480" behindDoc="0" locked="0" layoutInCell="1" allowOverlap="1" wp14:anchorId="61FEC33D" wp14:editId="57A58F15">
+            <wp:simplePos x="0" y="0"/>
+            <wp:positionH relativeFrom="page">
+              <wp:posOffset>2775313</wp:posOffset>
+            </wp:positionH>
+            <wp:positionV relativeFrom="paragraph">
+              <wp:posOffset>0</wp:posOffset>
+            </wp:positionV>
+            <wp:extent cx="1538523" cy="2052000"/>
+            <wp:effectExtent l="0" t="0" r="5080" b="5715"/>
+            <wp:wrapTopAndBottom/>
+            <wp:docPr id="10" name="Рисунок 10" descr="C:\Users\Andrey\Documents\university\year-2\semester-1\life-safety\labworks\emergencies\img\черная_лестница.jpg"/>
+            <wp:cNvGraphicFramePr>
+              <a:graphicFrameLocks xmlns:a="http://schemas.openxmlformats.org/drawingml/2006/main" noChangeAspect="1"/>
+            </wp:cNvGraphicFramePr>
+            <a:graphic xmlns:a="http://schemas.openxmlformats.org/drawingml/2006/main">
+              <a:graphicData uri="http://schemas.openxmlformats.org/drawingml/2006/picture">
+                <pic:pic xmlns:pic="http://schemas.openxmlformats.org/drawingml/2006/picture">
+                  <pic:nvPicPr>
+                    <pic:cNvPr id="0" name="Picture 4" descr="C:\Users\Andrey\Documents\university\year-2\semester-1\life-safety\labworks\emergencies\img\черная_лестница.jpg"/>
+                    <pic:cNvPicPr>
+                      <a:picLocks noChangeAspect="1" noChangeArrowheads="1"/>
+                    </pic:cNvPicPr>
+                  </pic:nvPicPr>
+                  <pic:blipFill>
+                    <a:blip r:embed="rId16" cstate="print">
+                      <a:extLst>
+                        <a:ext uri="{28A0092B-C50C-407E-A947-70E740481C1C}">
+                          <a14:useLocalDpi xmlns:a14="http://schemas.microsoft.com/office/drawing/2010/main" val="0"/>
+                        </a:ext>
+                      </a:extLst>
+                    </a:blip>
+                    <a:srcRect/>
+                    <a:stretch>
+                      <a:fillRect/>
+                    </a:stretch>
+                  </pic:blipFill>
+                  <pic:spPr bwMode="auto">
+                    <a:xfrm>
+                      <a:off x="0" y="0"/>
+                      <a:ext cx="1538523" cy="2052000"/>
+                    </a:xfrm>
+                    <a:prstGeom prst="rect">
+                      <a:avLst/>
+                    </a:prstGeom>
+                    <a:noFill/>
+                    <a:ln>
+                      <a:noFill/>
+                    </a:ln>
+                  </pic:spPr>
+                </pic:pic>
+              </a:graphicData>
+            </a:graphic>
+            <wp14:sizeRelH relativeFrom="margin">
+              <wp14:pctWidth>0</wp14:pctWidth>
+            </wp14:sizeRelH>
+            <wp14:sizeRelV relativeFrom="margin">
+              <wp14:pctHeight>0</wp14:pctHeight>
+            </wp14:sizeRelV>
+          </wp:anchor>
+        </w:drawing>
+      </w:r>
+      <w:r>
+        <w:rPr>
+          <w:noProof/>
+          <w:lang w:eastAsia="ru-RU"/>
+        </w:rPr>
+        <w:drawing>
+          <wp:anchor distT="0" distB="0" distL="114300" distR="114300" simplePos="0" relativeHeight="251670528" behindDoc="0" locked="0" layoutInCell="1" allowOverlap="1" wp14:anchorId="3DB29370" wp14:editId="42FA5B79">
+            <wp:simplePos x="0" y="0"/>
+            <wp:positionH relativeFrom="column">
+              <wp:posOffset>748121</wp:posOffset>
+            </wp:positionH>
+            <wp:positionV relativeFrom="paragraph">
+              <wp:posOffset>2579007</wp:posOffset>
+            </wp:positionV>
+            <wp:extent cx="1619747" cy="2160000"/>
+            <wp:effectExtent l="0" t="0" r="0" b="0"/>
+            <wp:wrapTopAndBottom/>
+            <wp:docPr id="13" name="Рисунок 13" descr="C:\Users\Andrey\Documents\university\year-2\semester-1\life-safety\labworks\emergencies\img\пожарный_выход.jpg"/>
+            <wp:cNvGraphicFramePr>
+              <a:graphicFrameLocks xmlns:a="http://schemas.openxmlformats.org/drawingml/2006/main" noChangeAspect="1"/>
+            </wp:cNvGraphicFramePr>
+            <a:graphic xmlns:a="http://schemas.openxmlformats.org/drawingml/2006/main">
+              <a:graphicData uri="http://schemas.openxmlformats.org/drawingml/2006/picture">
+                <pic:pic xmlns:pic="http://schemas.openxmlformats.org/drawingml/2006/picture">
+                  <pic:nvPicPr>
+                    <pic:cNvPr id="0" name="Picture 6" descr="C:\Users\Andrey\Documents\university\year-2\semester-1\life-safety\labworks\emergencies\img\пожарный_выход.jpg"/>
+                    <pic:cNvPicPr>
+                      <a:picLocks noChangeAspect="1" noChangeArrowheads="1"/>
+                    </pic:cNvPicPr>
+                  </pic:nvPicPr>
+                  <pic:blipFill>
+                    <a:blip r:embed="rId17" cstate="print">
+                      <a:extLst>
+                        <a:ext uri="{28A0092B-C50C-407E-A947-70E740481C1C}">
+                          <a14:useLocalDpi xmlns:a14="http://schemas.microsoft.com/office/drawing/2010/main" val="0"/>
+                        </a:ext>
+                      </a:extLst>
+                    </a:blip>
+                    <a:srcRect/>
+                    <a:stretch>
+                      <a:fillRect/>
+                    </a:stretch>
+                  </pic:blipFill>
+                  <pic:spPr bwMode="auto">
+                    <a:xfrm>
+                      <a:off x="0" y="0"/>
+                      <a:ext cx="1619747" cy="2160000"/>
+                    </a:xfrm>
+                    <a:prstGeom prst="rect">
+                      <a:avLst/>
+                    </a:prstGeom>
+                    <a:noFill/>
+                    <a:ln>
+                      <a:noFill/>
+                    </a:ln>
+                  </pic:spPr>
+                </pic:pic>
+              </a:graphicData>
+            </a:graphic>
+            <wp14:sizeRelH relativeFrom="margin">
+              <wp14:pctWidth>0</wp14:pctWidth>
+            </wp14:sizeRelH>
+            <wp14:sizeRelV relativeFrom="margin">
+              <wp14:pctHeight>0</wp14:pctHeight>
+            </wp14:sizeRelV>
+          </wp:anchor>
+        </w:drawing>
+      </w:r>
+      <w:r>
+        <w:rPr>
+          <w:noProof/>
+          <w:lang w:eastAsia="ru-RU"/>
+        </w:rPr>
+        <w:drawing>
+          <wp:anchor distT="0" distB="0" distL="114300" distR="114300" simplePos="0" relativeHeight="251667456" behindDoc="0" locked="0" layoutInCell="1" allowOverlap="1" wp14:anchorId="36D4F4BC" wp14:editId="69C4AC51">
+            <wp:simplePos x="0" y="0"/>
+            <wp:positionH relativeFrom="margin">
+              <wp:align>left</wp:align>
+            </wp:positionH>
+            <wp:positionV relativeFrom="paragraph">
+              <wp:posOffset>0</wp:posOffset>
+            </wp:positionV>
+            <wp:extent cx="1538194" cy="2052000"/>
+            <wp:effectExtent l="0" t="0" r="5080" b="5715"/>
+            <wp:wrapTopAndBottom/>
+            <wp:docPr id="11" name="Рисунок 11" descr="C:\Users\Andrey\Documents\university\year-2\semester-1\life-safety\labworks\emergencies\img\вход_к_пожарной_лестнице.jpg"/>
+            <wp:cNvGraphicFramePr>
+              <a:graphicFrameLocks xmlns:a="http://schemas.openxmlformats.org/drawingml/2006/main" noChangeAspect="1"/>
+            </wp:cNvGraphicFramePr>
+            <a:graphic xmlns:a="http://schemas.openxmlformats.org/drawingml/2006/main">
+              <a:graphicData uri="http://schemas.openxmlformats.org/drawingml/2006/picture">
+                <pic:pic xmlns:pic="http://schemas.openxmlformats.org/drawingml/2006/picture">
+                  <pic:nvPicPr>
+                    <pic:cNvPr id="0" name="Picture 5" descr="C:\Users\Andrey\Documents\university\year-2\semester-1\life-safety\labworks\emergencies\img\вход_к_пожарной_лестнице.jpg"/>
+                    <pic:cNvPicPr>
+                      <a:picLocks noChangeAspect="1" noChangeArrowheads="1"/>
+                    </pic:cNvPicPr>
+                  </pic:nvPicPr>
+                  <pic:blipFill>
+                    <a:blip r:embed="rId18" cstate="print">
+                      <a:extLst>
+                        <a:ext uri="{28A0092B-C50C-407E-A947-70E740481C1C}">
+                          <a14:useLocalDpi xmlns:a14="http://schemas.microsoft.com/office/drawing/2010/main" val="0"/>
+                        </a:ext>
+                      </a:extLst>
+                    </a:blip>
+                    <a:srcRect/>
+                    <a:stretch>
+                      <a:fillRect/>
+                    </a:stretch>
+                  </pic:blipFill>
+                  <pic:spPr bwMode="auto">
+                    <a:xfrm>
+                      <a:off x="0" y="0"/>
+                      <a:ext cx="1538194" cy="2052000"/>
+                    </a:xfrm>
+                    <a:prstGeom prst="rect">
+                      <a:avLst/>
+                    </a:prstGeom>
+                    <a:noFill/>
+                    <a:ln>
+                      <a:noFill/>
+                    </a:ln>
+                  </pic:spPr>
+                </pic:pic>
+              </a:graphicData>
+            </a:graphic>
+            <wp14:sizeRelH relativeFrom="margin">
+              <wp14:pctWidth>0</wp14:pctWidth>
+            </wp14:sizeRelH>
+            <wp14:sizeRelV relativeFrom="margin">
+              <wp14:pctHeight>0</wp14:pctHeight>
+            </wp14:sizeRelV>
+          </wp:anchor>
+        </w:drawing>
+      </w:r>
+      <w:r>
+        <w:br w:type="page"/>
+      </w:r>
+      <w:r>
+        <w:lastRenderedPageBreak/>
+        <w:pict w14:anchorId="0CB52B84">
+          <v:shapetype id="_x0000_t75" coordsize="21600,21600" o:spt="75" o:preferrelative="t" path="m@4@5l@4@11@9@11@9@5xe" filled="f" stroked="f">
+            <v:stroke joinstyle="miter"/>
+            <v:formulas>
+              <v:f eqn="if lineDrawn pixelLineWidth 0"/>
+              <v:f eqn="sum @0 1 0"/>
+              <v:f eqn="sum 0 0 @1"/>
+              <v:f eqn="prod @2 1 2"/>
+              <v:f eqn="prod @3 21600 pixelWidth"/>
+              <v:f eqn="prod @3 21600 pixelHeight"/>
+              <v:f eqn="sum @0 0 1"/>
+              <v:f eqn="prod @6 1 2"/>
+              <v:f eqn="prod @7 21600 pixelWidth"/>
+              <v:f eqn="sum @8 21600 0"/>
+              <v:f eqn="prod @7 21600 pixelHeight"/>
+              <v:f eqn="sum @10 21600 0"/>
+            </v:formulas>
+            <v:path o:extrusionok="f" gradientshapeok="t" o:connecttype="rect"/>
+            <o:lock v:ext="edit" aspectratio="t"/>
+          </v:shapetype>
+          <v:shape id="_x0000_i1025" type="#_x0000_t75" style="width:453.05pt;height:263.15pt">
+            <v:imagedata r:id="rId19" o:title="карта_дом_пг_проезд"/>
+          </v:shape>
+        </w:pict>
+      </w:r>
+    </w:p>
+    <w:p>
+      <w:pPr>
+        <w:pStyle w:val="ac"/>
+        <w:rPr>
+          <w:sz w:val="20"/>
+          <w:szCs w:val="20"/>
+        </w:rPr>
+      </w:pPr>
+      <w:r>
+        <w:rPr>
+          <w:sz w:val="20"/>
+          <w:szCs w:val="20"/>
+        </w:rPr>
+        <w:t>Карта местности у дома</w:t>
       </w:r>
     </w:p>
     <w:p>
@@ -4470,81 +6386,45 @@
         <w:rPr>
           <w:b/>
         </w:rPr>
-        <w:t>Пункт 3.3.</w:t>
+        <w:t>Выводы по лабораторной работе:</w:t>
       </w:r>
     </w:p>
     <w:p>
-      <w:pPr>
-        <w:spacing w:line="276" w:lineRule="auto"/>
-        <w:jc w:val="both"/>
-      </w:pPr>
-      <w:r>
-        <w:t>Сфотографируйте расположение пожарных выходов, черных лестниц в вашем подъезде, доме.</w:t>
+      <w:r>
+        <w:t>В ходе работы я оценил основные риски по месту проживания и собрал контакты служб, которые могут понадобиться в эк</w:t>
+      </w:r>
+      <w:r>
+        <w:t>стренной ситуации. Для города Кудрово наиболее вероятны сильный ветер, снегопады, транспортные происшествия и аварии на коммунальных сетях. В самом доме главными рисками остаются пожар, задымление, залив квартиры и отключение коммунальных ресурсов.</w:t>
       </w:r>
     </w:p>
     <w:p>
-      <w:pPr>
-        <w:spacing w:line="276" w:lineRule="auto"/>
-        <w:jc w:val="both"/>
-      </w:pPr>
-      <w:r>
-        <w:t>Сфотографируйте ближайший пожарный проезд к Вашему дому и подъезду, расположение пожарного гидранта.</w:t>
+      <w:r>
+        <w:t>Наиболе</w:t>
+      </w:r>
+      <w:r>
+        <w:t>е полезной оказалась проверка реальных контактов поликлиники, травмпункта, больниц, МЧС, управляющей компании и аварийных служб. Теперь понятно, куда обращаться в зависимости от ситуации, а не искать номера уже после происшествия. Отдельно проверены данные</w:t>
+      </w:r>
+      <w:r>
+        <w:t xml:space="preserve"> о качестве воздуха: в районе фиксировались отдельные превышения по оксиду азота, при этом для диоксида азота и оксида углерода превышений за рассматриваемый период не зарегистрировано.</w:t>
       </w:r>
     </w:p>
     <w:p>
-      <w:pPr>
-        <w:spacing w:line="276" w:lineRule="auto"/>
-        <w:jc w:val="both"/>
-      </w:pPr>
-      <w:r>
-        <w:t>Обозначьте на фрагменте карты города ваш дом и местоположение перечисленных объектов. Приложите сделанные фотографии к отчету.</w:t>
-      </w:r>
-    </w:p>
-    <w:p>
-      <w:r>
-        <w:br w:type="page"/>
-      </w:r>
-    </w:p>
-    <w:p>
-      <w:pPr>
-        <w:spacing w:line="276" w:lineRule="auto"/>
-        <w:jc w:val="both"/>
-      </w:pPr>
-    </w:p>
-    <w:p>
-      <w:pPr>
-        <w:spacing w:line="276" w:lineRule="auto"/>
-        <w:jc w:val="both"/>
-        <w:rPr>
-          <w:b/>
-        </w:rPr>
-      </w:pPr>
-      <w:r>
-        <w:rPr>
-          <w:b/>
-        </w:rPr>
-        <w:t>Выводы по лабораторной работе:</w:t>
-      </w:r>
-    </w:p>
-    <w:p>
-      <w:r>
-        <w:t>В ходе работы я оценил основные риски по месту проживания и собрал контакты служб, которые могут понадобиться в экстренной ситуации. Для города Кудрово наиболее вероятны сильный ветер, снегопады, транспортные происшествия и аварии на коммунальных сетях. В самом доме главными рисками остаются пожар, задымление, залив квартиры и отключение коммунальных ресурсов.</w:t>
-      </w:r>
-    </w:p>
-    <w:p>
-      <w:r>
-        <w:t>Наиболее полезной оказалась проверка реальных контактов поликлиники, травмпункта, больниц, МЧС, управляющей компании и аварийных служб. Теперь понятно, куда обращаться в зависимости от ситуации, а не искать номера уже после происшествия. Отдельно проверены данные о качестве воздуха: в районе фиксировались отдельные превышения по оксиду азота, при этом для диоксида азота и оксида углерода превышений за рассматриваемый период не зарегистрировано.</w:t>
-      </w:r>
-    </w:p>
-    <w:p>
-      <w:r>
-        <w:t>До выполнения работы меньше внимания уделялось пожарной безопасности квартиры и состоянию путей эвакуации. После анализа рисков были определены места отключения воды и электричества, проверены номера экстренных служб, установлен автономный пожарный извещатель. В дальнейшем нужно поддерживать аптечку в актуальном состоянии, приобрести огнетушитель в квартиру, не загромождать выход и дополнить список контактами обслуживающих организаций.</w:t>
-      </w:r>
+      <w:r>
+        <w:t>До выполнения работы меньше внимания уделялось пожарной безопасности к</w:t>
+      </w:r>
+      <w:r>
+        <w:t>вартиры и состоянию путей эвакуации. После анализа рисков были определены места отключения воды и электричества, проверены номера экстренных служб, установлен автономный пожарный извещатель. В дальнейшем нужно поддерживать аптечку в актуальном состоянии, п</w:t>
+      </w:r>
+      <w:r>
+        <w:t>риобрести огнетушитель в квартиру, не загромождать выход и дополнить список контактами обслуживающих организаций.</w:t>
+      </w:r>
+      <w:bookmarkStart w:id="0" w:name="_GoBack"/>
+      <w:bookmarkEnd w:id="0"/>
     </w:p>
     <w:sectPr>
-      <w:footerReference w:type="even" r:id="rId10"/>
-      <w:footerReference w:type="default" r:id="rId11"/>
-      <w:footerReference w:type="first" r:id="rId12"/>
+      <w:footerReference w:type="even" r:id="rId20"/>
+      <w:footerReference w:type="default" r:id="rId21"/>
+      <w:footerReference w:type="first" r:id="rId22"/>
       <w:pgSz w:w="11906" w:h="16838"/>
       <w:pgMar w:top="1134" w:right="1134" w:bottom="1134" w:left="1701" w:header="0" w:footer="709" w:gutter="0"/>
       <w:cols w:space="720"/>
@@ -4557,7 +6437,7 @@
 </file>
 
 <file path=word/endnotes.xml><?xml version="1.0" encoding="utf-8"?>
-<w:endnotes xmlns:wpc="http://schemas.microsoft.com/office/word/2010/wordprocessingCanvas" xmlns:cx="http://schemas.microsoft.com/office/drawing/2014/chartex" xmlns:cx1="http://schemas.microsoft.com/office/drawing/2015/9/8/chartex" xmlns:cx2="http://schemas.microsoft.com/office/drawing/2015/10/21/chartex" xmlns:cx3="http://schemas.microsoft.com/office/drawing/2016/5/9/chartex" xmlns:cx4="http://schemas.microsoft.com/office/drawing/2016/5/10/chartex" xmlns:cx5="http://schemas.microsoft.com/office/drawing/2016/5/11/chartex" xmlns:cx6="http://schemas.microsoft.com/office/drawing/2016/5/12/chartex" xmlns:cx7="http://schemas.microsoft.com/office/drawing/2016/5/13/chartex" xmlns:cx8="http://schemas.microsoft.com/office/drawing/2016/5/14/chartex" xmlns:mc="http://schemas.openxmlformats.org/markup-compatibility/2006" xmlns:aink="http://schemas.microsoft.com/office/drawing/2016/ink" xmlns:am3d="http://schemas.microsoft.com/office/drawing/2017/model3d" xmlns:o="urn:schemas-microsoft-com:office:office" xmlns:oel="http://schemas.microsoft.com/office/2019/extlst" xmlns:r="http://schemas.openxmlformats.org/officeDocument/2006/relationships" xmlns:m="http://schemas.openxmlformats.org/officeDocument/2006/math" xmlns:v="urn:schemas-microsoft-com:vml" xmlns:wp14="http://schemas.microsoft.com/office/word/2010/wordprocessingDrawing" xmlns:wp="http://schemas.openxmlformats.org/drawingml/2006/wordprocessingDrawing" xmlns:w10="urn:schemas-microsoft-com:office:word" xmlns:w="http://schemas.openxmlformats.org/wordprocessingml/2006/main" xmlns:w14="http://schemas.microsoft.com/office/word/2010/wordml" xmlns:w15="http://schemas.microsoft.com/office/word/2012/wordml" xmlns:w16cex="http://schemas.microsoft.com/office/word/2018/wordml/cex" xmlns:w16cid="http://schemas.microsoft.com/office/word/2016/wordml/cid" xmlns:w16="http://schemas.microsoft.com/office/word/2018/wordml" xmlns:w16du="http://schemas.microsoft.com/office/word/2023/wordml/word16du" xmlns:w16sdtdh="http://schemas.microsoft.com/office/word/2020/wordml/sdtdatahash" xmlns:w16sdtfl="http://schemas.microsoft.com/office/word/2024/wordml/sdtformatlock" xmlns:w16se="http://schemas.microsoft.com/office/word/2015/wordml/symex" xmlns:wpg="http://schemas.microsoft.com/office/word/2010/wordprocessingGroup" xmlns:wpi="http://schemas.microsoft.com/office/word/2010/wordprocessingInk" xmlns:wne="http://schemas.microsoft.com/office/word/2006/wordml" xmlns:wps="http://schemas.microsoft.com/office/word/2010/wordprocessingShape" mc:Ignorable="w14 w15 w16se w16cid w16 w16cex w16sdtdh w16sdtfl w16du wp14">
+<w:endnotes xmlns:wpc="http://schemas.microsoft.com/office/word/2010/wordprocessingCanvas" xmlns:mc="http://schemas.openxmlformats.org/markup-compatibility/2006" xmlns:o="urn:schemas-microsoft-com:office:office" xmlns:r="http://schemas.openxmlformats.org/officeDocument/2006/relationships" xmlns:m="http://schemas.openxmlformats.org/officeDocument/2006/math" xmlns:v="urn:schemas-microsoft-com:vml" xmlns:wp14="http://schemas.microsoft.com/office/word/2010/wordprocessingDrawing" xmlns:wp="http://schemas.openxmlformats.org/drawingml/2006/wordprocessingDrawing" xmlns:w10="urn:schemas-microsoft-com:office:word" xmlns:w="http://schemas.openxmlformats.org/wordprocessingml/2006/main" xmlns:w14="http://schemas.microsoft.com/office/word/2010/wordml" xmlns:w15="http://schemas.microsoft.com/office/word/2012/wordml" xmlns:wpg="http://schemas.microsoft.com/office/word/2010/wordprocessingGroup" xmlns:wpi="http://schemas.microsoft.com/office/word/2010/wordprocessingInk" xmlns:wne="http://schemas.microsoft.com/office/word/2006/wordml" xmlns:wps="http://schemas.microsoft.com/office/word/2010/wordprocessingShape" mc:Ignorable="w14 w15 wp14">
   <w:endnote w:type="separator" w:id="-1">
     <w:p>
       <w:pPr>
@@ -4582,7 +6462,7 @@
 </file>
 
 <file path=word/footer1.xml><?xml version="1.0" encoding="utf-8"?>
-<w:ftr xmlns:wpc="http://schemas.microsoft.com/office/word/2010/wordprocessingCanvas" xmlns:cx="http://schemas.microsoft.com/office/drawing/2014/chartex" xmlns:cx1="http://schemas.microsoft.com/office/drawing/2015/9/8/chartex" xmlns:cx2="http://schemas.microsoft.com/office/drawing/2015/10/21/chartex" xmlns:cx3="http://schemas.microsoft.com/office/drawing/2016/5/9/chartex" xmlns:cx4="http://schemas.microsoft.com/office/drawing/2016/5/10/chartex" xmlns:cx5="http://schemas.microsoft.com/office/drawing/2016/5/11/chartex" xmlns:cx6="http://schemas.microsoft.com/office/drawing/2016/5/12/chartex" xmlns:cx7="http://schemas.microsoft.com/office/drawing/2016/5/13/chartex" xmlns:cx8="http://schemas.microsoft.com/office/drawing/2016/5/14/chartex" xmlns:mc="http://schemas.openxmlformats.org/markup-compatibility/2006" xmlns:aink="http://schemas.microsoft.com/office/drawing/2016/ink" xmlns:am3d="http://schemas.microsoft.com/office/drawing/2017/model3d" xmlns:o="urn:schemas-microsoft-com:office:office" xmlns:oel="http://schemas.microsoft.com/office/2019/extlst" xmlns:r="http://schemas.openxmlformats.org/officeDocument/2006/relationships" xmlns:m="http://schemas.openxmlformats.org/officeDocument/2006/math" xmlns:v="urn:schemas-microsoft-com:vml" xmlns:wp14="http://schemas.microsoft.com/office/word/2010/wordprocessingDrawing" xmlns:wp="http://schemas.openxmlformats.org/drawingml/2006/wordprocessingDrawing" xmlns:w10="urn:schemas-microsoft-com:office:word" xmlns:w="http://schemas.openxmlformats.org/wordprocessingml/2006/main" xmlns:w14="http://schemas.microsoft.com/office/word/2010/wordml" xmlns:w15="http://schemas.microsoft.com/office/word/2012/wordml" xmlns:w16cex="http://schemas.microsoft.com/office/word/2018/wordml/cex" xmlns:w16cid="http://schemas.microsoft.com/office/word/2016/wordml/cid" xmlns:w16="http://schemas.microsoft.com/office/word/2018/wordml" xmlns:w16du="http://schemas.microsoft.com/office/word/2023/wordml/word16du" xmlns:w16sdtdh="http://schemas.microsoft.com/office/word/2020/wordml/sdtdatahash" xmlns:w16sdtfl="http://schemas.microsoft.com/office/word/2024/wordml/sdtformatlock" xmlns:w16se="http://schemas.microsoft.com/office/word/2015/wordml/symex" xmlns:wpg="http://schemas.microsoft.com/office/word/2010/wordprocessingGroup" xmlns:wpi="http://schemas.microsoft.com/office/word/2010/wordprocessingInk" xmlns:wne="http://schemas.microsoft.com/office/word/2006/wordml" xmlns:wps="http://schemas.microsoft.com/office/word/2010/wordprocessingShape" mc:Ignorable="w14 w15 w16se w16cid w16 w16cex w16sdtdh w16sdtfl w16du wp14">
+<w:ftr xmlns:wpc="http://schemas.microsoft.com/office/word/2010/wordprocessingCanvas" xmlns:mc="http://schemas.openxmlformats.org/markup-compatibility/2006" xmlns:o="urn:schemas-microsoft-com:office:office" xmlns:r="http://schemas.openxmlformats.org/officeDocument/2006/relationships" xmlns:m="http://schemas.openxmlformats.org/officeDocument/2006/math" xmlns:v="urn:schemas-microsoft-com:vml" xmlns:wp14="http://schemas.microsoft.com/office/word/2010/wordprocessingDrawing" xmlns:wp="http://schemas.openxmlformats.org/drawingml/2006/wordprocessingDrawing" xmlns:w10="urn:schemas-microsoft-com:office:word" xmlns:w="http://schemas.openxmlformats.org/wordprocessingml/2006/main" xmlns:w14="http://schemas.microsoft.com/office/word/2010/wordml" xmlns:w15="http://schemas.microsoft.com/office/word/2012/wordml" xmlns:wpg="http://schemas.microsoft.com/office/word/2010/wordprocessingGroup" xmlns:wpi="http://schemas.microsoft.com/office/word/2010/wordprocessingInk" xmlns:wne="http://schemas.microsoft.com/office/word/2006/wordml" xmlns:wps="http://schemas.microsoft.com/office/word/2010/wordprocessingShape" mc:Ignorable="w14 w15 wp14">
   <w:p>
     <w:pPr>
       <w:pStyle w:val="a6"/>
@@ -4592,7 +6472,7 @@
 </file>
 
 <file path=word/footer2.xml><?xml version="1.0" encoding="utf-8"?>
-<w:ftr xmlns:wpc="http://schemas.microsoft.com/office/word/2010/wordprocessingCanvas" xmlns:cx="http://schemas.microsoft.com/office/drawing/2014/chartex" xmlns:cx1="http://schemas.microsoft.com/office/drawing/2015/9/8/chartex" xmlns:cx2="http://schemas.microsoft.com/office/drawing/2015/10/21/chartex" xmlns:cx3="http://schemas.microsoft.com/office/drawing/2016/5/9/chartex" xmlns:cx4="http://schemas.microsoft.com/office/drawing/2016/5/10/chartex" xmlns:cx5="http://schemas.microsoft.com/office/drawing/2016/5/11/chartex" xmlns:cx6="http://schemas.microsoft.com/office/drawing/2016/5/12/chartex" xmlns:cx7="http://schemas.microsoft.com/office/drawing/2016/5/13/chartex" xmlns:cx8="http://schemas.microsoft.com/office/drawing/2016/5/14/chartex" xmlns:mc="http://schemas.openxmlformats.org/markup-compatibility/2006" xmlns:aink="http://schemas.microsoft.com/office/drawing/2016/ink" xmlns:am3d="http://schemas.microsoft.com/office/drawing/2017/model3d" xmlns:o="urn:schemas-microsoft-com:office:office" xmlns:oel="http://schemas.microsoft.com/office/2019/extlst" xmlns:r="http://schemas.openxmlformats.org/officeDocument/2006/relationships" xmlns:m="http://schemas.openxmlformats.org/officeDocument/2006/math" xmlns:v="urn:schemas-microsoft-com:vml" xmlns:wp14="http://schemas.microsoft.com/office/word/2010/wordprocessingDrawing" xmlns:wp="http://schemas.openxmlformats.org/drawingml/2006/wordprocessingDrawing" xmlns:w10="urn:schemas-microsoft-com:office:word" xmlns:w="http://schemas.openxmlformats.org/wordprocessingml/2006/main" xmlns:w14="http://schemas.microsoft.com/office/word/2010/wordml" xmlns:w15="http://schemas.microsoft.com/office/word/2012/wordml" xmlns:w16cex="http://schemas.microsoft.com/office/word/2018/wordml/cex" xmlns:w16cid="http://schemas.microsoft.com/office/word/2016/wordml/cid" xmlns:w16="http://schemas.microsoft.com/office/word/2018/wordml" xmlns:w16du="http://schemas.microsoft.com/office/word/2023/wordml/word16du" xmlns:w16sdtdh="http://schemas.microsoft.com/office/word/2020/wordml/sdtdatahash" xmlns:w16sdtfl="http://schemas.microsoft.com/office/word/2024/wordml/sdtformatlock" xmlns:w16se="http://schemas.microsoft.com/office/word/2015/wordml/symex" xmlns:wpg="http://schemas.microsoft.com/office/word/2010/wordprocessingGroup" xmlns:wpi="http://schemas.microsoft.com/office/word/2010/wordprocessingInk" xmlns:wne="http://schemas.microsoft.com/office/word/2006/wordml" xmlns:wps="http://schemas.microsoft.com/office/word/2010/wordprocessingShape" mc:Ignorable="w14 w15 w16se w16cid w16 w16cex w16sdtdh w16sdtfl w16du wp14">
+<w:ftr xmlns:wpc="http://schemas.microsoft.com/office/word/2010/wordprocessingCanvas" xmlns:mc="http://schemas.openxmlformats.org/markup-compatibility/2006" xmlns:o="urn:schemas-microsoft-com:office:office" xmlns:r="http://schemas.openxmlformats.org/officeDocument/2006/relationships" xmlns:m="http://schemas.openxmlformats.org/officeDocument/2006/math" xmlns:v="urn:schemas-microsoft-com:vml" xmlns:wp14="http://schemas.microsoft.com/office/word/2010/wordprocessingDrawing" xmlns:wp="http://schemas.openxmlformats.org/drawingml/2006/wordprocessingDrawing" xmlns:w10="urn:schemas-microsoft-com:office:word" xmlns:w="http://schemas.openxmlformats.org/wordprocessingml/2006/main" xmlns:w14="http://schemas.microsoft.com/office/word/2010/wordml" xmlns:w15="http://schemas.microsoft.com/office/word/2012/wordml" xmlns:wpg="http://schemas.microsoft.com/office/word/2010/wordprocessingGroup" xmlns:wpi="http://schemas.microsoft.com/office/word/2010/wordprocessingInk" xmlns:wne="http://schemas.microsoft.com/office/word/2006/wordml" xmlns:wps="http://schemas.microsoft.com/office/word/2010/wordprocessingShape" mc:Ignorable="w14 w15 wp14">
   <w:sdt>
     <w:sdtPr>
       <w:id w:val="-712810182"/>
@@ -4601,6 +6481,7 @@
         <w:docPartUnique/>
       </w:docPartObj>
     </w:sdtPr>
+    <w:sdtEndPr/>
     <w:sdtContent>
       <w:p>
         <w:pPr>
@@ -4623,7 +6504,10 @@
           <w:fldChar w:fldCharType="separate"/>
         </w:r>
         <w:r>
-          <w:t>9</w:t>
+          <w:rPr>
+            <w:noProof/>
+          </w:rPr>
+          <w:t>10</w:t>
         </w:r>
         <w:r>
           <w:fldChar w:fldCharType="end"/>
@@ -4646,7 +6530,7 @@
 </file>
 
 <file path=word/footer3.xml><?xml version="1.0" encoding="utf-8"?>
-<w:ftr xmlns:wpc="http://schemas.microsoft.com/office/word/2010/wordprocessingCanvas" xmlns:cx="http://schemas.microsoft.com/office/drawing/2014/chartex" xmlns:cx1="http://schemas.microsoft.com/office/drawing/2015/9/8/chartex" xmlns:cx2="http://schemas.microsoft.com/office/drawing/2015/10/21/chartex" xmlns:cx3="http://schemas.microsoft.com/office/drawing/2016/5/9/chartex" xmlns:cx4="http://schemas.microsoft.com/office/drawing/2016/5/10/chartex" xmlns:cx5="http://schemas.microsoft.com/office/drawing/2016/5/11/chartex" xmlns:cx6="http://schemas.microsoft.com/office/drawing/2016/5/12/chartex" xmlns:cx7="http://schemas.microsoft.com/office/drawing/2016/5/13/chartex" xmlns:cx8="http://schemas.microsoft.com/office/drawing/2016/5/14/chartex" xmlns:mc="http://schemas.openxmlformats.org/markup-compatibility/2006" xmlns:aink="http://schemas.microsoft.com/office/drawing/2016/ink" xmlns:am3d="http://schemas.microsoft.com/office/drawing/2017/model3d" xmlns:o="urn:schemas-microsoft-com:office:office" xmlns:oel="http://schemas.microsoft.com/office/2019/extlst" xmlns:r="http://schemas.openxmlformats.org/officeDocument/2006/relationships" xmlns:m="http://schemas.openxmlformats.org/officeDocument/2006/math" xmlns:v="urn:schemas-microsoft-com:vml" xmlns:wp14="http://schemas.microsoft.com/office/word/2010/wordprocessingDrawing" xmlns:wp="http://schemas.openxmlformats.org/drawingml/2006/wordprocessingDrawing" xmlns:w10="urn:schemas-microsoft-com:office:word" xmlns:w="http://schemas.openxmlformats.org/wordprocessingml/2006/main" xmlns:w14="http://schemas.microsoft.com/office/word/2010/wordml" xmlns:w15="http://schemas.microsoft.com/office/word/2012/wordml" xmlns:w16cex="http://schemas.microsoft.com/office/word/2018/wordml/cex" xmlns:w16cid="http://schemas.microsoft.com/office/word/2016/wordml/cid" xmlns:w16="http://schemas.microsoft.com/office/word/2018/wordml" xmlns:w16du="http://schemas.microsoft.com/office/word/2023/wordml/word16du" xmlns:w16sdtdh="http://schemas.microsoft.com/office/word/2020/wordml/sdtdatahash" xmlns:w16sdtfl="http://schemas.microsoft.com/office/word/2024/wordml/sdtformatlock" xmlns:w16se="http://schemas.microsoft.com/office/word/2015/wordml/symex" xmlns:wpg="http://schemas.microsoft.com/office/word/2010/wordprocessingGroup" xmlns:wpi="http://schemas.microsoft.com/office/word/2010/wordprocessingInk" xmlns:wne="http://schemas.microsoft.com/office/word/2006/wordml" xmlns:wps="http://schemas.microsoft.com/office/word/2010/wordprocessingShape" mc:Ignorable="w14 w15 w16se w16cid w16 w16cex w16sdtdh w16sdtfl w16du wp14">
+<w:ftr xmlns:wpc="http://schemas.microsoft.com/office/word/2010/wordprocessingCanvas" xmlns:mc="http://schemas.openxmlformats.org/markup-compatibility/2006" xmlns:o="urn:schemas-microsoft-com:office:office" xmlns:r="http://schemas.openxmlformats.org/officeDocument/2006/relationships" xmlns:m="http://schemas.openxmlformats.org/officeDocument/2006/math" xmlns:v="urn:schemas-microsoft-com:vml" xmlns:wp14="http://schemas.microsoft.com/office/word/2010/wordprocessingDrawing" xmlns:wp="http://schemas.openxmlformats.org/drawingml/2006/wordprocessingDrawing" xmlns:w10="urn:schemas-microsoft-com:office:word" xmlns:w="http://schemas.openxmlformats.org/wordprocessingml/2006/main" xmlns:w14="http://schemas.microsoft.com/office/word/2010/wordml" xmlns:w15="http://schemas.microsoft.com/office/word/2012/wordml" xmlns:wpg="http://schemas.microsoft.com/office/word/2010/wordprocessingGroup" xmlns:wpi="http://schemas.microsoft.com/office/word/2010/wordprocessingInk" xmlns:wne="http://schemas.microsoft.com/office/word/2006/wordml" xmlns:wps="http://schemas.microsoft.com/office/word/2010/wordprocessingShape" mc:Ignorable="w14 w15 wp14">
   <w:p>
     <w:pPr>
       <w:pStyle w:val="a6"/>
@@ -4656,7 +6540,7 @@
 </file>
 
 <file path=word/footnotes.xml><?xml version="1.0" encoding="utf-8"?>
-<w:footnotes xmlns:wpc="http://schemas.microsoft.com/office/word/2010/wordprocessingCanvas" xmlns:cx="http://schemas.microsoft.com/office/drawing/2014/chartex" xmlns:cx1="http://schemas.microsoft.com/office/drawing/2015/9/8/chartex" xmlns:cx2="http://schemas.microsoft.com/office/drawing/2015/10/21/chartex" xmlns:cx3="http://schemas.microsoft.com/office/drawing/2016/5/9/chartex" xmlns:cx4="http://schemas.microsoft.com/office/drawing/2016/5/10/chartex" xmlns:cx5="http://schemas.microsoft.com/office/drawing/2016/5/11/chartex" xmlns:cx6="http://schemas.microsoft.com/office/drawing/2016/5/12/chartex" xmlns:cx7="http://schemas.microsoft.com/office/drawing/2016/5/13/chartex" xmlns:cx8="http://schemas.microsoft.com/office/drawing/2016/5/14/chartex" xmlns:mc="http://schemas.openxmlformats.org/markup-compatibility/2006" xmlns:aink="http://schemas.microsoft.com/office/drawing/2016/ink" xmlns:am3d="http://schemas.microsoft.com/office/drawing/2017/model3d" xmlns:o="urn:schemas-microsoft-com:office:office" xmlns:oel="http://schemas.microsoft.com/office/2019/extlst" xmlns:r="http://schemas.openxmlformats.org/officeDocument/2006/relationships" xmlns:m="http://schemas.openxmlformats.org/officeDocument/2006/math" xmlns:v="urn:schemas-microsoft-com:vml" xmlns:wp14="http://schemas.microsoft.com/office/word/2010/wordprocessingDrawing" xmlns:wp="http://schemas.openxmlformats.org/drawingml/2006/wordprocessingDrawing" xmlns:w10="urn:schemas-microsoft-com:office:word" xmlns:w="http://schemas.openxmlformats.org/wordprocessingml/2006/main" xmlns:w14="http://schemas.microsoft.com/office/word/2010/wordml" xmlns:w15="http://schemas.microsoft.com/office/word/2012/wordml" xmlns:w16cex="http://schemas.microsoft.com/office/word/2018/wordml/cex" xmlns:w16cid="http://schemas.microsoft.com/office/word/2016/wordml/cid" xmlns:w16="http://schemas.microsoft.com/office/word/2018/wordml" xmlns:w16du="http://schemas.microsoft.com/office/word/2023/wordml/word16du" xmlns:w16sdtdh="http://schemas.microsoft.com/office/word/2020/wordml/sdtdatahash" xmlns:w16sdtfl="http://schemas.microsoft.com/office/word/2024/wordml/sdtformatlock" xmlns:w16se="http://schemas.microsoft.com/office/word/2015/wordml/symex" xmlns:wpg="http://schemas.microsoft.com/office/word/2010/wordprocessingGroup" xmlns:wpi="http://schemas.microsoft.com/office/word/2010/wordprocessingInk" xmlns:wne="http://schemas.microsoft.com/office/word/2006/wordml" xmlns:wps="http://schemas.microsoft.com/office/word/2010/wordprocessingShape" mc:Ignorable="w14 w15 w16se w16cid w16 w16cex w16sdtdh w16sdtfl w16du wp14">
+<w:footnotes xmlns:wpc="http://schemas.microsoft.com/office/word/2010/wordprocessingCanvas" xmlns:mc="http://schemas.openxmlformats.org/markup-compatibility/2006" xmlns:o="urn:schemas-microsoft-com:office:office" xmlns:r="http://schemas.openxmlformats.org/officeDocument/2006/relationships" xmlns:m="http://schemas.openxmlformats.org/officeDocument/2006/math" xmlns:v="urn:schemas-microsoft-com:vml" xmlns:wp14="http://schemas.microsoft.com/office/word/2010/wordprocessingDrawing" xmlns:wp="http://schemas.openxmlformats.org/drawingml/2006/wordprocessingDrawing" xmlns:w10="urn:schemas-microsoft-com:office:word" xmlns:w="http://schemas.openxmlformats.org/wordprocessingml/2006/main" xmlns:w14="http://schemas.microsoft.com/office/word/2010/wordml" xmlns:w15="http://schemas.microsoft.com/office/word/2012/wordml" xmlns:wpg="http://schemas.microsoft.com/office/word/2010/wordprocessingGroup" xmlns:wpi="http://schemas.microsoft.com/office/word/2010/wordprocessingInk" xmlns:wne="http://schemas.microsoft.com/office/word/2006/wordml" xmlns:wps="http://schemas.microsoft.com/office/word/2010/wordprocessingShape" mc:Ignorable="w14 w15 wp14">
   <w:footnote w:type="separator" w:id="-1">
     <w:p>
       <w:pPr>
@@ -4681,8 +6565,8 @@
 </file>
 
 <file path=word/numbering.xml><?xml version="1.0" encoding="utf-8"?>
-<w:numbering xmlns:wpc="http://schemas.microsoft.com/office/word/2010/wordprocessingCanvas" xmlns:cx="http://schemas.microsoft.com/office/drawing/2014/chartex" xmlns:cx1="http://schemas.microsoft.com/office/drawing/2015/9/8/chartex" xmlns:cx2="http://schemas.microsoft.com/office/drawing/2015/10/21/chartex" xmlns:cx3="http://schemas.microsoft.com/office/drawing/2016/5/9/chartex" xmlns:cx4="http://schemas.microsoft.com/office/drawing/2016/5/10/chartex" xmlns:cx5="http://schemas.microsoft.com/office/drawing/2016/5/11/chartex" xmlns:cx6="http://schemas.microsoft.com/office/drawing/2016/5/12/chartex" xmlns:cx7="http://schemas.microsoft.com/office/drawing/2016/5/13/chartex" xmlns:cx8="http://schemas.microsoft.com/office/drawing/2016/5/14/chartex" xmlns:mc="http://schemas.openxmlformats.org/markup-compatibility/2006" xmlns:aink="http://schemas.microsoft.com/office/drawing/2016/ink" xmlns:am3d="http://schemas.microsoft.com/office/drawing/2017/model3d" xmlns:o="urn:schemas-microsoft-com:office:office" xmlns:oel="http://schemas.microsoft.com/office/2019/extlst" xmlns:r="http://schemas.openxmlformats.org/officeDocument/2006/relationships" xmlns:m="http://schemas.openxmlformats.org/officeDocument/2006/math" xmlns:v="urn:schemas-microsoft-com:vml" xmlns:wp14="http://schemas.microsoft.com/office/word/2010/wordprocessingDrawing" xmlns:wp="http://schemas.openxmlformats.org/drawingml/2006/wordprocessingDrawing" xmlns:w10="urn:schemas-microsoft-com:office:word" xmlns:w="http://schemas.openxmlformats.org/wordprocessingml/2006/main" xmlns:w14="http://schemas.microsoft.com/office/word/2010/wordml" xmlns:w15="http://schemas.microsoft.com/office/word/2012/wordml" xmlns:w16cex="http://schemas.microsoft.com/office/word/2018/wordml/cex" xmlns:w16cid="http://schemas.microsoft.com/office/word/2016/wordml/cid" xmlns:w16="http://schemas.microsoft.com/office/word/2018/wordml" xmlns:w16du="http://schemas.microsoft.com/office/word/2023/wordml/word16du" xmlns:w16sdtdh="http://schemas.microsoft.com/office/word/2020/wordml/sdtdatahash" xmlns:w16sdtfl="http://schemas.microsoft.com/office/word/2024/wordml/sdtformatlock" xmlns:w16se="http://schemas.microsoft.com/office/word/2015/wordml/symex" xmlns:wpg="http://schemas.microsoft.com/office/word/2010/wordprocessingGroup" xmlns:wpi="http://schemas.microsoft.com/office/word/2010/wordprocessingInk" xmlns:wne="http://schemas.microsoft.com/office/word/2006/wordml" xmlns:wps="http://schemas.microsoft.com/office/word/2010/wordprocessingShape" mc:Ignorable="w14 w15 w16se w16cid w16 w16cex w16sdtdh w16sdtfl w16du wp14">
-  <w:abstractNum w:abstractNumId="0" w15:restartNumberingAfterBreak="0">
+<w:numbering xmlns:wpc="http://schemas.microsoft.com/office/word/2010/wordprocessingCanvas" xmlns:mc="http://schemas.openxmlformats.org/markup-compatibility/2006" xmlns:o="urn:schemas-microsoft-com:office:office" xmlns:r="http://schemas.openxmlformats.org/officeDocument/2006/relationships" xmlns:m="http://schemas.openxmlformats.org/officeDocument/2006/math" xmlns:v="urn:schemas-microsoft-com:vml" xmlns:wp14="http://schemas.microsoft.com/office/word/2010/wordprocessingDrawing" xmlns:wp="http://schemas.openxmlformats.org/drawingml/2006/wordprocessingDrawing" xmlns:w10="urn:schemas-microsoft-com:office:word" xmlns:w="http://schemas.openxmlformats.org/wordprocessingml/2006/main" xmlns:w14="http://schemas.microsoft.com/office/word/2010/wordml" xmlns:w15="http://schemas.microsoft.com/office/word/2012/wordml" xmlns:wpg="http://schemas.microsoft.com/office/word/2010/wordprocessingGroup" xmlns:wpi="http://schemas.microsoft.com/office/word/2010/wordprocessingInk" xmlns:wne="http://schemas.microsoft.com/office/word/2006/wordml" xmlns:wps="http://schemas.microsoft.com/office/word/2010/wordprocessingShape" mc:Ignorable="w14 w15 wp14">
+  <w:abstractNum w:abstractNumId="0">
     <w:nsid w:val="0A2A13EE"/>
     <w:multiLevelType w:val="multilevel"/>
     <w:tmpl w:val="954E4E12"/>
@@ -4804,7 +6688,7 @@
       </w:pPr>
     </w:lvl>
   </w:abstractNum>
-  <w:abstractNum w:abstractNumId="1" w15:restartNumberingAfterBreak="0">
+  <w:abstractNum w:abstractNumId="1">
     <w:nsid w:val="5A2E4DCE"/>
     <w:multiLevelType w:val="multilevel"/>
     <w:tmpl w:val="354884DA"/>
@@ -4944,17 +6828,17 @@
       </w:rPr>
     </w:lvl>
   </w:abstractNum>
-  <w:num w:numId="1" w16cid:durableId="1389452082">
+  <w:num w:numId="1">
     <w:abstractNumId w:val="1"/>
   </w:num>
-  <w:num w:numId="2" w16cid:durableId="683360215">
+  <w:num w:numId="2">
     <w:abstractNumId w:val="0"/>
   </w:num>
 </w:numbering>
 </file>
 
 <file path=word/styles.xml><?xml version="1.0" encoding="utf-8"?>
-<w:styles xmlns:mc="http://schemas.openxmlformats.org/markup-compatibility/2006" xmlns:r="http://schemas.openxmlformats.org/officeDocument/2006/relationships" xmlns:w="http://schemas.openxmlformats.org/wordprocessingml/2006/main" xmlns:w14="http://schemas.microsoft.com/office/word/2010/wordml" xmlns:w15="http://schemas.microsoft.com/office/word/2012/wordml" xmlns:w16cex="http://schemas.microsoft.com/office/word/2018/wordml/cex" xmlns:w16cid="http://schemas.microsoft.com/office/word/2016/wordml/cid" xmlns:w16="http://schemas.microsoft.com/office/word/2018/wordml" xmlns:w16du="http://schemas.microsoft.com/office/word/2023/wordml/word16du" xmlns:w16sdtdh="http://schemas.microsoft.com/office/word/2020/wordml/sdtdatahash" xmlns:w16sdtfl="http://schemas.microsoft.com/office/word/2024/wordml/sdtformatlock" xmlns:w16se="http://schemas.microsoft.com/office/word/2015/wordml/symex" mc:Ignorable="w14 w15 w16se w16cid w16 w16cex w16sdtdh w16sdtfl w16du">
+<w:styles xmlns:mc="http://schemas.openxmlformats.org/markup-compatibility/2006" xmlns:r="http://schemas.openxmlformats.org/officeDocument/2006/relationships" xmlns:w="http://schemas.openxmlformats.org/wordprocessingml/2006/main" xmlns:w14="http://schemas.microsoft.com/office/word/2010/wordml" xmlns:w15="http://schemas.microsoft.com/office/word/2012/wordml" mc:Ignorable="w14 w15">
   <w:docDefaults>
     <w:rPrDefault>
       <w:rPr>
@@ -4970,7 +6854,7 @@
       </w:pPr>
     </w:pPrDefault>
   </w:docDefaults>
-  <w:latentStyles w:defLockedState="0" w:defUIPriority="99" w:defSemiHidden="0" w:defUnhideWhenUsed="0" w:defQFormat="0" w:count="376">
+  <w:latentStyles w:defLockedState="0" w:defUIPriority="99" w:defSemiHidden="0" w:defUnhideWhenUsed="0" w:defQFormat="0" w:count="371">
     <w:lsdException w:name="Normal" w:uiPriority="0" w:qFormat="1"/>
     <w:lsdException w:name="heading 1" w:uiPriority="9" w:qFormat="1"/>
     <w:lsdException w:name="heading 2" w:semiHidden="1" w:uiPriority="9" w:unhideWhenUsed="1" w:qFormat="1"/>
@@ -5005,7 +6889,7 @@
     <w:lsdException w:name="header" w:semiHidden="1" w:unhideWhenUsed="1"/>
     <w:lsdException w:name="footer" w:semiHidden="1" w:unhideWhenUsed="1"/>
     <w:lsdException w:name="index heading" w:semiHidden="1" w:unhideWhenUsed="1"/>
-    <w:lsdException w:name="caption" w:semiHidden="1" w:uiPriority="35" w:unhideWhenUsed="1" w:qFormat="1"/>
+    <w:lsdException w:name="caption" w:semiHidden="1" w:uiPriority="0" w:unhideWhenUsed="1" w:qFormat="1"/>
     <w:lsdException w:name="table of figures" w:semiHidden="1" w:unhideWhenUsed="1"/>
     <w:lsdException w:name="envelope address" w:semiHidden="1" w:unhideWhenUsed="1"/>
     <w:lsdException w:name="envelope return" w:semiHidden="1" w:unhideWhenUsed="1"/>
@@ -5342,11 +7226,6 @@
     <w:lsdException w:name="List Table 5 Dark Accent 6" w:uiPriority="50"/>
     <w:lsdException w:name="List Table 6 Colorful Accent 6" w:uiPriority="51"/>
     <w:lsdException w:name="List Table 7 Colorful Accent 6" w:uiPriority="52"/>
-    <w:lsdException w:name="Mention" w:semiHidden="1" w:unhideWhenUsed="1"/>
-    <w:lsdException w:name="Smart Hyperlink" w:semiHidden="1" w:unhideWhenUsed="1"/>
-    <w:lsdException w:name="Hashtag" w:semiHidden="1" w:unhideWhenUsed="1"/>
-    <w:lsdException w:name="Unresolved Mention" w:semiHidden="1" w:unhideWhenUsed="1"/>
-    <w:lsdException w:name="Smart Link" w:semiHidden="1" w:unhideWhenUsed="1"/>
   </w:latentStyles>
   <w:style w:type="paragraph" w:default="1" w:styleId="a">
     <w:name w:val="Normal"/>
@@ -5358,6 +7237,7 @@
   <w:style w:type="character" w:default="1" w:styleId="a0">
     <w:name w:val="Default Paragraph Font"/>
     <w:uiPriority w:val="1"/>
+    <w:semiHidden/>
     <w:unhideWhenUsed/>
   </w:style>
   <w:style w:type="table" w:default="1" w:styleId="a1">
@@ -5600,6 +7480,7 @@
       <w:lang w:eastAsia="ru-RU"/>
     </w:rPr>
     <w:tblPr>
+      <w:tblInd w:w="0" w:type="dxa"/>
       <w:tblBorders>
         <w:top w:val="single" w:sz="4" w:space="0" w:color="auto"/>
         <w:left w:val="single" w:sz="4" w:space="0" w:color="auto"/>
@@ -5608,6 +7489,12 @@
         <w:insideH w:val="single" w:sz="4" w:space="0" w:color="auto"/>
         <w:insideV w:val="single" w:sz="4" w:space="0" w:color="auto"/>
       </w:tblBorders>
+      <w:tblCellMar>
+        <w:top w:w="0" w:type="dxa"/>
+        <w:left w:w="108" w:type="dxa"/>
+        <w:bottom w:w="0" w:type="dxa"/>
+        <w:right w:w="108" w:type="dxa"/>
+      </w:tblCellMar>
     </w:tblPr>
   </w:style>
 </w:styles>
@@ -5792,7 +7679,7 @@
 </file>
 
 <file path=customXml/itemProps1.xml><?xml version="1.0" encoding="utf-8"?>
-<ds:datastoreItem xmlns:ds="http://schemas.openxmlformats.org/officeDocument/2006/customXml" ds:itemID="{C2A95B2A-FB99-468B-934B-9CE0337AA700}">
+<ds:datastoreItem xmlns:ds="http://schemas.openxmlformats.org/officeDocument/2006/customXml" ds:itemID="{C93B6829-D6ED-4D2B-AD38-951AE6078B16}">
   <ds:schemaRefs>
     <ds:schemaRef ds:uri="http://schemas.openxmlformats.org/officeDocument/2006/bibliography"/>
   </ds:schemaRefs>

</xml_diff>

<commit_message>
docs(y2/sem1/life-safety/lab): apply emergency report corrections
</commit_message>
<xml_diff>
--- a/year-2/semester-1/life-safety/labworks/emergencies/emergencies-labwork-505013.docx
+++ b/year-2/semester-1/life-safety/labworks/emergencies/emergencies-labwork-505013.docx
@@ -18,73 +18,18 @@
           <w:szCs w:val="24"/>
           <w:lang w:eastAsia="ru-RU"/>
         </w:rPr>
-        <w:drawing>
-          <wp:anchor distT="0" distB="0" distL="0" distR="0" simplePos="0" relativeHeight="2" behindDoc="1" locked="0" layoutInCell="1" allowOverlap="1" wp14:anchorId="15CC02DD" wp14:editId="4E969713">
-            <wp:simplePos x="0" y="0"/>
-            <wp:positionH relativeFrom="column">
-              <wp:posOffset>-1078230</wp:posOffset>
-            </wp:positionH>
-            <wp:positionV relativeFrom="paragraph">
-              <wp:posOffset>-747395</wp:posOffset>
-            </wp:positionV>
-            <wp:extent cx="7620000" cy="10775950"/>
-            <wp:effectExtent l="0" t="0" r="0" b="0"/>
-            <wp:wrapNone/>
-            <wp:docPr id="1" name="Рисунок 20"/>
-            <wp:cNvGraphicFramePr>
-              <a:graphicFrameLocks xmlns:a="http://schemas.openxmlformats.org/drawingml/2006/main" noChangeAspect="1"/>
-            </wp:cNvGraphicFramePr>
-            <a:graphic xmlns:a="http://schemas.openxmlformats.org/drawingml/2006/main">
-              <a:graphicData uri="http://schemas.openxmlformats.org/drawingml/2006/picture">
-                <pic:pic xmlns:pic="http://schemas.openxmlformats.org/drawingml/2006/picture">
-                  <pic:nvPicPr>
-                    <pic:cNvPr id="1" name="Рисунок 20"/>
-                    <pic:cNvPicPr>
-                      <a:picLocks noChangeAspect="1" noChangeArrowheads="1"/>
-                    </pic:cNvPicPr>
-                  </pic:nvPicPr>
-                  <pic:blipFill>
-                    <a:blip r:embed="rId8"/>
-                    <a:stretch>
-                      <a:fillRect/>
-                    </a:stretch>
-                  </pic:blipFill>
-                  <pic:spPr bwMode="auto">
-                    <a:xfrm>
-                      <a:off x="0" y="0"/>
-                      <a:ext cx="7620000" cy="10775950"/>
-                    </a:xfrm>
-                    <a:prstGeom prst="rect">
-                      <a:avLst/>
-                    </a:prstGeom>
-                    <a:noFill/>
-                  </pic:spPr>
-                </pic:pic>
-              </a:graphicData>
-            </a:graphic>
-          </wp:anchor>
-        </w:drawing>
-      </w:r>
-      <w:r>
-        <w:rPr>
-          <w:rFonts w:eastAsia="Times New Roman" w:cs="Times New Roman"/>
-          <w:b/>
-          <w:noProof/>
-          <w:szCs w:val="24"/>
-          <w:lang w:eastAsia="ru-RU"/>
-        </w:rPr>
         <mc:AlternateContent>
           <mc:Choice Requires="wps">
             <w:drawing>
-              <wp:anchor distT="0" distB="0" distL="0" distR="0" simplePos="0" relativeHeight="3" behindDoc="1" locked="0" layoutInCell="1" allowOverlap="1" wp14:anchorId="441794D3" wp14:editId="022E95FD">
+              <wp:anchor distT="0" distB="0" distL="0" distR="0" simplePos="0" relativeHeight="3" behindDoc="1" locked="0" layoutInCell="1" allowOverlap="1" wp14:anchorId="441794D3" wp14:editId="3ACCBE7D">
                 <wp:simplePos x="0" y="0"/>
                 <wp:positionH relativeFrom="column">
-                  <wp:posOffset>1899285</wp:posOffset>
+                  <wp:posOffset>1898015</wp:posOffset>
                 </wp:positionH>
                 <wp:positionV relativeFrom="paragraph">
-                  <wp:posOffset>6084570</wp:posOffset>
+                  <wp:posOffset>6087110</wp:posOffset>
                 </wp:positionV>
-                <wp:extent cx="4563745" cy="1144270"/>
+                <wp:extent cx="4563110" cy="1244600"/>
                 <wp:effectExtent l="0" t="0" r="0" b="0"/>
                 <wp:wrapNone/>
                 <wp:docPr id="2" name="Надпись 4"/>
@@ -96,7 +41,7 @@
                       <wps:spPr>
                         <a:xfrm>
                           <a:off x="0" y="0"/>
-                          <a:ext cx="4563720" cy="1144440"/>
+                          <a:ext cx="4563110" cy="1244600"/>
                         </a:xfrm>
                         <a:prstGeom prst="rect">
                           <a:avLst/>
@@ -250,7 +195,7 @@
                           </w:p>
                         </w:txbxContent>
                       </wps:txbx>
-                      <wps:bodyPr anchor="t">
+                      <wps:bodyPr wrap="square" anchor="t">
                         <a:prstTxWarp prst="textNoShape">
                           <a:avLst/>
                         </a:prstTxWarp>
@@ -259,12 +204,15 @@
                     </wps:wsp>
                   </a:graphicData>
                 </a:graphic>
+                <wp14:sizeRelV relativeFrom="margin">
+                  <wp14:pctHeight>0</wp14:pctHeight>
+                </wp14:sizeRelV>
               </wp:anchor>
             </w:drawing>
           </mc:Choice>
           <mc:Fallback>
             <w:pict>
-              <v:rect w14:anchorId="441794D3" id="Надпись 4" o:spid="_x0000_s1026" style="position:absolute;margin-left:149.55pt;margin-top:479.1pt;width:359.35pt;height:90.1pt;z-index:-503316477;visibility:visible;mso-wrap-style:square;mso-wrap-distance-left:0;mso-wrap-distance-top:0;mso-wrap-distance-right:0;mso-wrap-distance-bottom:0;mso-position-horizontal:absolute;mso-position-horizontal-relative:text;mso-position-vertical:absolute;mso-position-vertical-relative:text;v-text-anchor:top" o:gfxdata="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" filled="f" stroked="f" strokeweight=".5pt">
+              <v:rect w14:anchorId="441794D3" id="Надпись 4" o:spid="_x0000_s1026" style="position:absolute;margin-left:149.45pt;margin-top:479.3pt;width:359.3pt;height:98pt;z-index:-503316477;visibility:visible;mso-wrap-style:square;mso-height-percent:0;mso-wrap-distance-left:0;mso-wrap-distance-top:0;mso-wrap-distance-right:0;mso-wrap-distance-bottom:0;mso-position-horizontal:absolute;mso-position-horizontal-relative:text;mso-position-vertical:absolute;mso-position-vertical-relative:text;mso-height-percent:0;mso-height-relative:margin;v-text-anchor:top" o:gfxdata="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" filled="f" stroked="f" strokeweight=".5pt">
                 <v:textbox>
                   <w:txbxContent>
                     <w:p>
@@ -403,6 +351,61 @@
         </mc:AlternateContent>
       </w:r>
       <w:r>
+        <w:rPr>
+          <w:rFonts w:eastAsia="Times New Roman" w:cs="Times New Roman"/>
+          <w:b/>
+          <w:noProof/>
+          <w:szCs w:val="24"/>
+          <w:lang w:eastAsia="ru-RU"/>
+        </w:rPr>
+        <w:drawing>
+          <wp:anchor distT="0" distB="0" distL="0" distR="0" simplePos="0" relativeHeight="2" behindDoc="1" locked="0" layoutInCell="1" allowOverlap="1" wp14:anchorId="15CC02DD" wp14:editId="50F5C3A2">
+            <wp:simplePos x="0" y="0"/>
+            <wp:positionH relativeFrom="column">
+              <wp:posOffset>-1078230</wp:posOffset>
+            </wp:positionH>
+            <wp:positionV relativeFrom="paragraph">
+              <wp:posOffset>-747395</wp:posOffset>
+            </wp:positionV>
+            <wp:extent cx="7620000" cy="10775950"/>
+            <wp:effectExtent l="0" t="0" r="0" b="0"/>
+            <wp:wrapNone/>
+            <wp:docPr id="1" name="Рисунок 20"/>
+            <wp:cNvGraphicFramePr>
+              <a:graphicFrameLocks xmlns:a="http://schemas.openxmlformats.org/drawingml/2006/main" noChangeAspect="1"/>
+            </wp:cNvGraphicFramePr>
+            <a:graphic xmlns:a="http://schemas.openxmlformats.org/drawingml/2006/main">
+              <a:graphicData uri="http://schemas.openxmlformats.org/drawingml/2006/picture">
+                <pic:pic xmlns:pic="http://schemas.openxmlformats.org/drawingml/2006/picture">
+                  <pic:nvPicPr>
+                    <pic:cNvPr id="1" name="Рисунок 20"/>
+                    <pic:cNvPicPr>
+                      <a:picLocks noChangeAspect="1" noChangeArrowheads="1"/>
+                    </pic:cNvPicPr>
+                  </pic:nvPicPr>
+                  <pic:blipFill>
+                    <a:blip r:embed="rId8"/>
+                    <a:stretch>
+                      <a:fillRect/>
+                    </a:stretch>
+                  </pic:blipFill>
+                  <pic:spPr bwMode="auto">
+                    <a:xfrm>
+                      <a:off x="0" y="0"/>
+                      <a:ext cx="7620000" cy="10775950"/>
+                    </a:xfrm>
+                    <a:prstGeom prst="rect">
+                      <a:avLst/>
+                    </a:prstGeom>
+                    <a:noFill/>
+                  </pic:spPr>
+                </pic:pic>
+              </a:graphicData>
+            </a:graphic>
+          </wp:anchor>
+        </w:drawing>
+      </w:r>
+      <w:r>
         <w:br w:type="page"/>
       </w:r>
     </w:p>
@@ -445,13 +448,7 @@
         <w:rPr>
           <w:szCs w:val="24"/>
         </w:rPr>
-        <w:t>чрезвычайных происшествий локального и масштабного хара</w:t>
-      </w:r>
-      <w:r>
-        <w:rPr>
-          <w:szCs w:val="24"/>
-        </w:rPr>
-        <w:t>ктера.</w:t>
+        <w:t>чрезвычайных происшествий локального и масштабного характера.</w:t>
       </w:r>
     </w:p>
     <w:p>
@@ -580,15 +577,7 @@
           <w:b/>
           <w:szCs w:val="24"/>
         </w:rPr>
-        <w:t>для з</w:t>
-      </w:r>
-      <w:r>
-        <w:rPr>
-          <w:rFonts w:eastAsia="Times New Roman" w:cs="Times New Roman"/>
-          <w:b/>
-          <w:szCs w:val="24"/>
-        </w:rPr>
-        <w:t>ащиты</w:t>
+        <w:t>для защиты</w:t>
       </w:r>
       <w:r>
         <w:rPr>
@@ -682,10 +671,7 @@
         <w:jc w:val="both"/>
       </w:pPr>
       <w:r>
-        <w:t>Анализ вероятных опасностей по месту п</w:t>
-      </w:r>
-      <w:r>
-        <w:t>роживания</w:t>
+        <w:t>Анализ вероятных опасностей по месту проживания</w:t>
       </w:r>
     </w:p>
     <w:p>
@@ -753,14 +739,7 @@
                 <w:rFonts w:eastAsia="Times New Roman" w:cs="Times New Roman"/>
                 <w:szCs w:val="24"/>
               </w:rPr>
-              <w:t xml:space="preserve">Таблица 1 – Анализ наиболее вероятных в моем месте проживания чрезвычайных </w:t>
-            </w:r>
-            <w:r>
-              <w:rPr>
-                <w:rFonts w:eastAsia="Times New Roman" w:cs="Times New Roman"/>
-                <w:szCs w:val="24"/>
-              </w:rPr>
-              <w:t>ситуаций (масштабных и локальных)</w:t>
+              <w:t>Таблица 1 – Анализ наиболее вероятных в моем месте проживания чрезвычайных ситуаций (масштабных и локальных)</w:t>
             </w:r>
           </w:p>
         </w:tc>
@@ -878,15 +857,7 @@
                 <w:i/>
                 <w:szCs w:val="24"/>
               </w:rPr>
-              <w:t xml:space="preserve">сильный ветер, снегопады, гололёд и связанные с ними перебои транспорта, крупные ДТП на КАД, Мурманском </w:t>
-            </w:r>
-            <w:r>
-              <w:rPr>
-                <w:rFonts w:eastAsia="Times New Roman" w:cs="Times New Roman"/>
-                <w:i/>
-                <w:szCs w:val="24"/>
-              </w:rPr>
-              <w:t>шоссе и улицах Кудрово, аварии на сетях электроснабжения, отопления и водоснабжения</w:t>
+              <w:t>сильный ветер, снегопады, гололёд и связанные с ними перебои транспорта, крупные ДТП на КАД, Мурманском шоссе и улицах Кудрово, аварии на сетях электроснабжения, отопления и водоснабжения</w:t>
             </w:r>
           </w:p>
         </w:tc>
@@ -986,14 +957,7 @@
           <w:szCs w:val="26"/>
         </w:rPr>
         <w:lastRenderedPageBreak/>
-        <w:t>Оп</w:t>
-      </w:r>
-      <w:r>
-        <w:rPr>
-          <w:sz w:val="26"/>
-          <w:szCs w:val="26"/>
-        </w:rPr>
-        <w:t>исание принятых мер для снижения рисков чрезвычайных ситуаций.</w:t>
+        <w:t>Описание принятых мер для снижения рисков чрезвычайных ситуаций.</w:t>
       </w:r>
     </w:p>
     <w:tbl>
@@ -1081,7 +1045,15 @@
                 <w:i/>
                 <w:szCs w:val="24"/>
               </w:rPr>
-              <w:t>. Из дома известны два пути выхода. При пожаре или задымлении лифтом не ни в коем случае не пользоваться</w:t>
+              <w:t xml:space="preserve">. Из дома известны два пути выхода. </w:t>
+            </w:r>
+            <w:r>
+              <w:rPr>
+                <w:rFonts w:eastAsia="Times New Roman" w:cs="Times New Roman"/>
+                <w:i/>
+                <w:szCs w:val="24"/>
+              </w:rPr>
+              <w:t>При пожаре или задымлении ни в коем случае не пользоваться лифтом.</w:t>
             </w:r>
           </w:p>
         </w:tc>
@@ -1130,14 +1102,7 @@
                 <w:rFonts w:eastAsia="Times New Roman" w:cs="Times New Roman"/>
                 <w:szCs w:val="24"/>
               </w:rPr>
-              <w:t>Ме</w:t>
-            </w:r>
-            <w:r>
-              <w:rPr>
-                <w:rFonts w:eastAsia="Times New Roman" w:cs="Times New Roman"/>
-                <w:szCs w:val="24"/>
-              </w:rPr>
-              <w:t>ры по минимизации рисков и последствий локальных ЧС в моем доме:</w:t>
+              <w:t>Меры по минимизации рисков и последствий локальных ЧС в моем доме:</w:t>
             </w:r>
           </w:p>
         </w:tc>
@@ -1168,15 +1133,25 @@
                 <w:i/>
                 <w:szCs w:val="24"/>
               </w:rPr>
-              <w:t>не загромождать выход из квартиры, знать, где перекрыть воду и отключить электричество, не оставлять без присмотра плиту и нагревательные приборы, не перегружать удлинители. В квартире устан</w:t>
-            </w:r>
-            <w:r>
-              <w:rPr>
-                <w:rFonts w:eastAsia="Times New Roman" w:cs="Times New Roman"/>
-                <w:i/>
-                <w:szCs w:val="24"/>
-              </w:rPr>
-              <w:t>овлен автономный пожарный извещатель</w:t>
+              <w:t xml:space="preserve">не загромождать выход из квартиры, знать, где перекрыть воду и отключить электричество, не оставлять без присмотра плиту и нагревательные приборы, не перегружать удлинители. В квартире установлен автономный пожарный </w:t>
+            </w:r>
+            <w:proofErr w:type="spellStart"/>
+            <w:r>
+              <w:rPr>
+                <w:rFonts w:eastAsia="Times New Roman" w:cs="Times New Roman"/>
+                <w:i/>
+                <w:szCs w:val="24"/>
+              </w:rPr>
+              <w:t>извещатель</w:t>
+            </w:r>
+            <w:proofErr w:type="spellEnd"/>
+            <w:r>
+              <w:rPr>
+                <w:rFonts w:eastAsia="Times New Roman" w:cs="Times New Roman"/>
+                <w:i/>
+                <w:szCs w:val="24"/>
+              </w:rPr>
+              <w:t>.</w:t>
             </w:r>
           </w:p>
         </w:tc>
@@ -1587,10 +1562,7 @@
         <w:jc w:val="both"/>
       </w:pPr>
       <w:r>
-        <w:t>Источник данных: Региональная геоинформационная система Ленинградской области, интера</w:t>
-      </w:r>
-      <w:r>
-        <w:t xml:space="preserve">ктивная карта и поиск объектов: </w:t>
+        <w:t xml:space="preserve">Источник данных: Региональная геоинформационная система Ленинградской области, интерактивная карта и поиск объектов: </w:t>
       </w:r>
       <w:hyperlink r:id="rId9">
         <w:r>
@@ -1673,14 +1645,7 @@
                 <w:rFonts w:eastAsia="Times New Roman" w:cs="Times New Roman"/>
                 <w:szCs w:val="24"/>
               </w:rPr>
-              <w:t>Меры по минимиза</w:t>
-            </w:r>
-            <w:r>
-              <w:rPr>
-                <w:rFonts w:eastAsia="Times New Roman" w:cs="Times New Roman"/>
-                <w:szCs w:val="24"/>
-              </w:rPr>
-              <w:t>ции влияния токсичных веществ, загрязняющих окружающую среду в моем микрорайоне:</w:t>
+              <w:t>Меры по минимизации влияния токсичных веществ, загрязняющих окружающую среду в моем микрорайоне:</w:t>
             </w:r>
           </w:p>
         </w:tc>
@@ -1722,6 +1687,14 @@
               </w:rPr>
               <w:t xml:space="preserve"> регулярно проводить влажную уборку, проветривать квартиру с учётом запаха гари и задымления. При сильном запахе гари закрывать окна со стороны источника, ограничивать прогулки и сообщать о проблеме по номеру 112</w:t>
             </w:r>
+            <w:r>
+              <w:rPr>
+                <w:rFonts w:eastAsia="Times New Roman" w:cs="Times New Roman"/>
+                <w:i/>
+                <w:szCs w:val="24"/>
+              </w:rPr>
+              <w:t>.</w:t>
+            </w:r>
           </w:p>
           <w:p>
             <w:pPr>
@@ -1748,6 +1721,14 @@
                 <w:szCs w:val="24"/>
               </w:rPr>
               <w:t xml:space="preserve"> поддерживать работу постов экологического мониторинга, публиковать результаты наблюдений, контролировать пыление на стройплощадках и уборку дорог, развивать озеленение и принимать обращения жителей о загрязнении воздуха</w:t>
+            </w:r>
+            <w:r>
+              <w:rPr>
+                <w:rFonts w:eastAsia="Times New Roman" w:cs="Times New Roman"/>
+                <w:i/>
+                <w:szCs w:val="24"/>
+              </w:rPr>
+              <w:t>.</w:t>
             </w:r>
           </w:p>
         </w:tc>
@@ -1813,14 +1794,7 @@
                 <w:rFonts w:eastAsia="Times New Roman" w:cs="Times New Roman"/>
                 <w:szCs w:val="24"/>
               </w:rPr>
-              <w:t>Таблица 3 – Потенциаль</w:t>
-            </w:r>
-            <w:r>
-              <w:rPr>
-                <w:rFonts w:eastAsia="Times New Roman" w:cs="Times New Roman"/>
-                <w:szCs w:val="24"/>
-              </w:rPr>
-              <w:t>ные угрозы здоровью со стороны организации моего учебного или рабочего места</w:t>
+              <w:t>Таблица 3 – Потенциальные угрозы здоровью со стороны организации моего учебного или рабочего места</w:t>
             </w:r>
           </w:p>
         </w:tc>
@@ -1938,15 +1912,7 @@
                 <w:i/>
                 <w:szCs w:val="24"/>
               </w:rPr>
-              <w:t xml:space="preserve">длительная работа сидя, нагрузка на глаза при работе с </w:t>
-            </w:r>
-            <w:r>
-              <w:rPr>
-                <w:rFonts w:eastAsia="Times New Roman" w:cs="Times New Roman"/>
-                <w:i/>
-                <w:szCs w:val="24"/>
-              </w:rPr>
-              <w:t>экраном, нагрузка на кисти при работе с клавиатурой и мышью, недостаточная освещённость</w:t>
+              <w:t>длительная работа сидя, нагрузка на глаза при работе с экраном, нагрузка на кисти при работе с клавиатурой и мышью, недостаточная освещённость</w:t>
             </w:r>
           </w:p>
         </w:tc>
@@ -2070,14 +2036,7 @@
                 <w:rFonts w:eastAsia="Times New Roman" w:cs="Times New Roman"/>
                 <w:szCs w:val="24"/>
               </w:rPr>
-              <w:t>Таблица 4 – С</w:t>
-            </w:r>
-            <w:r>
-              <w:rPr>
-                <w:rFonts w:eastAsia="Times New Roman" w:cs="Times New Roman"/>
-                <w:szCs w:val="24"/>
-              </w:rPr>
-              <w:t>писок шагов для защиты моей жизни, здоровья, имущества</w:t>
+              <w:t>Таблица 4 – Список шагов для защиты моей жизни, здоровья, имущества</w:t>
             </w:r>
           </w:p>
         </w:tc>
@@ -2124,33 +2083,6 @@
           <w:p>
             <w:pPr>
               <w:pStyle w:val="aa"/>
-              <w:spacing w:before="120" w:after="0"/>
-              <w:rPr>
-                <w:rFonts w:eastAsia="Times New Roman" w:cs="Times New Roman"/>
-                <w:i/>
-                <w:szCs w:val="24"/>
-              </w:rPr>
-            </w:pPr>
-            <w:r>
-              <w:rPr>
-                <w:rFonts w:eastAsia="Times New Roman" w:cs="Times New Roman"/>
-                <w:i/>
-                <w:szCs w:val="24"/>
-              </w:rPr>
-              <w:t>Регулярно проверяю состояние инженерных систем здания и сообщаю о неисправностях в службу эксплуатации. Слежу, чтобы электроприборы были подключены безопасно, а провода не ле</w:t>
-            </w:r>
-            <w:r>
-              <w:rPr>
-                <w:rFonts w:eastAsia="Times New Roman" w:cs="Times New Roman"/>
-                <w:i/>
-                <w:szCs w:val="24"/>
-              </w:rPr>
-              <w:t>жали под ногами. Поддерживаю порядок в помещении и проветриваю его. При необходимости использую средства индивидуальной защиты.</w:t>
-            </w:r>
-          </w:p>
-          <w:p>
-            <w:pPr>
-              <w:pStyle w:val="aa"/>
               <w:spacing w:before="120" w:after="283"/>
               <w:rPr>
                 <w:rFonts w:eastAsia="Times New Roman" w:cs="Times New Roman"/>
@@ -2164,15 +2096,7 @@
                 <w:i/>
                 <w:szCs w:val="24"/>
               </w:rPr>
-              <w:t>Работая с вредными веществами, соблюдаю правила, проверяю фильтры и защищаю глаза и органы дыхания. Учитываю особенности жизни в мегаполисе, в том числе поддерживаю водный режим. Берегу технику и документы от протечек и затопления. Соблюдаю пожарную и элек</w:t>
-            </w:r>
-            <w:r>
-              <w:rPr>
-                <w:rFonts w:eastAsia="Times New Roman" w:cs="Times New Roman"/>
-                <w:i/>
-                <w:szCs w:val="24"/>
-              </w:rPr>
-              <w:t>тробезопасность, заранее продумываю риски, связанные со стихией и действиями злоумышленников</w:t>
+              <w:t>Следить за исправностью электроприборов и не размещать провода в проходах. Поддерживать порядок в помещении и регулярно его проветривать. Беречь документы и технику от протечек и затопления. Соблюдать правила пожарной и электробезопасности. Знать расположение вводных кранов воды, электрического щита и путей выхода из дома. При обнаружении неисправностей общедомовых систем сообщать о них в службу эксплуатации.</w:t>
             </w:r>
           </w:p>
         </w:tc>
@@ -2202,7 +2126,6 @@
                 <w:color w:val="000000"/>
                 <w:szCs w:val="24"/>
               </w:rPr>
-              <w:lastRenderedPageBreak/>
               <w:t>Планируемые в ближайший месяц шаги:</w:t>
             </w:r>
           </w:p>
@@ -2232,7 +2155,25 @@
                 <w:i/>
                 <w:szCs w:val="24"/>
               </w:rPr>
-              <w:t>Проверить срок годности лекарств в аптечке и работу пожарного извещателя, приобрести огнетушитель в квартиру, освободить путь к выходу, обсудить с сожителями действия при пожаре и место встречи после эвакуации</w:t>
+              <w:t xml:space="preserve">Обновить лекарства с истёкшим сроком годности, проконтролировать исправность пожарного </w:t>
+            </w:r>
+            <w:proofErr w:type="spellStart"/>
+            <w:r>
+              <w:rPr>
+                <w:rFonts w:eastAsia="Times New Roman" w:cs="Times New Roman"/>
+                <w:i/>
+                <w:szCs w:val="24"/>
+              </w:rPr>
+              <w:t>извещателя</w:t>
+            </w:r>
+            <w:proofErr w:type="spellEnd"/>
+            <w:r>
+              <w:rPr>
+                <w:rFonts w:eastAsia="Times New Roman" w:cs="Times New Roman"/>
+                <w:i/>
+                <w:szCs w:val="24"/>
+              </w:rPr>
+              <w:t>, приобрести огнетушитель в квартиру, освободить путь к выходу, обсудить с сожителями действия при пожаре и место встречи после эвакуации.</w:t>
             </w:r>
           </w:p>
         </w:tc>
@@ -2256,6 +2197,7 @@
         <w:rPr>
           <w:b/>
         </w:rPr>
+        <w:lastRenderedPageBreak/>
         <w:t>Задание 2: Ответственные и доверенные лица</w:t>
       </w:r>
     </w:p>
@@ -2371,16 +2313,64 @@
                 <w:i/>
                 <w:szCs w:val="24"/>
               </w:rPr>
-              <w:t xml:space="preserve">ГБУЗ ЛО «Всеволожская КМБ», </w:t>
-            </w:r>
-            <w:r>
-              <w:rPr>
-                <w:rFonts w:eastAsia="Times New Roman" w:cs="Times New Roman"/>
-                <w:i/>
-                <w:szCs w:val="24"/>
-              </w:rPr>
-              <w:t xml:space="preserve">поликлиника г. Кудрово,        ул. Ленинградская, д. 8, телефон +7 (812) 331-63-80. Вызов врача на дом и запись: 122. </w:t>
-            </w:r>
+              <w:t xml:space="preserve">ГБУЗ ЛО «Всеволожская КМБ», поликлиника г. </w:t>
+            </w:r>
+            <w:proofErr w:type="gramStart"/>
+            <w:r>
+              <w:rPr>
+                <w:rFonts w:eastAsia="Times New Roman" w:cs="Times New Roman"/>
+                <w:i/>
+                <w:szCs w:val="24"/>
+              </w:rPr>
+              <w:t xml:space="preserve">Кудрово,   </w:t>
+            </w:r>
+            <w:proofErr w:type="gramEnd"/>
+            <w:r>
+              <w:rPr>
+                <w:rFonts w:eastAsia="Times New Roman" w:cs="Times New Roman"/>
+                <w:i/>
+                <w:szCs w:val="24"/>
+              </w:rPr>
+              <w:t xml:space="preserve">     ул. Ленинградская, д. 8, телефон +7 (812) 331-63-80. Вызов врача на дом и запись: 122. </w:t>
+            </w:r>
+          </w:p>
+          <w:p>
+            <w:pPr>
+              <w:spacing w:before="120" w:after="0" w:line="276" w:lineRule="auto"/>
+              <w:rPr>
+                <w:rFonts w:eastAsia="Times New Roman" w:cs="Times New Roman"/>
+                <w:i/>
+                <w:szCs w:val="24"/>
+              </w:rPr>
+            </w:pPr>
+            <w:r>
+              <w:rPr>
+                <w:rFonts w:eastAsia="Times New Roman" w:cs="Times New Roman"/>
+                <w:i/>
+                <w:szCs w:val="24"/>
+              </w:rPr>
+              <w:t xml:space="preserve">Отделение скорой медицинской помощи ГБУЗ ЛО «Всеволожская КМБ»: г. Всеволожск, </w:t>
+            </w:r>
+            <w:proofErr w:type="spellStart"/>
+            <w:r>
+              <w:rPr>
+                <w:rFonts w:eastAsia="Times New Roman" w:cs="Times New Roman"/>
+                <w:i/>
+                <w:szCs w:val="24"/>
+              </w:rPr>
+              <w:t>Колтушское</w:t>
+            </w:r>
+            <w:proofErr w:type="spellEnd"/>
+            <w:r>
+              <w:rPr>
+                <w:rFonts w:eastAsia="Times New Roman" w:cs="Times New Roman"/>
+                <w:i/>
+                <w:szCs w:val="24"/>
+              </w:rPr>
+              <w:t xml:space="preserve"> шоссе, д. 20, телефон 122, круглосуточно.</w:t>
+            </w:r>
+            <w:bookmarkStart w:id="0" w:name="_GoBack"/>
+            <w:bookmarkEnd w:id="0"/>
           </w:p>
           <w:p>
             <w:pPr>
@@ -2492,7 +2482,61 @@
                 <w:i/>
                 <w:szCs w:val="24"/>
               </w:rPr>
-              <w:t>ГБУЗ ЛО «Всеволожская КМБ», поликлиника г. Кудрово,        ул. Ленинградская, д. 8. Телефон 122 или +7 (812) 331-63-80.</w:t>
+              <w:t xml:space="preserve">Государственный круглосуточный </w:t>
+            </w:r>
+            <w:proofErr w:type="spellStart"/>
+            <w:r>
+              <w:rPr>
+                <w:rFonts w:eastAsia="Times New Roman" w:cs="Times New Roman"/>
+                <w:i/>
+                <w:szCs w:val="24"/>
+              </w:rPr>
+              <w:t>травмоцентр</w:t>
+            </w:r>
+            <w:proofErr w:type="spellEnd"/>
+            <w:r>
+              <w:rPr>
+                <w:rFonts w:eastAsia="Times New Roman" w:cs="Times New Roman"/>
+                <w:i/>
+                <w:szCs w:val="24"/>
+              </w:rPr>
+              <w:t xml:space="preserve">: ГБУЗ ЛО «Всеволожская КМБ», </w:t>
+            </w:r>
+            <w:proofErr w:type="spellStart"/>
+            <w:r>
+              <w:rPr>
+                <w:rFonts w:eastAsia="Times New Roman" w:cs="Times New Roman"/>
+                <w:i/>
+                <w:szCs w:val="24"/>
+              </w:rPr>
+              <w:t>Травмоцентр</w:t>
+            </w:r>
+            <w:proofErr w:type="spellEnd"/>
+            <w:r>
+              <w:rPr>
+                <w:rFonts w:eastAsia="Times New Roman" w:cs="Times New Roman"/>
+                <w:i/>
+                <w:szCs w:val="24"/>
+              </w:rPr>
+              <w:t xml:space="preserve"> I уровня, г. Всеволожск, </w:t>
+            </w:r>
+            <w:proofErr w:type="spellStart"/>
+            <w:r>
+              <w:rPr>
+                <w:rFonts w:eastAsia="Times New Roman" w:cs="Times New Roman"/>
+                <w:i/>
+                <w:szCs w:val="24"/>
+              </w:rPr>
+              <w:t>Колтушское</w:t>
+            </w:r>
+            <w:proofErr w:type="spellEnd"/>
+            <w:r>
+              <w:rPr>
+                <w:rFonts w:eastAsia="Times New Roman" w:cs="Times New Roman"/>
+                <w:i/>
+                <w:szCs w:val="24"/>
+              </w:rPr>
+              <w:t xml:space="preserve"> шоссе, д. 20, корп. 3, телефон 122. </w:t>
             </w:r>
           </w:p>
           <w:p>
@@ -2510,31 +2554,25 @@
                 <w:i/>
                 <w:szCs w:val="24"/>
               </w:rPr>
-              <w:t>Коммерческий круглосуточный травмпункт: «СМ-Клиника», Санкт-Петербург, пр. Удар</w:t>
-            </w:r>
-            <w:r>
-              <w:rPr>
-                <w:rFonts w:eastAsia="Times New Roman" w:cs="Times New Roman"/>
-                <w:i/>
-                <w:szCs w:val="24"/>
-              </w:rPr>
-              <w:t xml:space="preserve">ников, д. 19, корп. 1, телефон </w:t>
-            </w:r>
-            <w:r>
-              <w:rPr>
-                <w:rFonts w:eastAsia="Times New Roman" w:cs="Times New Roman"/>
-                <w:i/>
-                <w:szCs w:val="24"/>
-              </w:rPr>
-              <w:t xml:space="preserve">+7 (812) </w:t>
-            </w:r>
-            <w:r>
-              <w:rPr>
-                <w:rFonts w:eastAsia="Times New Roman" w:cs="Times New Roman"/>
-                <w:i/>
-                <w:szCs w:val="24"/>
-              </w:rPr>
-              <w:t>435-55-55.</w:t>
+              <w:t xml:space="preserve">Коммерческий круглосуточный </w:t>
+            </w:r>
+            <w:proofErr w:type="spellStart"/>
+            <w:r>
+              <w:rPr>
+                <w:rFonts w:eastAsia="Times New Roman" w:cs="Times New Roman"/>
+                <w:i/>
+                <w:szCs w:val="24"/>
+              </w:rPr>
+              <w:t>травмпункт</w:t>
+            </w:r>
+            <w:proofErr w:type="spellEnd"/>
+            <w:r>
+              <w:rPr>
+                <w:rFonts w:eastAsia="Times New Roman" w:cs="Times New Roman"/>
+                <w:i/>
+                <w:szCs w:val="24"/>
+              </w:rPr>
+              <w:t>: «СМ-Клиника», Санкт-Петербург, пр. Ударников, д. 19, корп. 1, телефон +7 (812) 435-55-55.</w:t>
             </w:r>
           </w:p>
         </w:tc>
@@ -2626,15 +2664,7 @@
                 <w:i/>
                 <w:szCs w:val="24"/>
               </w:rPr>
-              <w:t>Инфекционная больница: СПб ГБУЗ «Клиническая инфекционная больница им. С. П. Боткина», Санкт-Петербу</w:t>
-            </w:r>
-            <w:r>
-              <w:rPr>
-                <w:rFonts w:eastAsia="Times New Roman" w:cs="Times New Roman"/>
-                <w:i/>
-                <w:szCs w:val="24"/>
-              </w:rPr>
-              <w:t xml:space="preserve">рг, Пискарёвский пр., д. 49 и Миргородская ул., д. 3, телефон +7 (812) 670-78-78. </w:t>
+              <w:t xml:space="preserve">Инфекционная больница: СПб ГБУЗ «Клиническая инфекционная больница им. С. П. Боткина», Санкт-Петербург, Пискарёвский пр., д. 49 и Миргородская ул., д. 3, телефон +7 (812) 670-78-78. </w:t>
             </w:r>
           </w:p>
           <w:p>
@@ -2720,6 +2750,42 @@
               <w:rPr>
                 <w:rFonts w:eastAsia="Times New Roman" w:cs="Times New Roman"/>
                 <w:i/>
+                <w:szCs w:val="24"/>
+              </w:rPr>
+            </w:pPr>
+            <w:r>
+              <w:rPr>
+                <w:rFonts w:eastAsia="Times New Roman" w:cs="Times New Roman"/>
+                <w:i/>
+                <w:szCs w:val="24"/>
+              </w:rPr>
+              <w:t xml:space="preserve">При угрозе жизни или преступлении: 112 или 102. 97-й отдел полиции УМВД России по Всеволожскому району: г. </w:t>
+            </w:r>
+            <w:proofErr w:type="spellStart"/>
+            <w:r>
+              <w:rPr>
+                <w:rFonts w:eastAsia="Times New Roman" w:cs="Times New Roman"/>
+                <w:i/>
+                <w:szCs w:val="24"/>
+              </w:rPr>
+              <w:t>Кудрово</w:t>
+            </w:r>
+            <w:proofErr w:type="spellEnd"/>
+            <w:r>
+              <w:rPr>
+                <w:rFonts w:eastAsia="Times New Roman" w:cs="Times New Roman"/>
+                <w:i/>
+                <w:szCs w:val="24"/>
+              </w:rPr>
+              <w:t>, Европейский пр., д. 24, круглосуточно, телефон +7 (81370) 4-29-43.</w:t>
+            </w:r>
+          </w:p>
+          <w:p>
+            <w:pPr>
+              <w:spacing w:before="120" w:after="0" w:line="276" w:lineRule="auto"/>
+              <w:rPr>
+                <w:rFonts w:eastAsia="Times New Roman" w:cs="Times New Roman"/>
+                <w:i/>
                 <w:color w:val="808080" w:themeColor="background1" w:themeShade="80"/>
                 <w:szCs w:val="24"/>
               </w:rPr>
@@ -2730,15 +2796,25 @@
                 <w:i/>
                 <w:szCs w:val="24"/>
               </w:rPr>
-              <w:t>При угрозе жизни или преступ</w:t>
-            </w:r>
-            <w:r>
-              <w:rPr>
-                <w:rFonts w:eastAsia="Times New Roman" w:cs="Times New Roman"/>
-                <w:i/>
-                <w:szCs w:val="24"/>
-              </w:rPr>
-              <w:t>лении: 112 или 102. 97 отдел полиции УМВД России по Всеволожскому району: г. Кудрово, Европейский пр., д. 24, круглосуточно, телефон +7 (81370) 4-29-43. Участковый пункт полиции № 7: г. Кудрово, ул. Центральная, д. 54, корп. 1, телефон +7 (999) 045-47-21.</w:t>
+              <w:t xml:space="preserve"> Участковый пункт полиции № 7: г. </w:t>
+            </w:r>
+            <w:proofErr w:type="spellStart"/>
+            <w:r>
+              <w:rPr>
+                <w:rFonts w:eastAsia="Times New Roman" w:cs="Times New Roman"/>
+                <w:i/>
+                <w:szCs w:val="24"/>
+              </w:rPr>
+              <w:t>Кудрово</w:t>
+            </w:r>
+            <w:proofErr w:type="spellEnd"/>
+            <w:r>
+              <w:rPr>
+                <w:rFonts w:eastAsia="Times New Roman" w:cs="Times New Roman"/>
+                <w:i/>
+                <w:szCs w:val="24"/>
+              </w:rPr>
+              <w:t>, ул. Центральная, д. 54, корп. 1, телефон +7 (999) 045-47-21. Приём граждан: вторник с 18:00 до 20:00, суббота с 11:00 до 13:00.</w:t>
             </w:r>
           </w:p>
         </w:tc>
@@ -2856,15 +2932,25 @@
                 <w:i/>
                 <w:szCs w:val="24"/>
               </w:rPr>
-              <w:t>ГБУЗ ЛО «Всеволожская КМБ», Цен</w:t>
-            </w:r>
-            <w:r>
-              <w:rPr>
-                <w:rFonts w:eastAsia="Times New Roman" w:cs="Times New Roman"/>
-                <w:i/>
-                <w:szCs w:val="24"/>
-              </w:rPr>
-              <w:t>тр медицинский офтальмологический, г. Всеволожск, Колтушское ш., д. 20. Контакт-центр: +7 (813) 704-31-49. При травме позвонить 112 или в контакт-центр.</w:t>
+              <w:t xml:space="preserve">ГБУЗ ЛО «Всеволожская КМБ», Центр медицинский офтальмологический, г. Всеволожск, </w:t>
+            </w:r>
+            <w:proofErr w:type="spellStart"/>
+            <w:r>
+              <w:rPr>
+                <w:rFonts w:eastAsia="Times New Roman" w:cs="Times New Roman"/>
+                <w:i/>
+                <w:szCs w:val="24"/>
+              </w:rPr>
+              <w:t>Колтушское</w:t>
+            </w:r>
+            <w:proofErr w:type="spellEnd"/>
+            <w:r>
+              <w:rPr>
+                <w:rFonts w:eastAsia="Times New Roman" w:cs="Times New Roman"/>
+                <w:i/>
+                <w:szCs w:val="24"/>
+              </w:rPr>
+              <w:t xml:space="preserve"> шоссе, д. 20, корп. 3, телефон 122. Режим работы: круглосуточно.</w:t>
             </w:r>
           </w:p>
         </w:tc>
@@ -2893,63 +2979,63 @@
                 <w:rFonts w:eastAsia="Times New Roman" w:cs="Times New Roman"/>
                 <w:szCs w:val="24"/>
               </w:rPr>
+              <w:t>Коммерческая скорая помощь</w:t>
+            </w:r>
+          </w:p>
+        </w:tc>
+        <w:tc>
+          <w:tcPr>
+            <w:tcW w:w="6794" w:type="dxa"/>
+            <w:tcBorders>
+              <w:top w:val="single" w:sz="4" w:space="0" w:color="A5A5A5"/>
+              <w:left w:val="single" w:sz="4" w:space="0" w:color="A5A5A5"/>
+              <w:bottom w:val="single" w:sz="4" w:space="0" w:color="A5A5A5"/>
+              <w:right w:val="single" w:sz="4" w:space="0" w:color="A5A5A5"/>
+            </w:tcBorders>
+          </w:tcPr>
+          <w:p>
+            <w:pPr>
+              <w:spacing w:before="120" w:after="0" w:line="276" w:lineRule="auto"/>
+              <w:rPr>
+                <w:rFonts w:eastAsia="Times New Roman" w:cs="Times New Roman"/>
+                <w:i/>
+                <w:szCs w:val="24"/>
+              </w:rPr>
+            </w:pPr>
+            <w:r>
+              <w:rPr>
+                <w:rFonts w:eastAsia="Times New Roman" w:cs="Times New Roman"/>
+                <w:i/>
+                <w:szCs w:val="24"/>
+              </w:rPr>
+              <w:t xml:space="preserve">«Приоритет» - экстренная помощь и госпитализация в стационары Санкт-Петербурга, телефон +7 (812) 313-21-21. </w:t>
+            </w:r>
+          </w:p>
+          <w:p>
+            <w:pPr>
+              <w:spacing w:before="120" w:after="0" w:line="276" w:lineRule="auto"/>
+              <w:rPr>
+                <w:rFonts w:eastAsia="Times New Roman" w:cs="Times New Roman"/>
+                <w:i/>
+                <w:szCs w:val="24"/>
+              </w:rPr>
+            </w:pPr>
+            <w:r>
+              <w:rPr>
+                <w:rFonts w:eastAsia="Times New Roman" w:cs="Times New Roman"/>
+                <w:i/>
+                <w:szCs w:val="24"/>
+              </w:rPr>
               <w:lastRenderedPageBreak/>
-              <w:t>Коммерческая скорая помощь</w:t>
-            </w:r>
-          </w:p>
-        </w:tc>
-        <w:tc>
-          <w:tcPr>
-            <w:tcW w:w="6794" w:type="dxa"/>
-            <w:tcBorders>
-              <w:top w:val="single" w:sz="4" w:space="0" w:color="A5A5A5"/>
-              <w:left w:val="single" w:sz="4" w:space="0" w:color="A5A5A5"/>
-              <w:bottom w:val="single" w:sz="4" w:space="0" w:color="A5A5A5"/>
-              <w:right w:val="single" w:sz="4" w:space="0" w:color="A5A5A5"/>
-            </w:tcBorders>
-          </w:tcPr>
+              <w:t xml:space="preserve">«Скорая 24» - круглосуточный выезд врача на дом в Кудрово. телефон +7 (925) 550-40-03. </w:t>
+            </w:r>
+          </w:p>
           <w:p>
             <w:pPr>
               <w:spacing w:before="120" w:after="0" w:line="276" w:lineRule="auto"/>
               <w:rPr>
                 <w:rFonts w:eastAsia="Times New Roman" w:cs="Times New Roman"/>
                 <w:i/>
-                <w:szCs w:val="24"/>
-              </w:rPr>
-            </w:pPr>
-            <w:r>
-              <w:rPr>
-                <w:rFonts w:eastAsia="Times New Roman" w:cs="Times New Roman"/>
-                <w:i/>
-                <w:szCs w:val="24"/>
-              </w:rPr>
-              <w:t xml:space="preserve">«Приоритет» - экстренная помощь и госпитализация в стационары Санкт-Петербурга, телефон +7 (812) 313-21-21. </w:t>
-            </w:r>
-          </w:p>
-          <w:p>
-            <w:pPr>
-              <w:spacing w:before="120" w:after="0" w:line="276" w:lineRule="auto"/>
-              <w:rPr>
-                <w:rFonts w:eastAsia="Times New Roman" w:cs="Times New Roman"/>
-                <w:i/>
-                <w:szCs w:val="24"/>
-              </w:rPr>
-            </w:pPr>
-            <w:r>
-              <w:rPr>
-                <w:rFonts w:eastAsia="Times New Roman" w:cs="Times New Roman"/>
-                <w:i/>
-                <w:szCs w:val="24"/>
-              </w:rPr>
-              <w:t xml:space="preserve">«Скорая 24» - круглосуточный выезд врача на дом в Кудрово. телефон +7 (925) 550-40-03. </w:t>
-            </w:r>
-          </w:p>
-          <w:p>
-            <w:pPr>
-              <w:spacing w:before="120" w:after="0" w:line="276" w:lineRule="auto"/>
-              <w:rPr>
-                <w:rFonts w:eastAsia="Times New Roman" w:cs="Times New Roman"/>
-                <w:i/>
                 <w:color w:val="808080" w:themeColor="background1" w:themeShade="80"/>
                 <w:szCs w:val="24"/>
               </w:rPr>
@@ -2960,15 +3046,7 @@
                 <w:i/>
                 <w:szCs w:val="24"/>
               </w:rPr>
-              <w:t>При угрозе жизни сначала лучше вызывать государственную ско</w:t>
-            </w:r>
-            <w:r>
-              <w:rPr>
-                <w:rFonts w:eastAsia="Times New Roman" w:cs="Times New Roman"/>
-                <w:i/>
-                <w:szCs w:val="24"/>
-              </w:rPr>
-              <w:t>рую помощь по номеру 103 или 112.</w:t>
+              <w:t>При угрозе жизни сначала лучше вызывать государственную скорую помощь по номеру 103 или 112.</w:t>
             </w:r>
           </w:p>
         </w:tc>
@@ -2997,6 +3075,7 @@
                 <w:rFonts w:eastAsia="Times New Roman" w:cs="Times New Roman"/>
                 <w:szCs w:val="24"/>
               </w:rPr>
+              <w:lastRenderedPageBreak/>
               <w:t>Роддом</w:t>
             </w:r>
           </w:p>
@@ -3063,15 +3142,7 @@
                 <w:i/>
                 <w:szCs w:val="24"/>
               </w:rPr>
-              <w:t>К</w:t>
-            </w:r>
-            <w:r>
-              <w:rPr>
-                <w:rFonts w:eastAsia="Times New Roman" w:cs="Times New Roman"/>
-                <w:i/>
-                <w:szCs w:val="24"/>
-              </w:rPr>
-              <w:t>оммерческая клиника: «</w:t>
+              <w:t>Коммерческая клиника: «</w:t>
             </w:r>
             <w:proofErr w:type="spellStart"/>
             <w:r>
@@ -3277,7 +3348,7 @@
                 <w:color w:val="000000"/>
                 <w:szCs w:val="24"/>
               </w:rPr>
-              <w:t xml:space="preserve">Санкт-Петербургский филиал «Страховая </w:t>
+              <w:t>Санкт-Петербургский филиал АО «</w:t>
             </w:r>
             <w:r>
               <w:rPr>
@@ -3286,7 +3357,7 @@
                 <w:color w:val="000000"/>
                 <w:szCs w:val="24"/>
               </w:rPr>
-              <w:t>компания «СОГАЗ-Мед»</w:t>
+              <w:t>Страховая компания «СОГАЗ-Мед»</w:t>
             </w:r>
           </w:p>
           <w:p>
@@ -3306,24 +3377,59 @@
                 <w:color w:val="000000"/>
                 <w:szCs w:val="24"/>
               </w:rPr>
-              <w:t>Телефон +7 (800) 100-07-02</w:t>
+              <w:t>Телефон 8 (800) 100-07-02</w:t>
             </w:r>
           </w:p>
           <w:p>
             <w:pPr>
               <w:spacing w:before="120" w:after="0" w:line="276" w:lineRule="auto"/>
-            </w:pPr>
-            <w:r>
               <w:rPr>
                 <w:rFonts w:eastAsia="Times New Roman" w:cs="Times New Roman"/>
                 <w:i/>
                 <w:color w:val="000000"/>
                 <w:szCs w:val="24"/>
               </w:rPr>
-              <w:t xml:space="preserve">Почта: </w:t>
-            </w:r>
-            <w:r>
-              <w:t xml:space="preserve">sogaz-med@sogaz-med.ru </w:t>
+            </w:pPr>
+            <w:r>
+              <w:rPr>
+                <w:rFonts w:eastAsia="Times New Roman" w:cs="Times New Roman"/>
+                <w:i/>
+                <w:color w:val="000000"/>
+                <w:szCs w:val="24"/>
+              </w:rPr>
+              <w:t>Почтовый адрес для обращений: 107045, г. Москва, Ср</w:t>
+            </w:r>
+            <w:r>
+              <w:rPr>
+                <w:rFonts w:eastAsia="Times New Roman" w:cs="Times New Roman"/>
+                <w:i/>
+                <w:color w:val="000000"/>
+                <w:szCs w:val="24"/>
+              </w:rPr>
+              <w:t>етенский бульвар, д. 5, а/я 34</w:t>
+            </w:r>
+          </w:p>
+          <w:p>
+            <w:pPr>
+              <w:spacing w:before="120" w:after="0" w:line="276" w:lineRule="auto"/>
+            </w:pPr>
+            <w:r>
+              <w:rPr>
+                <w:rFonts w:eastAsia="Times New Roman" w:cs="Times New Roman"/>
+                <w:i/>
+                <w:color w:val="000000"/>
+                <w:szCs w:val="24"/>
+              </w:rPr>
+              <w:t>Электронна</w:t>
+            </w:r>
+            <w:r>
+              <w:rPr>
+                <w:rFonts w:eastAsia="Times New Roman" w:cs="Times New Roman"/>
+                <w:i/>
+                <w:color w:val="000000"/>
+                <w:szCs w:val="24"/>
+              </w:rPr>
+              <w:t>я почта: sogaz-med@sogaz-med.ru</w:t>
             </w:r>
           </w:p>
         </w:tc>
@@ -3381,7 +3487,7 @@
                 <w:i/>
                 <w:szCs w:val="24"/>
               </w:rPr>
-              <w:t>Смирнов Юрий Николаевич</w:t>
+              <w:t>Смирнов Юрий Николаевич, номер отдела полиции: 97</w:t>
             </w:r>
           </w:p>
           <w:p>
@@ -3417,7 +3523,33 @@
                 <w:i/>
                 <w:szCs w:val="24"/>
               </w:rPr>
-              <w:t>Номер отдела полиции: 97</w:t>
+              <w:t xml:space="preserve">Почтовый адрес отдела: Ленинградская область, г. </w:t>
+            </w:r>
+            <w:proofErr w:type="spellStart"/>
+            <w:r>
+              <w:rPr>
+                <w:rFonts w:eastAsia="Times New Roman" w:cs="Times New Roman"/>
+                <w:i/>
+                <w:szCs w:val="24"/>
+              </w:rPr>
+              <w:t>К</w:t>
+            </w:r>
+            <w:r>
+              <w:rPr>
+                <w:rFonts w:eastAsia="Times New Roman" w:cs="Times New Roman"/>
+                <w:i/>
+                <w:szCs w:val="24"/>
+              </w:rPr>
+              <w:t>удрово</w:t>
+            </w:r>
+            <w:proofErr w:type="spellEnd"/>
+            <w:r>
+              <w:rPr>
+                <w:rFonts w:eastAsia="Times New Roman" w:cs="Times New Roman"/>
+                <w:i/>
+                <w:szCs w:val="24"/>
+              </w:rPr>
+              <w:t>, Европейский пр., д. 24</w:t>
             </w:r>
           </w:p>
           <w:p>
@@ -3436,7 +3568,15 @@
                 <w:i/>
                 <w:szCs w:val="24"/>
               </w:rPr>
-              <w:t>Почта: iusmirnov43@mvd.ru</w:t>
+              <w:t>Электр</w:t>
+            </w:r>
+            <w:r>
+              <w:rPr>
+                <w:rFonts w:eastAsia="Times New Roman" w:cs="Times New Roman"/>
+                <w:i/>
+                <w:szCs w:val="24"/>
+              </w:rPr>
+              <w:t>онная почта: iusmirnov43@mvd.ru</w:t>
             </w:r>
           </w:p>
         </w:tc>
@@ -3696,8 +3836,9 @@
                 <w:color w:val="000000"/>
                 <w:szCs w:val="24"/>
               </w:rPr>
-              <w:t>Телефон</w:t>
-            </w:r>
+              <w:t xml:space="preserve">Почтовый адрес: 188682, Ленинградская область, Всеволожский район, </w:t>
+            </w:r>
+            <w:proofErr w:type="spellStart"/>
             <w:r>
               <w:rPr>
                 <w:rFonts w:eastAsia="Times New Roman" w:cs="Times New Roman"/>
@@ -3705,8 +3846,9 @@
                 <w:color w:val="000000"/>
                 <w:szCs w:val="24"/>
               </w:rPr>
-              <w:t xml:space="preserve"> +7 (812) 339-39-27</w:t>
-            </w:r>
+              <w:t>пгт</w:t>
+            </w:r>
+            <w:proofErr w:type="spellEnd"/>
             <w:r>
               <w:rPr>
                 <w:rFonts w:eastAsia="Times New Roman" w:cs="Times New Roman"/>
@@ -3714,7 +3856,72 @@
                 <w:color w:val="000000"/>
                 <w:szCs w:val="24"/>
               </w:rPr>
-              <w:t>в</w:t>
+              <w:t xml:space="preserve"> им. </w:t>
+            </w:r>
+            <w:r>
+              <w:rPr>
+                <w:rFonts w:eastAsia="Times New Roman" w:cs="Times New Roman"/>
+                <w:i/>
+                <w:color w:val="000000"/>
+                <w:szCs w:val="24"/>
+              </w:rPr>
+              <w:t>Свердлова, Западный пр., д. 3А</w:t>
+            </w:r>
+          </w:p>
+          <w:p>
+            <w:pPr>
+              <w:spacing w:before="120" w:after="0" w:line="276" w:lineRule="auto"/>
+              <w:rPr>
+                <w:rFonts w:eastAsia="Times New Roman" w:cs="Times New Roman"/>
+                <w:i/>
+                <w:color w:val="000000"/>
+                <w:szCs w:val="24"/>
+              </w:rPr>
+            </w:pPr>
+            <w:r>
+              <w:rPr>
+                <w:rFonts w:eastAsia="Times New Roman" w:cs="Times New Roman"/>
+                <w:i/>
+                <w:color w:val="000000"/>
+                <w:szCs w:val="24"/>
+              </w:rPr>
+              <w:t xml:space="preserve">Телефоны: +7 (812) </w:t>
+            </w:r>
+            <w:r>
+              <w:rPr>
+                <w:rFonts w:eastAsia="Times New Roman" w:cs="Times New Roman"/>
+                <w:i/>
+                <w:color w:val="000000"/>
+                <w:szCs w:val="24"/>
+              </w:rPr>
+              <w:t>339-39-27 и +7 (812) 339-82-36</w:t>
+            </w:r>
+            <w:r>
+              <w:rPr>
+                <w:rFonts w:eastAsia="Times New Roman" w:cs="Times New Roman"/>
+                <w:i/>
+                <w:color w:val="000000"/>
+                <w:szCs w:val="24"/>
+              </w:rPr>
+              <w:t>, д</w:t>
+            </w:r>
+            <w:r>
+              <w:rPr>
+                <w:rFonts w:eastAsia="Times New Roman" w:cs="Times New Roman"/>
+                <w:i/>
+                <w:color w:val="000000"/>
+                <w:szCs w:val="24"/>
+              </w:rPr>
+              <w:t>испетч</w:t>
+            </w:r>
+            <w:r>
+              <w:rPr>
+                <w:rFonts w:eastAsia="Times New Roman" w:cs="Times New Roman"/>
+                <w:i/>
+                <w:color w:val="000000"/>
+                <w:szCs w:val="24"/>
+              </w:rPr>
+              <w:t>ерская дома: +7 (812) 409-62-71</w:t>
             </w:r>
           </w:p>
           <w:p>
@@ -3820,6 +4027,7 @@
                 <w:rFonts w:eastAsia="Times New Roman" w:cs="Times New Roman"/>
                 <w:szCs w:val="24"/>
               </w:rPr>
+              <w:lastRenderedPageBreak/>
               <w:t>Лифтовой сервис</w:t>
             </w:r>
           </w:p>
@@ -3965,16 +4173,7 @@
                 <w:color w:val="000000"/>
                 <w:szCs w:val="24"/>
               </w:rPr>
-              <w:t xml:space="preserve">+7 </w:t>
-            </w:r>
-            <w:r>
-              <w:rPr>
-                <w:rFonts w:eastAsia="Times New Roman" w:cs="Times New Roman"/>
-                <w:i/>
-                <w:color w:val="000000"/>
-                <w:szCs w:val="24"/>
-              </w:rPr>
-              <w:t>(800) 444-02-43</w:t>
+              <w:t>+7 (800) 444-02-43</w:t>
             </w:r>
           </w:p>
         </w:tc>
@@ -4003,7 +4202,6 @@
                 <w:rFonts w:eastAsia="Times New Roman" w:cs="Times New Roman"/>
                 <w:szCs w:val="24"/>
               </w:rPr>
-              <w:lastRenderedPageBreak/>
               <w:t>Оконный мастер</w:t>
             </w:r>
           </w:p>
@@ -4209,15 +4407,6 @@
         </w:tc>
       </w:tr>
     </w:tbl>
-    <w:p>
-      <w:pPr>
-        <w:spacing w:line="276" w:lineRule="auto"/>
-        <w:jc w:val="both"/>
-        <w:rPr>
-          <w:b/>
-        </w:rPr>
-      </w:pPr>
-    </w:p>
     <w:p>
       <w:pPr>
         <w:spacing w:line="276" w:lineRule="auto"/>
@@ -4412,7 +4601,15 @@
                 <w:i/>
                 <w:szCs w:val="24"/>
               </w:rPr>
-              <w:t>Деревянный письменный стол. Он сделан из древесин</w:t>
+              <w:t>Деревянный письменный стол.</w:t>
+            </w:r>
+            <w:r>
+              <w:rPr>
+                <w:rFonts w:eastAsia="Times New Roman" w:cs="Times New Roman"/>
+                <w:i/>
+                <w:szCs w:val="24"/>
+              </w:rPr>
+              <w:t xml:space="preserve"> Материал: дерево</w:t>
             </w:r>
             <w:r>
               <w:rPr>
@@ -4568,14 +4765,7 @@
                 <w:rFonts w:eastAsia="Times New Roman" w:cs="Times New Roman"/>
                 <w:szCs w:val="24"/>
               </w:rPr>
-              <w:t>М</w:t>
-            </w:r>
-            <w:r>
-              <w:rPr>
-                <w:rFonts w:eastAsia="Times New Roman" w:cs="Times New Roman"/>
-                <w:szCs w:val="24"/>
-              </w:rPr>
-              <w:t>еры по снижению пожарной опасности в месте моего проживания:</w:t>
+              <w:t>Меры по снижению пожарной опасности в месте моего проживания:</w:t>
             </w:r>
           </w:p>
         </w:tc>
@@ -4607,15 +4797,7 @@
                 <w:i/>
                 <w:szCs w:val="24"/>
               </w:rPr>
-              <w:t>Не оставлять без присмотра работающие электроприборы, пользоваться исправными розетками и удлинителями с защитой от перег</w:t>
-            </w:r>
-            <w:r>
-              <w:rPr>
-                <w:rFonts w:eastAsia="Times New Roman" w:cs="Times New Roman"/>
-                <w:i/>
-                <w:szCs w:val="24"/>
-              </w:rPr>
-              <w:t>рузки, очищать кухонную вытяжку от жира, проверять работу пожарного извещателя.</w:t>
+              <w:t>Не оставлять утюг включённым без присмотра, не пользоваться прибором с повреждённым шнуром, не размещать источники открытого огня на деревянном столе, не перегружать сетевой разветвитель и не использовать его при повреждении корпуса или кабеля.</w:t>
             </w:r>
           </w:p>
         </w:tc>
@@ -4623,8 +4805,14 @@
     </w:tbl>
     <w:p>
       <w:pPr>
-        <w:spacing w:before="240" w:line="276" w:lineRule="auto"/>
+        <w:tabs>
+          <w:tab w:val="left" w:pos="2146"/>
+        </w:tabs>
+        <w:spacing w:line="276" w:lineRule="auto"/>
         <w:jc w:val="both"/>
+        <w:rPr>
+          <w:b/>
+        </w:rPr>
       </w:pPr>
     </w:p>
     <w:p>
@@ -4684,6 +4872,7 @@
         <w:rPr>
           <w:szCs w:val="24"/>
         </w:rPr>
+        <w:lastRenderedPageBreak/>
         <w:t>В разделе представлены фотографии доступных средств пожарной безопасности в доме: пожа</w:t>
       </w:r>
       <w:r>
@@ -4719,8 +4908,8 @@
       <w:r>
         <w:rPr>
           <w:noProof/>
-        </w:rPr>
-        <w:lastRenderedPageBreak/>
+          <w:lang w:eastAsia="ru-RU"/>
+        </w:rPr>
         <mc:AlternateContent>
           <mc:Choice Requires="wps">
             <w:drawing>
@@ -4828,6 +5017,7 @@
       <w:r>
         <w:rPr>
           <w:noProof/>
+          <w:lang w:eastAsia="ru-RU"/>
         </w:rPr>
         <mc:AlternateContent>
           <mc:Choice Requires="wps">
@@ -4994,6 +5184,7 @@
       <w:r>
         <w:rPr>
           <w:noProof/>
+          <w:lang w:eastAsia="ru-RU"/>
         </w:rPr>
         <mc:AlternateContent>
           <mc:Choice Requires="wps">
@@ -5161,7 +5352,6 @@
       </w:r>
       <w:r>
         <w:rPr>
-          <w:rStyle w:val="a"/>
           <w:rFonts w:ascii="Times New Roman" w:eastAsia="Times New Roman" w:hAnsi="Times New Roman" w:cs="Times New Roman"/>
           <w:snapToGrid w:val="0"/>
           <w:color w:val="000000"/>
@@ -5261,10 +5451,7 @@
     </w:p>
     <w:p>
       <w:r>
-        <w:t>Фотоотчёт о путях эвакуации и пожарной инфраструктуре</w:t>
-      </w:r>
-      <w:r>
-        <w:t>.</w:t>
+        <w:t>Фотоотчёт о путях эвакуации и пожарной инфраструктуре.</w:t>
       </w:r>
     </w:p>
     <w:p>
@@ -5279,6 +5466,7 @@
       <w:r>
         <w:rPr>
           <w:noProof/>
+          <w:lang w:eastAsia="ru-RU"/>
         </w:rPr>
         <w:lastRenderedPageBreak/>
         <mc:AlternateContent>
@@ -5386,6 +5574,7 @@
       <w:r>
         <w:rPr>
           <w:noProof/>
+          <w:lang w:eastAsia="ru-RU"/>
         </w:rPr>
         <mc:AlternateContent>
           <mc:Choice Requires="wps">
@@ -5628,6 +5817,7 @@
       <w:r>
         <w:rPr>
           <w:noProof/>
+          <w:lang w:eastAsia="ru-RU"/>
         </w:rPr>
         <mc:AlternateContent>
           <mc:Choice Requires="wps">
@@ -5802,6 +5992,7 @@
       <w:r>
         <w:rPr>
           <w:noProof/>
+          <w:lang w:eastAsia="ru-RU"/>
         </w:rPr>
         <mc:AlternateContent>
           <mc:Choice Requires="wps">
@@ -5908,6 +6099,7 @@
       <w:r>
         <w:rPr>
           <w:noProof/>
+          <w:lang w:eastAsia="ru-RU"/>
         </w:rPr>
         <mc:AlternateContent>
           <mc:Choice Requires="wps">
@@ -6014,6 +6206,7 @@
       <w:r>
         <w:rPr>
           <w:noProof/>
+          <w:lang w:eastAsia="ru-RU"/>
         </w:rPr>
         <mc:AlternateContent>
           <mc:Choice Requires="wps">
@@ -6391,35 +6584,29 @@
     </w:p>
     <w:p>
       <w:r>
-        <w:t>В ходе работы я оценил основные риски по месту проживания и собрал контакты служб, которые могут понадобиться в эк</w:t>
-      </w:r>
-      <w:r>
-        <w:t>стренной ситуации. Для города Кудрово наиболее вероятны сильный ветер, снегопады, транспортные происшествия и аварии на коммунальных сетях. В самом доме главными рисками остаются пожар, задымление, залив квартиры и отключение коммунальных ресурсов.</w:t>
+        <w:t>В ходе работы я оценил основные риски по месту проживания и собрал контакты служб, которые могут понадобиться в экстренной ситуации. Для города Кудрово наиболее вероятны сильный ветер, снегопады, транспортные происшествия и аварии на коммунальных сетях. В самом доме главными рисками остаются пожар, задымление, залив квартиры и отключение коммунальных ресурсов.</w:t>
       </w:r>
     </w:p>
     <w:p>
       <w:r>
-        <w:t>Наиболе</w:t>
-      </w:r>
-      <w:r>
-        <w:t>е полезной оказалась проверка реальных контактов поликлиники, травмпункта, больниц, МЧС, управляющей компании и аварийных служб. Теперь понятно, куда обращаться в зависимости от ситуации, а не искать номера уже после происшествия. Отдельно проверены данные</w:t>
-      </w:r>
-      <w:r>
-        <w:t xml:space="preserve"> о качестве воздуха: в районе фиксировались отдельные превышения по оксиду азота, при этом для диоксида азота и оксида углерода превышений за рассматриваемый период не зарегистрировано.</w:t>
+        <w:t xml:space="preserve">Наиболее полезной частью работы стал сбор реальных контактов поликлиники, </w:t>
+      </w:r>
+      <w:proofErr w:type="spellStart"/>
+      <w:r>
+        <w:t>травмоцентра</w:t>
+      </w:r>
+      <w:proofErr w:type="spellEnd"/>
+      <w:r>
+        <w:t>, больниц, МЧС, управляющей компании и аварийных служб. Теперь понятно, куда обращаться в зависимости от ситуации, а необходимые номера не придётся искать уже после происшествия. Данные интерактивной карты показали наличие в воздухе взвешенных веществ, диоксида азота и оксида углерода. Для взвешенных веществ за рассматриваемый период указано превышение среднегодовой ПДК, а для диоксида азота и оксида углерода превышения отсутствуют</w:t>
+      </w:r>
+      <w:r>
+        <w:t>.</w:t>
       </w:r>
     </w:p>
     <w:p>
       <w:r>
-        <w:t>До выполнения работы меньше внимания уделялось пожарной безопасности к</w:t>
-      </w:r>
-      <w:r>
-        <w:t>вартиры и состоянию путей эвакуации. После анализа рисков были определены места отключения воды и электричества, проверены номера экстренных служб, установлен автономный пожарный извещатель. В дальнейшем нужно поддерживать аптечку в актуальном состоянии, п</w:t>
-      </w:r>
-      <w:r>
-        <w:t>риобрести огнетушитель в квартиру, не загромождать выход и дополнить список контактами обслуживающих организаций.</w:t>
-      </w:r>
-      <w:bookmarkStart w:id="0" w:name="_GoBack"/>
-      <w:bookmarkEnd w:id="0"/>
+        <w:t>До выполнения работы меньше внимания уделялось пожарной безопасности квартиры и состоянию путей эвакуации. В ходе анализа были определены места отключения воды и электричества, сохранены номера экстренных служб и установлено расположение доступных средств пожарной безопасности. В дальнейшем необходимо поддерживать аптечку в актуальном состоянии, приобрести огнетушитель в квартиру, не загромождать выход и своевременно обновлять контакты обслуживающих организаций.</w:t>
+      </w:r>
     </w:p>
     <w:sectPr>
       <w:footerReference w:type="even" r:id="rId20"/>
@@ -7230,6 +7417,7 @@
   <w:style w:type="paragraph" w:default="1" w:styleId="a">
     <w:name w:val="Normal"/>
     <w:qFormat/>
+    <w:rsid w:val="0075562E"/>
     <w:pPr>
       <w:spacing w:after="160" w:line="259" w:lineRule="auto"/>
     </w:pPr>
@@ -7679,7 +7867,7 @@
 </file>
 
 <file path=customXml/itemProps1.xml><?xml version="1.0" encoding="utf-8"?>
-<ds:datastoreItem xmlns:ds="http://schemas.openxmlformats.org/officeDocument/2006/customXml" ds:itemID="{C93B6829-D6ED-4D2B-AD38-951AE6078B16}">
+<ds:datastoreItem xmlns:ds="http://schemas.openxmlformats.org/officeDocument/2006/customXml" ds:itemID="{8F5898E3-147E-47EE-A0C2-0C9D36CEB7DD}">
   <ds:schemaRefs>
     <ds:schemaRef ds:uri="http://schemas.openxmlformats.org/officeDocument/2006/bibliography"/>
   </ds:schemaRefs>

</xml_diff>